<commit_message>
CP0529-367 Edited design after test
</commit_message>
<xml_diff>
--- a/src/Layers/W1/BaseApp/Sales/Document/StandardDraftSalesInvoiceBlue.docx
+++ b/src/Layers/W1/BaseApp/Sales/Document/StandardDraftSalesInvoiceBlue.docx
@@ -1,31 +1,19 @@
 
 <file path=word/document.xml><?xml version="1.0" encoding="utf-8"?>
-<w:document xmlns:wpc="http://schemas.microsoft.com/office/word/2010/wordprocessingCanvas" xmlns:cx="http://schemas.microsoft.com/office/drawing/2014/chartex" xmlns:cx1="http://schemas.microsoft.com/office/drawing/2015/9/8/chartex" xmlns:cx2="http://schemas.microsoft.com/office/drawing/2015/10/21/chartex" xmlns:cx3="http://schemas.microsoft.com/office/drawing/2016/5/9/chartex" xmlns:cx4="http://schemas.microsoft.com/office/drawing/2016/5/10/chartex" xmlns:cx5="http://schemas.microsoft.com/office/drawing/2016/5/11/chartex" xmlns:cx6="http://schemas.microsoft.com/office/drawing/2016/5/12/chartex" xmlns:cx7="http://schemas.microsoft.com/office/drawing/2016/5/13/chartex" xmlns:cx8="http://schemas.microsoft.com/office/drawing/2016/5/14/chartex" xmlns:mc="http://schemas.openxmlformats.org/markup-compatibility/2006" xmlns:aink="http://schemas.microsoft.com/office/drawing/2016/ink" xmlns:am3d="http://schemas.microsoft.com/office/drawing/2017/model3d" xmlns:o="urn:schemas-microsoft-com:office:office" xmlns:oel="http://schemas.microsoft.com/office/2019/extlst" xmlns:r="http://schemas.openxmlformats.org/officeDocument/2006/relationships" xmlns:m="http://schemas.openxmlformats.org/officeDocument/2006/math" xmlns:v="urn:schemas-microsoft-com:vml" xmlns:wp14="http://schemas.microsoft.com/office/word/2010/wordprocessingDrawing" xmlns:wp="http://schemas.openxmlformats.org/drawingml/2006/wordprocessingDrawing" xmlns:w10="urn:schemas-microsoft-com:office:word" xmlns:w="http://schemas.openxmlformats.org/wordprocessingml/2006/main" xmlns:w14="http://schemas.microsoft.com/office/word/2010/wordml" xmlns:w15="http://schemas.microsoft.com/office/word/2012/wordml" xmlns:w16cex="http://schemas.microsoft.com/office/word/2018/wordml/cex" xmlns:w16cid="http://schemas.microsoft.com/office/word/2016/wordml/cid" xmlns:w16="http://schemas.microsoft.com/office/word/2018/wordml" xmlns:w16du="http://schemas.microsoft.com/office/word/2023/wordml/word16du" xmlns:w16sdtdh="http://schemas.microsoft.com/office/word/2020/wordml/sdtdatahash" xmlns:w16sdtfl="http://schemas.microsoft.com/office/word/2024/wordml/sdtformatlock" xmlns:w16se="http://schemas.microsoft.com/office/word/2015/wordml/symex" xmlns:wpg="http://schemas.microsoft.com/office/word/2010/wordprocessingGroup" xmlns:wpi="http://schemas.microsoft.com/office/word/2010/wordprocessingInk" xmlns:wne="http://schemas.microsoft.com/office/word/2006/wordml" xmlns:wps="http://schemas.microsoft.com/office/word/2010/wordprocessingShape" mc:Ignorable="w14 w15 w16se w16cid w16 w16cex w16sdtdh w16sdtfl w16du wp14">
+<w:document xmlns:wpc="http://schemas.microsoft.com/office/word/2010/wordprocessingCanvas" xmlns:cx="http://schemas.microsoft.com/office/drawing/2014/chartex" xmlns:cx1="http://schemas.microsoft.com/office/drawing/2015/9/8/chartex" xmlns:cx2="http://schemas.microsoft.com/office/drawing/2015/10/21/chartex" xmlns:cx3="http://schemas.microsoft.com/office/drawing/2016/5/9/chartex" xmlns:cx4="http://schemas.microsoft.com/office/drawing/2016/5/10/chartex" xmlns:cx5="http://schemas.microsoft.com/office/drawing/2016/5/11/chartex" xmlns:cx6="http://schemas.microsoft.com/office/drawing/2016/5/12/chartex" xmlns:cx7="http://schemas.microsoft.com/office/drawing/2016/5/13/chartex" xmlns:cx8="http://schemas.microsoft.com/office/drawing/2016/5/14/chartex" xmlns:mc="http://schemas.openxmlformats.org/markup-compatibility/2006" xmlns:aink="http://schemas.microsoft.com/office/drawing/2016/ink" xmlns:am3d="http://schemas.microsoft.com/office/drawing/2017/model3d" xmlns:o="urn:schemas-microsoft-com:office:office" xmlns:oel="http://schemas.microsoft.com/office/2019/extlst" xmlns:r="http://schemas.openxmlformats.org/officeDocument/2006/relationships" xmlns:m="http://schemas.openxmlformats.org/officeDocument/2006/math" xmlns:v="urn:schemas-microsoft-com:vml" xmlns:wp14="http://schemas.microsoft.com/office/word/2010/wordprocessingDrawing" xmlns:wp="http://schemas.openxmlformats.org/drawingml/2006/wordprocessingDrawing" xmlns:w10="urn:schemas-microsoft-com:office:word" xmlns:w="http://schemas.openxmlformats.org/wordprocessingml/2006/main" xmlns:w14="http://schemas.microsoft.com/office/word/2010/wordml" xmlns:w15="http://schemas.microsoft.com/office/word/2012/wordml" xmlns:w16cei="http://schemas.microsoft.com/office/word/2026/wordml/cei" xmlns:w16cex="http://schemas.microsoft.com/office/word/2018/wordml/cex" xmlns:w16cid="http://schemas.microsoft.com/office/word/2016/wordml/cid" xmlns:w16="http://schemas.microsoft.com/office/word/2018/wordml" xmlns:w16du="http://schemas.microsoft.com/office/word/2023/wordml/word16du" xmlns:w16sdtdh="http://schemas.microsoft.com/office/word/2020/wordml/sdtdatahash" xmlns:w16sdtfl="http://schemas.microsoft.com/office/word/2024/wordml/sdtformatlock" xmlns:w16se="http://schemas.microsoft.com/office/word/2015/wordml/symex" xmlns:wpg="http://schemas.microsoft.com/office/word/2010/wordprocessingGroup" xmlns:wpi="http://schemas.microsoft.com/office/word/2010/wordprocessingInk" xmlns:wne="http://schemas.microsoft.com/office/word/2006/wordml" xmlns:wps="http://schemas.microsoft.com/office/word/2010/wordprocessingShape" mc:Ignorable="w14 w15 w16se w16cid w16 w16cex w16sdtdh w16sdtfl w16du wp14">
   <w:body>
     <w:tbl>
       <w:tblPr>
         <w:tblStyle w:val="BCBlockTable"/>
         <w:tblW w:w="5000" w:type="pct"/>
-        <w:tblBorders>
-          <w:top w:val="none" w:sz="0" w:space="0" w:color="auto"/>
-          <w:left w:val="none" w:sz="0" w:space="0" w:color="auto"/>
-          <w:bottom w:val="none" w:sz="0" w:space="0" w:color="auto"/>
-          <w:right w:val="none" w:sz="0" w:space="0" w:color="auto"/>
-          <w:insideH w:val="none" w:sz="0" w:space="0" w:color="auto"/>
-          <w:insideV w:val="none" w:sz="0" w:space="0" w:color="auto"/>
-        </w:tblBorders>
-        <w:tblCellMar>
-          <w:left w:w="0" w:type="dxa"/>
-          <w:right w:w="0" w:type="dxa"/>
-        </w:tblCellMar>
         <w:tblLook w:val="0620" w:firstRow="1" w:lastRow="0" w:firstColumn="0" w:lastColumn="0" w:noHBand="1" w:noVBand="1"/>
         <w:tblCaption w:val="Address Block"/>
         <w:tblDescription w:val="Layout table. Used for positioning, not for tabular data."/>
       </w:tblPr>
       <w:tblGrid>
-        <w:gridCol w:w="2621"/>
-        <w:gridCol w:w="4584"/>
-        <w:gridCol w:w="3279"/>
+        <w:gridCol w:w="2623"/>
+        <w:gridCol w:w="4588"/>
+        <w:gridCol w:w="3283"/>
       </w:tblGrid>
       <w:tr>
         <w:trPr>
@@ -56,7 +44,7 @@
               <w:p>
                 <w:pPr>
                   <w:pStyle w:val="BCLabel"/>
-                  <w:spacing w:before="0" w:after="0" w:line="276" w:lineRule="auto"/>
+                  <w:spacing w:line="276" w:lineRule="auto"/>
                   <w:rPr>
                     <w:rStyle w:val="Strong"/>
                   </w:rPr>
@@ -78,7 +66,7 @@
           <w:p>
             <w:pPr>
               <w:pStyle w:val="BCLabel"/>
-              <w:spacing w:before="0" w:after="0" w:line="276" w:lineRule="auto"/>
+              <w:spacing w:line="276" w:lineRule="auto"/>
               <w:rPr>
                 <w:rStyle w:val="Strong"/>
               </w:rPr>
@@ -108,7 +96,7 @@
               <w:p>
                 <w:pPr>
                   <w:pStyle w:val="BCLabelNumber"/>
-                  <w:spacing w:before="0" w:after="0" w:line="276" w:lineRule="auto"/>
+                  <w:spacing w:line="276" w:lineRule="auto"/>
                   <w:jc w:val="right"/>
                   <w:rPr>
                     <w:rStyle w:val="Strong"/>
@@ -133,7 +121,6 @@
         </w:trPr>
         <w:sdt>
           <w:sdtPr>
-            <w:rPr/>
             <w:alias w:val="CustomerAddress2"/>
             <w:tag w:val="#BC:InsertDataItem,DataItems/Header/CustomerAddress2"/>
             <w:id w:val="863552788"/>
@@ -172,7 +159,6 @@
         </w:tc>
         <w:sdt>
           <w:sdtPr>
-            <w:rPr/>
             <w:alias w:val="CompanyAddress2"/>
             <w:tag w:val="#BC:InsertDataItem,DataItems/Header/CompanyAddress2"/>
             <w:id w:val="-407616906"/>
@@ -208,7 +194,6 @@
         </w:trPr>
         <w:sdt>
           <w:sdtPr>
-            <w:rPr/>
             <w:alias w:val="CustomerAddress3"/>
             <w:tag w:val="#BC:InsertDataItem,DataItems/Header/CustomerAddress3"/>
             <w:id w:val="335427627"/>
@@ -247,7 +232,6 @@
         </w:tc>
         <w:sdt>
           <w:sdtPr>
-            <w:rPr/>
             <w:alias w:val="CompanyAddress3"/>
             <w:tag w:val="#BC:InsertDataItem,DataItems/Header/CompanyAddress3"/>
             <w:id w:val="-1208102821"/>
@@ -283,7 +267,6 @@
         </w:trPr>
         <w:sdt>
           <w:sdtPr>
-            <w:rPr/>
             <w:alias w:val="CustomerAddress4"/>
             <w:tag w:val="#BC:InsertDataItem,DataItems/Header/CustomerAddress4"/>
             <w:id w:val="172315661"/>
@@ -322,7 +305,6 @@
         </w:tc>
         <w:sdt>
           <w:sdtPr>
-            <w:rPr/>
             <w:alias w:val="CompanyAddress4"/>
             <w:tag w:val="#BC:InsertDataItem,DataItems/Header/CompanyAddress4"/>
             <w:id w:val="-1044596330"/>
@@ -358,7 +340,6 @@
         </w:trPr>
         <w:sdt>
           <w:sdtPr>
-            <w:rPr/>
             <w:alias w:val="CustomerAddress5"/>
             <w:tag w:val="#BC:InsertDataItem,DataItems/Header/CustomerAddress5"/>
             <w:id w:val="-2080044023"/>
@@ -397,7 +378,6 @@
         </w:tc>
         <w:sdt>
           <w:sdtPr>
-            <w:rPr/>
             <w:alias w:val="CompanyAddress5"/>
             <w:tag w:val="#BC:InsertDataItem,DataItems/Header/CompanyAddress5"/>
             <w:id w:val="-1334838620"/>
@@ -433,7 +413,6 @@
         </w:trPr>
         <w:sdt>
           <w:sdtPr>
-            <w:rPr/>
             <w:alias w:val="CustomerAddress6"/>
             <w:tag w:val="#BC:InsertDataItem,DataItems/Header/CustomerAddress6"/>
             <w:id w:val="-2086289259"/>
@@ -472,7 +451,6 @@
         </w:tc>
         <w:sdt>
           <w:sdtPr>
-            <w:rPr/>
             <w:alias w:val="CompanyAddress6"/>
             <w:tag w:val="#BC:InsertDataItem,DataItems/Header/CompanyAddress6"/>
             <w:id w:val="29467029"/>
@@ -508,7 +486,6 @@
         </w:trPr>
         <w:sdt>
           <w:sdtPr>
-            <w:rPr/>
             <w:alias w:val="CustomerAddress7"/>
             <w:tag w:val="#BC:InsertDataItem,DataItems/Header/CustomerAddress7"/>
             <w:id w:val="2127339997"/>
@@ -564,7 +541,6 @@
         </w:trPr>
         <w:sdt>
           <w:sdtPr>
-            <w:rPr/>
             <w:alias w:val="CustomerAddress8"/>
             <w:tag w:val="#BC:InsertDataItem,DataItems/Header/CustomerAddress8"/>
             <w:id w:val="-1986933782"/>
@@ -614,34 +590,20 @@
         </w:tc>
       </w:tr>
     </w:tbl>
-    <w:p>
-      <w:pPr/>
-    </w:p>
+    <w:p/>
     <w:tbl>
       <w:tblPr>
         <w:tblStyle w:val="BCBlockTable"/>
         <w:tblW w:w="5000" w:type="pct"/>
-        <w:tblBorders>
-          <w:top w:val="none" w:sz="0" w:space="0" w:color="auto"/>
-          <w:left w:val="none" w:sz="0" w:space="0" w:color="auto"/>
-          <w:bottom w:val="none" w:sz="0" w:space="0" w:color="auto"/>
-          <w:right w:val="none" w:sz="0" w:space="0" w:color="auto"/>
-          <w:insideH w:val="none" w:sz="0" w:space="0" w:color="auto"/>
-          <w:insideV w:val="none" w:sz="0" w:space="0" w:color="auto"/>
-        </w:tblBorders>
-        <w:tblCellMar>
-          <w:left w:w="0" w:type="dxa"/>
-          <w:right w:w="0" w:type="dxa"/>
-        </w:tblCellMar>
         <w:tblLook w:val="0620" w:firstRow="1" w:lastRow="0" w:firstColumn="0" w:lastColumn="0" w:noHBand="1" w:noVBand="1"/>
         <w:tblCaption w:val="Document Information Block"/>
         <w:tblDescription w:val="Layout table. Used for positioning, not for tabular data."/>
       </w:tblPr>
       <w:tblGrid>
-        <w:gridCol w:w="2624"/>
-        <w:gridCol w:w="2624"/>
-        <w:gridCol w:w="2624"/>
-        <w:gridCol w:w="2624"/>
+        <w:gridCol w:w="2507"/>
+        <w:gridCol w:w="2507"/>
+        <w:gridCol w:w="2508"/>
+        <w:gridCol w:w="2972"/>
       </w:tblGrid>
       <w:tr>
         <w:trPr>
@@ -651,7 +613,6 @@
         </w:trPr>
         <w:sdt>
           <w:sdtPr>
-            <w:rPr/>
             <w:alias w:val="DocumentNo_Lbl"/>
             <w:tag w:val="#BC:InsertDataItem,DataItems/Header/DocumentNo_Lbl"/>
             <w:id w:val="-792827152"/>
@@ -669,25 +630,17 @@
               <w:p>
                 <w:pPr>
                   <w:pStyle w:val="BCLabel"/>
-                  <w:spacing w:before="0" w:after="0" w:line="276" w:lineRule="auto"/>
+                  <w:spacing w:line="276" w:lineRule="auto"/>
                 </w:pPr>
-                <w:proofErr w:type="spellStart"/>
-                <w:proofErr w:type="gramStart"/>
                 <w:r>
-                  <w:t>DocumentNo</w:t>
+                  <w:t>DocumentNo_Lbl</w:t>
                 </w:r>
-                <w:proofErr w:type="gramEnd"/>
-                <w:r>
-                  <w:t>_Lbl</w:t>
-                </w:r>
-                <w:proofErr w:type="spellEnd"/>
               </w:p>
             </w:tc>
           </w:sdtContent>
         </w:sdt>
         <w:sdt>
           <w:sdtPr>
-            <w:rPr/>
             <w:alias w:val="DocumentDate_Lbl"/>
             <w:tag w:val="#BC:InsertDataItem,DataItems/Header/DocumentDate_Lbl"/>
             <w:id w:val="-990552869"/>
@@ -706,20 +659,17 @@
               <w:p>
                 <w:pPr>
                   <w:pStyle w:val="BCLabel"/>
-                  <w:spacing w:before="0" w:after="0" w:line="276" w:lineRule="auto"/>
+                  <w:spacing w:line="276" w:lineRule="auto"/>
                 </w:pPr>
-                <w:proofErr w:type="spellStart"/>
                 <w:r>
                   <w:t>DocumentDate_Lbl</w:t>
                 </w:r>
-                <w:proofErr w:type="spellEnd"/>
               </w:p>
             </w:tc>
           </w:sdtContent>
         </w:sdt>
         <w:sdt>
           <w:sdtPr>
-            <w:rPr/>
             <w:alias w:val="DueDate_Lbl"/>
             <w:tag w:val="#BC:InsertDataItem,DataItems/Header/DueDate_Lbl"/>
             <w:id w:val="2002158017"/>
@@ -738,20 +688,17 @@
               <w:p>
                 <w:pPr>
                   <w:pStyle w:val="BCLabel"/>
-                  <w:spacing w:before="0" w:after="0" w:line="276" w:lineRule="auto"/>
+                  <w:spacing w:line="276" w:lineRule="auto"/>
                 </w:pPr>
-                <w:proofErr w:type="spellStart"/>
                 <w:r>
                   <w:t>DueDate_Lbl</w:t>
                 </w:r>
-                <w:proofErr w:type="spellEnd"/>
               </w:p>
             </w:tc>
           </w:sdtContent>
         </w:sdt>
         <w:sdt>
           <w:sdtPr>
-            <w:rPr/>
             <w:alias w:val="PaymentTermsDescription_Lbl"/>
             <w:tag w:val="#BC:InsertDataItem,DataItems/Header/PaymentTermsDescription_Lbl"/>
             <w:id w:val="822389090"/>
@@ -770,13 +717,11 @@
               <w:p>
                 <w:pPr>
                   <w:pStyle w:val="BCLabel"/>
-                  <w:spacing w:before="0" w:after="0" w:line="276" w:lineRule="auto"/>
+                  <w:spacing w:line="276" w:lineRule="auto"/>
                 </w:pPr>
-                <w:proofErr w:type="spellStart"/>
                 <w:r>
                   <w:t>PaymentTermsDescription_Lbl</w:t>
                 </w:r>
-                <w:proofErr w:type="spellEnd"/>
               </w:p>
             </w:tc>
           </w:sdtContent>
@@ -807,11 +752,6 @@
                 </w:placeholder>
                 <w15:dataBinding w:prefixMappings="urn:microsoft-dynamics-nav/reports/Mini_Sales_Invoice/1306/" w:xpath="/ns0:NavWordReportXmlPart[1]/ns0:Header[1]/ns0:DocumentNo[1]" w:storeItemID="{87E5A65C-DE4E-46DF-BBC2-6CEFFEA62251}"/>
               </w:sdtPr>
-              <w:sdtEndPr>
-                <w:rPr>
-                  <w:rStyle w:val="Strong"/>
-                </w:rPr>
-              </w:sdtEndPr>
               <w:sdtContent>
                 <w:r>
                   <w:t>Document</w:t>
@@ -825,7 +765,6 @@
         </w:tc>
         <w:sdt>
           <w:sdtPr>
-            <w:rPr/>
             <w:alias w:val="DocumentDate"/>
             <w:tag w:val="#BC:InsertDataItem,DataItems/Header/DocumentDate"/>
             <w:id w:val="741597794"/>
@@ -845,18 +784,15 @@
                 <w:pPr>
                   <w:pStyle w:val="NoSpacing"/>
                 </w:pPr>
-                <w:proofErr w:type="spellStart"/>
                 <w:r>
                   <w:t>DocumentDate</w:t>
                 </w:r>
-                <w:proofErr w:type="spellEnd"/>
               </w:p>
             </w:tc>
           </w:sdtContent>
         </w:sdt>
         <w:sdt>
           <w:sdtPr>
-            <w:rPr/>
             <w:alias w:val="DueDate"/>
             <w:tag w:val="#BC:InsertDataItem,DataItems/Header/DueDate"/>
             <w:id w:val="1851682101"/>
@@ -876,18 +812,15 @@
                 <w:pPr>
                   <w:pStyle w:val="NoSpacing"/>
                 </w:pPr>
-                <w:proofErr w:type="spellStart"/>
                 <w:r>
                   <w:t>DueDate</w:t>
                 </w:r>
-                <w:proofErr w:type="spellEnd"/>
               </w:p>
             </w:tc>
           </w:sdtContent>
         </w:sdt>
         <w:sdt>
           <w:sdtPr>
-            <w:rPr/>
             <w:alias w:val="PaymentTermsDescription"/>
             <w:tag w:val="#BC:InsertDataItem,DataItems/Header/PaymentTermsDescription"/>
             <w:id w:val="-49539690"/>
@@ -907,37 +840,33 @@
                 <w:pPr>
                   <w:pStyle w:val="NoSpacing"/>
                 </w:pPr>
-                <w:proofErr w:type="spellStart"/>
                 <w:r>
                   <w:t>PaymentTermsDescription</w:t>
                 </w:r>
-                <w:proofErr w:type="spellEnd"/>
               </w:p>
             </w:tc>
           </w:sdtContent>
         </w:sdt>
       </w:tr>
     </w:tbl>
-    <w:p>
-      <w:pPr/>
-    </w:p>
+    <w:p/>
     <w:tbl>
       <w:tblPr>
         <w:tblStyle w:val="BCDataTable"/>
         <w:tblW w:w="5000" w:type="pct"/>
-        <w:tblLook w:val="0460" w:firstRow="1" w:lastRow="1" w:firstColumn="0" w:lastColumn="0" w:noHBand="0" w:noVBand="1"/>
+        <w:tblLook w:val="0420" w:firstRow="1" w:lastRow="0" w:firstColumn="0" w:lastColumn="0" w:noHBand="0" w:noVBand="1"/>
         <w:tblCaption w:val="Data Table Block"/>
         <w:tblDescription w:val="Document lines. Column headers in the first row."/>
       </w:tblPr>
       <w:tblGrid>
-        <w:gridCol w:w="810"/>
-        <w:gridCol w:w="2340"/>
-        <w:gridCol w:w="1169"/>
-        <w:gridCol w:w="810"/>
-        <w:gridCol w:w="1440"/>
-        <w:gridCol w:w="1350"/>
-        <w:gridCol w:w="991"/>
-        <w:gridCol w:w="1585"/>
+        <w:gridCol w:w="1172"/>
+        <w:gridCol w:w="1398"/>
+        <w:gridCol w:w="1230"/>
+        <w:gridCol w:w="1129"/>
+        <w:gridCol w:w="973"/>
+        <w:gridCol w:w="2010"/>
+        <w:gridCol w:w="1151"/>
+        <w:gridCol w:w="1431"/>
       </w:tblGrid>
       <w:tr>
         <w:trPr>
@@ -948,7 +877,6 @@
         </w:trPr>
         <w:tc>
           <w:tcPr>
-            <w:cnfStyle w:val="001000000000" w:firstRow="0" w:lastRow="0" w:firstColumn="1" w:lastColumn="0" w:oddVBand="0" w:evenVBand="0" w:oddHBand="0" w:evenHBand="0" w:firstRowFirstColumn="0" w:firstRowLastColumn="0" w:lastRowFirstColumn="0" w:lastRowLastColumn="0"/>
             <w:tcW w:w="386" w:type="pct"/>
             <w:tcBorders>
               <w:bottom w:val="single" w:sz="4" w:space="0" w:color="auto"/>
@@ -956,7 +884,6 @@
           </w:tcPr>
           <w:sdt>
             <w:sdtPr>
-              <w:rPr/>
               <w:alias w:val="ItemNo_Line_Lbl"/>
               <w:tag w:val="#BC:InsertDataItem,DataItems/Header/Line/ItemNo_Line_Lbl"/>
               <w:id w:val="2050642905"/>
@@ -972,18 +899,15 @@
                 <w:pPr>
                   <w:pStyle w:val="BCLabel"/>
                 </w:pPr>
-                <w:proofErr w:type="spellStart"/>
                 <w:r>
                   <w:t>ItemNo_Line_Lbl</w:t>
                 </w:r>
-                <w:proofErr w:type="spellEnd"/>
               </w:p>
             </w:sdtContent>
           </w:sdt>
         </w:tc>
         <w:sdt>
           <w:sdtPr>
-            <w:rPr/>
             <w:alias w:val="Description_Line_Lbl"/>
             <w:tag w:val="#BC:InsertDataItem,DataItems/Header/Line/Description_Line_Lbl"/>
             <w:id w:val="55748171"/>
@@ -1005,20 +929,16 @@
               <w:p>
                 <w:pPr>
                   <w:pStyle w:val="BCLabel"/>
-                  <w:cnfStyle w:val="100000000000" w:firstRow="1" w:lastRow="0" w:firstColumn="0" w:lastColumn="0" w:oddVBand="0" w:evenVBand="0" w:oddHBand="0" w:evenHBand="0" w:firstRowFirstColumn="0" w:firstRowLastColumn="0" w:lastRowFirstColumn="0" w:lastRowLastColumn="0"/>
                 </w:pPr>
-                <w:proofErr w:type="spellStart"/>
                 <w:r>
                   <w:t>Description_Line_Lbl</w:t>
                 </w:r>
-                <w:proofErr w:type="spellEnd"/>
               </w:p>
             </w:tc>
           </w:sdtContent>
         </w:sdt>
         <w:sdt>
           <w:sdtPr>
-            <w:rPr/>
             <w:alias w:val="Quantity_Line_Lbl"/>
             <w:tag w:val="#BC:InsertDataItem,DataItems/Header/Line/Quantity_Line_Lbl"/>
             <w:id w:val="-278416351"/>
@@ -1041,20 +961,16 @@
                 <w:pPr>
                   <w:pStyle w:val="BCLabelNumber"/>
                   <w:jc w:val="right"/>
-                  <w:cnfStyle w:val="100000000000" w:firstRow="1" w:lastRow="0" w:firstColumn="0" w:lastColumn="0" w:oddVBand="0" w:evenVBand="0" w:oddHBand="0" w:evenHBand="0" w:firstRowFirstColumn="0" w:firstRowLastColumn="0" w:lastRowFirstColumn="0" w:lastRowLastColumn="0"/>
                 </w:pPr>
-                <w:proofErr w:type="spellStart"/>
                 <w:r>
                   <w:t>Quantity_Line_Lbl</w:t>
                 </w:r>
-                <w:proofErr w:type="spellEnd"/>
               </w:p>
             </w:tc>
           </w:sdtContent>
         </w:sdt>
         <w:sdt>
           <w:sdtPr>
-            <w:rPr/>
             <w:alias w:val="Unit_Lbl"/>
             <w:tag w:val="#BC:InsertDataItem,DataItems/Header/Line/Unit_Lbl"/>
             <w:id w:val="1441568432"/>
@@ -1076,20 +992,16 @@
               <w:p>
                 <w:pPr>
                   <w:pStyle w:val="BCLabel"/>
-                  <w:cnfStyle w:val="100000000000" w:firstRow="1" w:lastRow="0" w:firstColumn="0" w:lastColumn="0" w:oddVBand="0" w:evenVBand="0" w:oddHBand="0" w:evenHBand="0" w:firstRowFirstColumn="0" w:firstRowLastColumn="0" w:lastRowFirstColumn="0" w:lastRowLastColumn="0"/>
                 </w:pPr>
-                <w:proofErr w:type="spellStart"/>
                 <w:r>
                   <w:t>Unit_Lbl</w:t>
                 </w:r>
-                <w:proofErr w:type="spellEnd"/>
               </w:p>
             </w:tc>
           </w:sdtContent>
         </w:sdt>
         <w:sdt>
           <w:sdtPr>
-            <w:rPr/>
             <w:alias w:val="UnitPrice_Lbl"/>
             <w:tag w:val="#BC:InsertDataItem,DataItems/Header/Line/UnitPrice_Lbl"/>
             <w:id w:val="-1044597726"/>
@@ -1112,20 +1024,16 @@
                 <w:pPr>
                   <w:pStyle w:val="BCLabelNumber"/>
                   <w:jc w:val="right"/>
-                  <w:cnfStyle w:val="100000000000" w:firstRow="1" w:lastRow="0" w:firstColumn="0" w:lastColumn="0" w:oddVBand="0" w:evenVBand="0" w:oddHBand="0" w:evenHBand="0" w:firstRowFirstColumn="0" w:firstRowLastColumn="0" w:lastRowFirstColumn="0" w:lastRowLastColumn="0"/>
                 </w:pPr>
-                <w:proofErr w:type="spellStart"/>
                 <w:r>
                   <w:t>UnitPrice_Lbl</w:t>
                 </w:r>
-                <w:proofErr w:type="spellEnd"/>
               </w:p>
             </w:tc>
           </w:sdtContent>
         </w:sdt>
         <w:sdt>
           <w:sdtPr>
-            <w:rPr/>
             <w:alias w:val="SalesInvoiceLineDiscount_Lbl"/>
             <w:tag w:val="#BC:InsertDataItem,DataItems/Header/SalesInvoiceLineDiscount_Lbl"/>
             <w:id w:val="-264690703"/>
@@ -1147,20 +1055,16 @@
               <w:p>
                 <w:pPr>
                   <w:pStyle w:val="BCLabel"/>
-                  <w:cnfStyle w:val="100000000000" w:firstRow="1" w:lastRow="0" w:firstColumn="0" w:lastColumn="0" w:oddVBand="0" w:evenVBand="0" w:oddHBand="0" w:evenHBand="0" w:firstRowFirstColumn="0" w:firstRowLastColumn="0" w:lastRowFirstColumn="0" w:lastRowLastColumn="0"/>
                 </w:pPr>
-                <w:proofErr w:type="spellStart"/>
                 <w:r>
                   <w:t>SalesInvoiceLineDiscount_Lbl</w:t>
                 </w:r>
-                <w:proofErr w:type="spellEnd"/>
               </w:p>
             </w:tc>
           </w:sdtContent>
         </w:sdt>
         <w:sdt>
           <w:sdtPr>
-            <w:rPr/>
             <w:alias w:val="VATPct_Line_Lbl"/>
             <w:tag w:val="#BC:InsertDataItem,DataItems/Header/Line/VATPct_Line_Lbl"/>
             <w:id w:val="682009838"/>
@@ -1183,20 +1087,16 @@
                 <w:pPr>
                   <w:pStyle w:val="BCLabelNumber"/>
                   <w:jc w:val="right"/>
-                  <w:cnfStyle w:val="100000000000" w:firstRow="1" w:lastRow="0" w:firstColumn="0" w:lastColumn="0" w:oddVBand="0" w:evenVBand="0" w:oddHBand="0" w:evenHBand="0" w:firstRowFirstColumn="0" w:firstRowLastColumn="0" w:lastRowFirstColumn="0" w:lastRowLastColumn="0"/>
                 </w:pPr>
-                <w:proofErr w:type="spellStart"/>
                 <w:r>
                   <w:t>VATPct_Line_Lbl</w:t>
                 </w:r>
-                <w:proofErr w:type="spellEnd"/>
               </w:p>
             </w:tc>
           </w:sdtContent>
         </w:sdt>
         <w:sdt>
           <w:sdtPr>
-            <w:rPr/>
             <w:alias w:val="LineAmount_Line_Lbl"/>
             <w:tag w:val="#BC:InsertDataItem,DataItems/Header/Line/LineAmount_Line_Lbl"/>
             <w:id w:val="-812258216"/>
@@ -1219,13 +1119,10 @@
                 <w:pPr>
                   <w:pStyle w:val="BCLabelNumber"/>
                   <w:jc w:val="right"/>
-                  <w:cnfStyle w:val="100000000000" w:firstRow="1" w:lastRow="0" w:firstColumn="0" w:lastColumn="0" w:oddVBand="0" w:evenVBand="0" w:oddHBand="0" w:evenHBand="0" w:firstRowFirstColumn="0" w:firstRowLastColumn="0" w:lastRowFirstColumn="0" w:lastRowLastColumn="0"/>
                 </w:pPr>
-                <w:proofErr w:type="spellStart"/>
                 <w:r>
                   <w:t>LineAmount_Line_Lbl</w:t>
                 </w:r>
-                <w:proofErr w:type="spellEnd"/>
               </w:p>
             </w:tc>
           </w:sdtContent>
@@ -1235,11 +1132,10 @@
         <w:trPr>
           <w:cnfStyle w:val="000000100000" w:firstRow="0" w:lastRow="0" w:firstColumn="0" w:lastColumn="0" w:oddVBand="0" w:evenVBand="0" w:oddHBand="1" w:evenHBand="0" w:firstRowFirstColumn="0" w:firstRowLastColumn="0" w:lastRowFirstColumn="0" w:lastRowLastColumn="0"/>
           <w:cantSplit/>
-          <w:trHeight w:hRule="atLeast" w:val="245"/>
+          <w:trHeight w:val="245"/>
         </w:trPr>
         <w:tc>
           <w:tcPr>
-            <w:cnfStyle w:val="001000000000" w:firstRow="0" w:lastRow="0" w:firstColumn="1" w:lastColumn="0" w:oddVBand="0" w:evenVBand="0" w:oddHBand="0" w:evenHBand="0" w:firstRowFirstColumn="0" w:firstRowLastColumn="0" w:lastRowFirstColumn="0" w:lastRowLastColumn="0"/>
             <w:tcW w:w="386" w:type="pct"/>
             <w:tcBorders>
               <w:top w:val="single" w:sz="4" w:space="0" w:color="auto"/>
@@ -1264,7 +1160,6 @@
           <w:p>
             <w:pPr>
               <w:pStyle w:val="NoSpacing"/>
-              <w:cnfStyle w:val="000000100000" w:firstRow="0" w:lastRow="0" w:firstColumn="0" w:lastColumn="0" w:oddVBand="0" w:evenVBand="0" w:oddHBand="1" w:evenHBand="0" w:firstRowFirstColumn="0" w:firstRowLastColumn="0" w:lastRowFirstColumn="0" w:lastRowLastColumn="0"/>
               <w:rPr>
                 <w:lang w:val="en-US" w:eastAsia="en-US"/>
               </w:rPr>
@@ -1281,7 +1176,6 @@
           <w:p>
             <w:pPr>
               <w:pStyle w:val="NoSpacing"/>
-              <w:cnfStyle w:val="000000100000" w:firstRow="0" w:lastRow="0" w:firstColumn="0" w:lastColumn="0" w:oddVBand="0" w:evenVBand="0" w:oddHBand="1" w:evenHBand="0" w:firstRowFirstColumn="0" w:firstRowLastColumn="0" w:lastRowFirstColumn="0" w:lastRowLastColumn="0"/>
               <w:rPr>
                 <w:lang w:val="en-US" w:eastAsia="en-US"/>
               </w:rPr>
@@ -1298,7 +1192,6 @@
           <w:p>
             <w:pPr>
               <w:pStyle w:val="NoSpacing"/>
-              <w:cnfStyle w:val="000000100000" w:firstRow="0" w:lastRow="0" w:firstColumn="0" w:lastColumn="0" w:oddVBand="0" w:evenVBand="0" w:oddHBand="1" w:evenHBand="0" w:firstRowFirstColumn="0" w:firstRowLastColumn="0" w:lastRowFirstColumn="0" w:lastRowLastColumn="0"/>
               <w:rPr>
                 <w:lang w:val="en-US" w:eastAsia="en-US"/>
               </w:rPr>
@@ -1315,7 +1208,6 @@
           <w:p>
             <w:pPr>
               <w:pStyle w:val="NoSpacing"/>
-              <w:cnfStyle w:val="000000100000" w:firstRow="0" w:lastRow="0" w:firstColumn="0" w:lastColumn="0" w:oddVBand="0" w:evenVBand="0" w:oddHBand="1" w:evenHBand="0" w:firstRowFirstColumn="0" w:firstRowLastColumn="0" w:lastRowFirstColumn="0" w:lastRowLastColumn="0"/>
               <w:rPr>
                 <w:lang w:val="en-US" w:eastAsia="en-US"/>
               </w:rPr>
@@ -1333,7 +1225,6 @@
             <w:pPr>
               <w:pStyle w:val="BCNumber"/>
               <w:jc w:val="right"/>
-              <w:cnfStyle w:val="000000100000" w:firstRow="0" w:lastRow="0" w:firstColumn="0" w:lastColumn="0" w:oddVBand="0" w:evenVBand="0" w:oddHBand="1" w:evenHBand="0" w:firstRowFirstColumn="0" w:firstRowLastColumn="0" w:lastRowFirstColumn="0" w:lastRowLastColumn="0"/>
               <w:rPr>
                 <w:lang w:val="en-US" w:eastAsia="en-US"/>
               </w:rPr>
@@ -1351,7 +1242,6 @@
             <w:pPr>
               <w:pStyle w:val="BCNumber"/>
               <w:jc w:val="right"/>
-              <w:cnfStyle w:val="000000100000" w:firstRow="0" w:lastRow="0" w:firstColumn="0" w:lastColumn="0" w:oddVBand="0" w:evenVBand="0" w:oddHBand="1" w:evenHBand="0" w:firstRowFirstColumn="0" w:firstRowLastColumn="0" w:lastRowFirstColumn="0" w:lastRowLastColumn="0"/>
               <w:rPr>
                 <w:lang w:val="en-US" w:eastAsia="en-US"/>
               </w:rPr>
@@ -1369,7 +1259,6 @@
             <w:pPr>
               <w:pStyle w:val="BCNumber"/>
               <w:jc w:val="right"/>
-              <w:cnfStyle w:val="000000100000" w:firstRow="0" w:lastRow="0" w:firstColumn="0" w:lastColumn="0" w:oddVBand="0" w:evenVBand="0" w:oddHBand="1" w:evenHBand="0" w:firstRowFirstColumn="0" w:firstRowLastColumn="0" w:lastRowFirstColumn="0" w:lastRowLastColumn="0"/>
               <w:rPr>
                 <w:lang w:val="en-US" w:eastAsia="en-US"/>
               </w:rPr>
@@ -1381,6 +1270,7 @@
         <w:sdtPr>
           <w:rPr>
             <w:lang w:val="en-US" w:eastAsia="en-US"/>
+            <w14:numSpacing w14:val="tabular"/>
           </w:rPr>
           <w:alias w:val="Repeater: Line"/>
           <w:tag w:val="#BC:InsertRepeater,DataItems/Header/Line"/>
@@ -1394,7 +1284,7 @@
         </w:sdtPr>
         <w:sdtEndPr>
           <w:rPr>
-            <w:lang w:val="en-DK" w:eastAsia="en-DK"/>
+            <w:lang/>
           </w:rPr>
         </w:sdtEndPr>
         <w:sdtContent>
@@ -1402,6 +1292,7 @@
             <w:sdtPr>
               <w:rPr>
                 <w:lang w:val="en-US" w:eastAsia="en-US"/>
+                <w14:numSpacing w14:val="tabular"/>
               </w:rPr>
               <w:id w:val="-797913737"/>
               <w15:color w:val="808080"/>
@@ -1409,7 +1300,7 @@
             </w:sdtPr>
             <w:sdtEndPr>
               <w:rPr>
-                <w:lang w:val="en-DK" w:eastAsia="en-DK"/>
+                <w:lang/>
               </w:rPr>
             </w:sdtEndPr>
             <w:sdtContent>
@@ -1423,6 +1314,7 @@
                   <w:sdtPr>
                     <w:rPr>
                       <w:lang w:val="en-US" w:eastAsia="en-US"/>
+                      <w14:numSpacing w14:val="tabular"/>
                     </w:rPr>
                     <w:alias w:val="ItemNo_Line"/>
                     <w:tag w:val="#BC:InsertDataItem,DataItems/Header/Line/ItemNo_Line"/>
@@ -1434,13 +1326,15 @@
                     <w15:color w:val="808080"/>
                     <w:text/>
                   </w:sdtPr>
-                  <w:sdtEndPr/>
+                  <w:sdtEndPr>
+                    <w:rPr>
+                      <w14:numSpacing w14:val="default"/>
+                    </w:rPr>
+                  </w:sdtEndPr>
                   <w:sdtContent>
                     <w:tc>
                       <w:tcPr>
-                        <w:cnfStyle w:val="001000000000" w:firstRow="0" w:lastRow="0" w:firstColumn="1" w:lastColumn="0" w:oddVBand="0" w:evenVBand="0" w:oddHBand="0" w:evenHBand="0" w:firstRowFirstColumn="0" w:firstRowLastColumn="0" w:lastRowFirstColumn="0" w:lastRowLastColumn="0"/>
                         <w:tcW w:w="386" w:type="pct"/>
-                        <w:vAlign w:val="center"/>
                       </w:tcPr>
                       <w:p>
                         <w:pPr>
@@ -1480,24 +1374,20 @@
                     <w:tc>
                       <w:tcPr>
                         <w:tcW w:w="1115" w:type="pct"/>
-                        <w:vAlign w:val="center"/>
                       </w:tcPr>
                       <w:p>
                         <w:pPr>
                           <w:pStyle w:val="NoSpacing"/>
-                          <w:cnfStyle w:val="000000010000" w:firstRow="0" w:lastRow="0" w:firstColumn="0" w:lastColumn="0" w:oddVBand="0" w:evenVBand="0" w:oddHBand="0" w:evenHBand="1" w:firstRowFirstColumn="0" w:firstRowLastColumn="0" w:lastRowFirstColumn="0" w:lastRowLastColumn="0"/>
                           <w:rPr>
                             <w:lang w:eastAsia="en-US"/>
                           </w:rPr>
                         </w:pPr>
-                        <w:proofErr w:type="spellStart"/>
                         <w:r>
                           <w:rPr>
                             <w:lang w:eastAsia="en-US"/>
                           </w:rPr>
                           <w:t>Description_Line</w:t>
                         </w:r>
-                        <w:proofErr w:type="spellEnd"/>
                       </w:p>
                     </w:tc>
                   </w:sdtContent>
@@ -1521,13 +1411,11 @@
                     <w:tc>
                       <w:tcPr>
                         <w:tcW w:w="557" w:type="pct"/>
-                        <w:vAlign w:val="center"/>
                       </w:tcPr>
                       <w:p>
                         <w:pPr>
                           <w:pStyle w:val="BCNumber"/>
                           <w:jc w:val="right"/>
-                          <w:cnfStyle w:val="000000010000" w:firstRow="0" w:lastRow="0" w:firstColumn="0" w:lastColumn="0" w:oddVBand="0" w:evenVBand="0" w:oddHBand="0" w:evenHBand="1" w:firstRowFirstColumn="0" w:firstRowLastColumn="0" w:lastRowFirstColumn="0" w:lastRowLastColumn="0"/>
                           <w:rPr>
                             <w:lang w:val="en-US" w:eastAsia="en-US"/>
                           </w:rPr>
@@ -1546,7 +1434,6 @@
                 </w:sdt>
                 <w:sdt>
                   <w:sdtPr>
-                    <w:rPr/>
                     <w:alias w:val="UnitOfMeasure"/>
                     <w:tag w:val="#BC:InsertDataItem,DataItems/Header/Line/UnitOfMeasure"/>
                     <w:id w:val="-2053294236"/>
@@ -1561,18 +1448,14 @@
                     <w:tc>
                       <w:tcPr>
                         <w:tcW w:w="386" w:type="pct"/>
-                        <w:vAlign w:val="center"/>
                       </w:tcPr>
                       <w:p>
                         <w:pPr>
                           <w:pStyle w:val="NoSpacing"/>
-                          <w:cnfStyle w:val="000000010000" w:firstRow="0" w:lastRow="0" w:firstColumn="0" w:lastColumn="0" w:oddVBand="0" w:evenVBand="0" w:oddHBand="0" w:evenHBand="1" w:firstRowFirstColumn="0" w:firstRowLastColumn="0" w:lastRowFirstColumn="0" w:lastRowLastColumn="0"/>
                         </w:pPr>
-                        <w:proofErr w:type="spellStart"/>
                         <w:r>
                           <w:t>UnitOfMeasure</w:t>
                         </w:r>
-                        <w:proofErr w:type="spellEnd"/>
                       </w:p>
                     </w:tc>
                   </w:sdtContent>
@@ -1580,20 +1463,17 @@
                 <w:tc>
                   <w:tcPr>
                     <w:tcW w:w="686" w:type="pct"/>
-                    <w:vAlign w:val="center"/>
                   </w:tcPr>
                   <w:p>
                     <w:pPr>
                       <w:pStyle w:val="BCNumber"/>
                       <w:jc w:val="right"/>
-                      <w:cnfStyle w:val="000000010000" w:firstRow="0" w:lastRow="0" w:firstColumn="0" w:lastColumn="0" w:oddVBand="0" w:evenVBand="0" w:oddHBand="0" w:evenHBand="1" w:firstRowFirstColumn="0" w:firstRowLastColumn="0" w:lastRowFirstColumn="0" w:lastRowLastColumn="0"/>
                       <w:rPr>
                         <w:lang w:val="en-US" w:eastAsia="en-US"/>
                       </w:rPr>
                     </w:pPr>
                     <w:sdt>
                       <w:sdtPr>
-                        <w:rPr/>
                         <w:alias w:val="UnitPrice"/>
                         <w:tag w:val="#BC:InsertDataItem,DataItems/Header/Line/UnitPrice"/>
                         <w:id w:val="-1253814634"/>
@@ -1605,18 +1485,15 @@
                         <w:text/>
                       </w:sdtPr>
                       <w:sdtContent>
-                        <w:proofErr w:type="spellStart"/>
                         <w:r>
                           <w:t>UnitPrice</w:t>
                         </w:r>
-                        <w:proofErr w:type="spellEnd"/>
                       </w:sdtContent>
                     </w:sdt>
                   </w:p>
                 </w:tc>
                 <w:sdt>
                   <w:sdtPr>
-                    <w:rPr/>
                     <w:alias w:val="LineDiscountPercentText_Line"/>
                     <w:tag w:val="#BC:InsertDataItem,DataItems/Header/Line/LineDiscountPercentText_Line"/>
                     <w:id w:val="415913873"/>
@@ -1631,25 +1508,20 @@
                     <w:tc>
                       <w:tcPr>
                         <w:tcW w:w="643" w:type="pct"/>
-                        <w:vAlign w:val="center"/>
                       </w:tcPr>
                       <w:p>
                         <w:pPr>
                           <w:pStyle w:val="NoSpacing"/>
-                          <w:cnfStyle w:val="000000010000" w:firstRow="0" w:lastRow="0" w:firstColumn="0" w:lastColumn="0" w:oddVBand="0" w:evenVBand="0" w:oddHBand="0" w:evenHBand="1" w:firstRowFirstColumn="0" w:firstRowLastColumn="0" w:lastRowFirstColumn="0" w:lastRowLastColumn="0"/>
                         </w:pPr>
-                        <w:proofErr w:type="spellStart"/>
                         <w:r>
                           <w:t>LineDiscountPercentText_Line</w:t>
                         </w:r>
-                        <w:proofErr w:type="spellEnd"/>
                       </w:p>
                     </w:tc>
                   </w:sdtContent>
                 </w:sdt>
                 <w:sdt>
                   <w:sdtPr>
-                    <w:rPr/>
                     <w:alias w:val="VATPct_Line"/>
                     <w:tag w:val="#BC:InsertDataItem,DataItems/Header/Line/VATPct_Line"/>
                     <w:id w:val="1436251310"/>
@@ -1664,19 +1536,15 @@
                     <w:tc>
                       <w:tcPr>
                         <w:tcW w:w="472" w:type="pct"/>
-                        <w:vAlign w:val="center"/>
                       </w:tcPr>
                       <w:p>
                         <w:pPr>
                           <w:pStyle w:val="BCNumber"/>
                           <w:jc w:val="right"/>
-                          <w:cnfStyle w:val="000000010000" w:firstRow="0" w:lastRow="0" w:firstColumn="0" w:lastColumn="0" w:oddVBand="0" w:evenVBand="0" w:oddHBand="0" w:evenHBand="1" w:firstRowFirstColumn="0" w:firstRowLastColumn="0" w:lastRowFirstColumn="0" w:lastRowLastColumn="0"/>
                         </w:pPr>
-                        <w:proofErr w:type="spellStart"/>
                         <w:r>
                           <w:t>VATPct_Line</w:t>
                         </w:r>
-                        <w:proofErr w:type="spellEnd"/>
                       </w:p>
                     </w:tc>
                   </w:sdtContent>
@@ -1684,20 +1552,17 @@
                 <w:tc>
                   <w:tcPr>
                     <w:tcW w:w="755" w:type="pct"/>
-                    <w:vAlign w:val="center"/>
                   </w:tcPr>
                   <w:p>
                     <w:pPr>
                       <w:pStyle w:val="BCNumber"/>
                       <w:jc w:val="right"/>
-                      <w:cnfStyle w:val="000000010000" w:firstRow="0" w:lastRow="0" w:firstColumn="0" w:lastColumn="0" w:oddVBand="0" w:evenVBand="0" w:oddHBand="0" w:evenHBand="1" w:firstRowFirstColumn="0" w:firstRowLastColumn="0" w:lastRowFirstColumn="0" w:lastRowLastColumn="0"/>
                       <w:rPr>
                         <w:lang w:val="en-US" w:eastAsia="en-US"/>
                       </w:rPr>
                     </w:pPr>
                     <w:sdt>
                       <w:sdtPr>
-                        <w:rPr/>
                         <w:alias w:val="LineAmount_Line"/>
                         <w:tag w:val="#BC:InsertDataItem,DataItems/Header/Line/LineAmount_Line"/>
                         <w:id w:val="787541011"/>
@@ -1709,11 +1574,9 @@
                         <w:text/>
                       </w:sdtPr>
                       <w:sdtContent>
-                        <w:proofErr w:type="spellStart"/>
                         <w:r>
                           <w:t>LineAmount_Line</w:t>
                         </w:r>
-                        <w:proofErr w:type="spellEnd"/>
                       </w:sdtContent>
                     </w:sdt>
                     <w:r>
@@ -1737,20 +1600,18 @@
         <w:tblDescription w:val="Document totals."/>
       </w:tblPr>
       <w:tblGrid>
-        <w:gridCol w:w="4995"/>
-        <w:gridCol w:w="959"/>
-        <w:gridCol w:w="424"/>
-        <w:gridCol w:w="428"/>
-        <w:gridCol w:w="3688"/>
+        <w:gridCol w:w="4921"/>
+        <w:gridCol w:w="884"/>
+        <w:gridCol w:w="348"/>
+        <w:gridCol w:w="353"/>
+        <w:gridCol w:w="3988"/>
       </w:tblGrid>
       <w:tr>
         <w:trPr>
-          <w:cantSplit/>
           <w:trHeight w:val="490"/>
         </w:trPr>
         <w:sdt>
           <w:sdtPr>
-            <w:rPr/>
             <w:alias w:val="Description_ReportTotalsLine"/>
             <w:tag w:val="#BC:InsertDataItem,DataItems/Header/ReportTotalsLine/Description_ReportTotalsLine"/>
             <w:id w:val="700291320"/>
@@ -1764,34 +1625,28 @@
           <w:sdtContent>
             <w:tc>
               <w:tcPr>
-                <w:cnfStyle w:val="001000000000" w:firstRow="0" w:lastRow="0" w:firstColumn="1" w:lastColumn="0" w:oddVBand="0" w:evenVBand="0" w:oddHBand="0" w:evenHBand="0" w:firstRowFirstColumn="0" w:firstRowLastColumn="0" w:lastRowFirstColumn="0" w:lastRowLastColumn="0"/>
-                <w:tcW w:w="2380" w:type="pct"/>
-                <w:vAlign w:val="center"/>
+                <w:tcW w:w="2344" w:type="pct"/>
               </w:tcPr>
               <w:p>
                 <w:pPr>
                   <w:pStyle w:val="NoSpacing"/>
-                  <w:spacing w:before="120" w:after="120" w:line="240" w:lineRule="auto"/>
+                  <w:spacing w:before="120" w:after="120"/>
                 </w:pPr>
-                <w:proofErr w:type="spellStart"/>
                 <w:r>
                   <w:t>Description_ReportTotalsLine</w:t>
                 </w:r>
-                <w:proofErr w:type="spellEnd"/>
               </w:p>
             </w:tc>
           </w:sdtContent>
         </w:sdt>
         <w:tc>
           <w:tcPr>
-            <w:tcW w:w="457" w:type="pct"/>
-            <w:vAlign w:val="center"/>
+            <w:tcW w:w="421" w:type="pct"/>
           </w:tcPr>
           <w:p>
             <w:pPr>
               <w:pStyle w:val="NoSpacing"/>
-              <w:spacing w:before="120" w:after="120" w:line="240" w:lineRule="auto"/>
-              <w:cnfStyle w:val="000000000000" w:firstRow="0" w:lastRow="0" w:firstColumn="0" w:lastColumn="0" w:oddVBand="0" w:evenVBand="0" w:oddHBand="0" w:evenHBand="0" w:firstRowFirstColumn="0" w:firstRowLastColumn="0" w:lastRowFirstColumn="0" w:lastRowLastColumn="0"/>
+              <w:spacing w:before="120" w:after="120"/>
               <w:rPr>
                 <w:lang w:eastAsia="en-US"/>
               </w:rPr>
@@ -1800,14 +1655,12 @@
         </w:tc>
         <w:tc>
           <w:tcPr>
-            <w:tcW w:w="202" w:type="pct"/>
-            <w:vAlign w:val="center"/>
+            <w:tcW w:w="166" w:type="pct"/>
           </w:tcPr>
           <w:p>
             <w:pPr>
               <w:pStyle w:val="NoSpacing"/>
-              <w:spacing w:before="120" w:after="120" w:line="240" w:lineRule="auto"/>
-              <w:cnfStyle w:val="000000000000" w:firstRow="0" w:lastRow="0" w:firstColumn="0" w:lastColumn="0" w:oddVBand="0" w:evenVBand="0" w:oddHBand="0" w:evenHBand="0" w:firstRowFirstColumn="0" w:firstRowLastColumn="0" w:lastRowFirstColumn="0" w:lastRowLastColumn="0"/>
+              <w:spacing w:before="120" w:after="120"/>
               <w:rPr>
                 <w:lang w:val="en-US" w:eastAsia="en-US"/>
               </w:rPr>
@@ -1816,14 +1669,12 @@
         </w:tc>
         <w:tc>
           <w:tcPr>
-            <w:tcW w:w="204" w:type="pct"/>
-            <w:vAlign w:val="center"/>
+            <w:tcW w:w="168" w:type="pct"/>
           </w:tcPr>
           <w:p>
             <w:pPr>
               <w:pStyle w:val="NoSpacing"/>
-              <w:spacing w:before="120" w:after="120" w:line="240" w:lineRule="auto"/>
-              <w:cnfStyle w:val="000000000000" w:firstRow="0" w:lastRow="0" w:firstColumn="0" w:lastColumn="0" w:oddVBand="0" w:evenVBand="0" w:oddHBand="0" w:evenHBand="0" w:firstRowFirstColumn="0" w:firstRowLastColumn="0" w:lastRowFirstColumn="0" w:lastRowLastColumn="0"/>
+              <w:spacing w:before="120" w:after="120"/>
               <w:rPr>
                 <w:lang w:eastAsia="en-US"/>
               </w:rPr>
@@ -1848,27 +1699,23 @@
           <w:sdtContent>
             <w:tc>
               <w:tcPr>
-                <w:tcW w:w="1757" w:type="pct"/>
-                <w:vAlign w:val="center"/>
+                <w:tcW w:w="1900" w:type="pct"/>
               </w:tcPr>
               <w:p>
                 <w:pPr>
                   <w:pStyle w:val="BCNumber"/>
-                  <w:spacing w:before="120" w:after="120" w:line="240" w:lineRule="auto"/>
+                  <w:spacing w:before="120" w:after="120"/>
                   <w:jc w:val="right"/>
-                  <w:cnfStyle w:val="000000000000" w:firstRow="0" w:lastRow="0" w:firstColumn="0" w:lastColumn="0" w:oddVBand="0" w:evenVBand="0" w:oddHBand="0" w:evenHBand="0" w:firstRowFirstColumn="0" w:firstRowLastColumn="0" w:lastRowFirstColumn="0" w:lastRowLastColumn="0"/>
                   <w:rPr>
                     <w:lang w:eastAsia="en-US"/>
                   </w:rPr>
                 </w:pPr>
-                <w:proofErr w:type="spellStart"/>
                 <w:r>
                   <w:rPr>
                     <w:lang w:eastAsia="en-US"/>
                   </w:rPr>
                   <w:t>AmountFormatted_ReportTotalsLine</w:t>
                 </w:r>
-                <w:proofErr w:type="spellEnd"/>
               </w:p>
             </w:tc>
           </w:sdtContent>
@@ -1876,12 +1723,10 @@
       </w:tr>
       <w:tr>
         <w:trPr>
-          <w:cantSplit/>
           <w:trHeight w:val="490"/>
         </w:trPr>
         <w:sdt>
           <w:sdtPr>
-            <w:rPr/>
             <w:alias w:val="VATAmount_Lbl"/>
             <w:tag w:val="#BC:InsertDataItem,DataItems/Header/VATAmount_Lbl"/>
             <w:id w:val="-255750165"/>
@@ -1895,40 +1740,28 @@
           <w:sdtContent>
             <w:tc>
               <w:tcPr>
-                <w:cnfStyle w:val="001000000000" w:firstRow="0" w:lastRow="0" w:firstColumn="1" w:lastColumn="0" w:oddVBand="0" w:evenVBand="0" w:oddHBand="0" w:evenHBand="0" w:firstRowFirstColumn="0" w:firstRowLastColumn="0" w:lastRowFirstColumn="0" w:lastRowLastColumn="0"/>
-                <w:tcW w:w="2380" w:type="pct"/>
-                <w:tcBorders>
-                  <w:bottom w:val="single" w:sz="4" w:space="0" w:color="auto"/>
-                </w:tcBorders>
-                <w:vAlign w:val="center"/>
+                <w:tcW w:w="2344" w:type="pct"/>
               </w:tcPr>
               <w:p>
                 <w:pPr>
                   <w:pStyle w:val="NoSpacing"/>
                   <w:spacing w:before="120" w:after="120"/>
                 </w:pPr>
-                <w:proofErr w:type="spellStart"/>
                 <w:r>
                   <w:t>VATAmount_Lbl</w:t>
                 </w:r>
-                <w:proofErr w:type="spellEnd"/>
               </w:p>
             </w:tc>
           </w:sdtContent>
         </w:sdt>
         <w:tc>
           <w:tcPr>
-            <w:tcW w:w="457" w:type="pct"/>
-            <w:tcBorders>
-              <w:bottom w:val="single" w:sz="4" w:space="0" w:color="auto"/>
-            </w:tcBorders>
-            <w:vAlign w:val="center"/>
+            <w:tcW w:w="421" w:type="pct"/>
           </w:tcPr>
           <w:p>
             <w:pPr>
               <w:pStyle w:val="NoSpacing"/>
               <w:spacing w:before="120" w:after="120"/>
-              <w:cnfStyle w:val="000000000000" w:firstRow="0" w:lastRow="0" w:firstColumn="0" w:lastColumn="0" w:oddVBand="0" w:evenVBand="0" w:oddHBand="0" w:evenHBand="0" w:firstRowFirstColumn="0" w:firstRowLastColumn="0" w:lastRowFirstColumn="0" w:lastRowLastColumn="0"/>
               <w:rPr>
                 <w:lang w:eastAsia="en-US"/>
               </w:rPr>
@@ -1937,17 +1770,12 @@
         </w:tc>
         <w:tc>
           <w:tcPr>
-            <w:tcW w:w="202" w:type="pct"/>
-            <w:tcBorders>
-              <w:bottom w:val="single" w:sz="4" w:space="0" w:color="auto"/>
-            </w:tcBorders>
-            <w:vAlign w:val="center"/>
+            <w:tcW w:w="166" w:type="pct"/>
           </w:tcPr>
           <w:p>
             <w:pPr>
               <w:pStyle w:val="NoSpacing"/>
               <w:spacing w:before="120" w:after="120"/>
-              <w:cnfStyle w:val="000000000000" w:firstRow="0" w:lastRow="0" w:firstColumn="0" w:lastColumn="0" w:oddVBand="0" w:evenVBand="0" w:oddHBand="0" w:evenHBand="0" w:firstRowFirstColumn="0" w:firstRowLastColumn="0" w:lastRowFirstColumn="0" w:lastRowLastColumn="0"/>
               <w:rPr>
                 <w:lang w:eastAsia="en-US"/>
               </w:rPr>
@@ -1956,17 +1784,12 @@
         </w:tc>
         <w:tc>
           <w:tcPr>
-            <w:tcW w:w="204" w:type="pct"/>
-            <w:tcBorders>
-              <w:bottom w:val="single" w:sz="4" w:space="0" w:color="auto"/>
-            </w:tcBorders>
-            <w:vAlign w:val="center"/>
+            <w:tcW w:w="168" w:type="pct"/>
           </w:tcPr>
           <w:p>
             <w:pPr>
               <w:pStyle w:val="NoSpacing"/>
               <w:spacing w:before="120" w:after="120"/>
-              <w:cnfStyle w:val="000000000000" w:firstRow="0" w:lastRow="0" w:firstColumn="0" w:lastColumn="0" w:oddVBand="0" w:evenVBand="0" w:oddHBand="0" w:evenHBand="0" w:firstRowFirstColumn="0" w:firstRowLastColumn="0" w:lastRowFirstColumn="0" w:lastRowLastColumn="0"/>
               <w:rPr>
                 <w:lang w:eastAsia="en-US"/>
               </w:rPr>
@@ -1991,27 +1814,20 @@
           <w:sdtContent>
             <w:tc>
               <w:tcPr>
-                <w:tcW w:w="1757" w:type="pct"/>
-                <w:tcBorders>
-                  <w:bottom w:val="single" w:sz="4" w:space="0" w:color="auto"/>
-                </w:tcBorders>
-                <w:vAlign w:val="center"/>
+                <w:tcW w:w="1900" w:type="pct"/>
               </w:tcPr>
               <w:p>
                 <w:pPr>
                   <w:pStyle w:val="BCNumber"/>
                   <w:spacing w:before="120" w:after="120"/>
                   <w:jc w:val="right"/>
-                  <w:cnfStyle w:val="000000000000" w:firstRow="0" w:lastRow="0" w:firstColumn="0" w:lastColumn="0" w:oddVBand="0" w:evenVBand="0" w:oddHBand="0" w:evenHBand="0" w:firstRowFirstColumn="0" w:firstRowLastColumn="0" w:lastRowFirstColumn="0" w:lastRowLastColumn="0"/>
                 </w:pPr>
-                <w:proofErr w:type="spellStart"/>
                 <w:r>
                   <w:rPr>
                     <w:lang w:eastAsia="en-US"/>
                   </w:rPr>
                   <w:t>TotalVATAmount</w:t>
                 </w:r>
-                <w:proofErr w:type="spellEnd"/>
               </w:p>
             </w:tc>
           </w:sdtContent>
@@ -2019,22 +1835,15 @@
       </w:tr>
       <w:tr>
         <w:trPr>
-          <w:cantSplit/>
+          <w:cnfStyle w:val="010000000000" w:firstRow="0" w:lastRow="1" w:firstColumn="0" w:lastColumn="0" w:oddVBand="0" w:evenVBand="0" w:oddHBand="0" w:evenHBand="0" w:firstRowFirstColumn="0" w:firstRowLastColumn="0" w:lastRowFirstColumn="0" w:lastRowLastColumn="0"/>
           <w:trHeight w:val="490"/>
         </w:trPr>
         <w:tc>
           <w:tcPr>
-            <w:cnfStyle w:val="001000000000" w:firstRow="0" w:lastRow="0" w:firstColumn="1" w:lastColumn="0" w:oddVBand="0" w:evenVBand="0" w:oddHBand="0" w:evenHBand="0" w:firstRowFirstColumn="0" w:firstRowLastColumn="0" w:lastRowFirstColumn="0" w:lastRowLastColumn="0"/>
-            <w:tcW w:w="2380" w:type="pct"/>
-            <w:tcBorders>
-              <w:top w:val="single" w:sz="4" w:space="0" w:color="auto"/>
-              <w:bottom w:val="single" w:sz="8" w:space="0" w:color="auto"/>
-            </w:tcBorders>
-            <w:vAlign w:val="center"/>
+            <w:tcW w:w="2344" w:type="pct"/>
           </w:tcPr>
           <w:sdt>
             <w:sdtPr>
-              <w:rPr/>
               <w:alias w:val="TotalIncludingVATText"/>
               <w:tag w:val="#BC:InsertDataItem,DataItems/Header/Totals/TotalIncludingVATText"/>
               <w:id w:val="-1340845080"/>
@@ -2051,29 +1860,21 @@
                   <w:pStyle w:val="BCLabel"/>
                   <w:spacing w:before="120" w:after="120"/>
                 </w:pPr>
-                <w:proofErr w:type="spellStart"/>
                 <w:r>
                   <w:t>TotalIncludingVATText</w:t>
                 </w:r>
-                <w:proofErr w:type="spellEnd"/>
               </w:p>
             </w:sdtContent>
           </w:sdt>
         </w:tc>
         <w:tc>
           <w:tcPr>
-            <w:tcW w:w="457" w:type="pct"/>
-            <w:tcBorders>
-              <w:top w:val="single" w:sz="4" w:space="0" w:color="auto"/>
-              <w:bottom w:val="single" w:sz="8" w:space="0" w:color="auto"/>
-            </w:tcBorders>
-            <w:vAlign w:val="center"/>
+            <w:tcW w:w="421" w:type="pct"/>
           </w:tcPr>
           <w:p>
             <w:pPr>
               <w:pStyle w:val="BCLabel"/>
               <w:spacing w:before="120" w:after="120"/>
-              <w:cnfStyle w:val="000000000000" w:firstRow="0" w:lastRow="0" w:firstColumn="0" w:lastColumn="0" w:oddVBand="0" w:evenVBand="0" w:oddHBand="0" w:evenHBand="0" w:firstRowFirstColumn="0" w:firstRowLastColumn="0" w:lastRowFirstColumn="0" w:lastRowLastColumn="0"/>
               <w:rPr>
                 <w:lang w:eastAsia="en-US"/>
               </w:rPr>
@@ -2082,18 +1883,12 @@
         </w:tc>
         <w:tc>
           <w:tcPr>
-            <w:tcW w:w="202" w:type="pct"/>
-            <w:tcBorders>
-              <w:top w:val="single" w:sz="4" w:space="0" w:color="auto"/>
-              <w:bottom w:val="single" w:sz="8" w:space="0" w:color="auto"/>
-            </w:tcBorders>
-            <w:vAlign w:val="center"/>
+            <w:tcW w:w="166" w:type="pct"/>
           </w:tcPr>
           <w:p>
             <w:pPr>
               <w:pStyle w:val="BCLabel"/>
               <w:spacing w:before="120" w:after="120"/>
-              <w:cnfStyle w:val="000000000000" w:firstRow="0" w:lastRow="0" w:firstColumn="0" w:lastColumn="0" w:oddVBand="0" w:evenVBand="0" w:oddHBand="0" w:evenHBand="0" w:firstRowFirstColumn="0" w:firstRowLastColumn="0" w:lastRowFirstColumn="0" w:lastRowLastColumn="0"/>
               <w:rPr>
                 <w:lang w:eastAsia="en-US"/>
               </w:rPr>
@@ -2102,18 +1897,12 @@
         </w:tc>
         <w:tc>
           <w:tcPr>
-            <w:tcW w:w="204" w:type="pct"/>
-            <w:tcBorders>
-              <w:top w:val="single" w:sz="4" w:space="0" w:color="auto"/>
-              <w:bottom w:val="single" w:sz="8" w:space="0" w:color="auto"/>
-            </w:tcBorders>
-            <w:vAlign w:val="center"/>
+            <w:tcW w:w="168" w:type="pct"/>
           </w:tcPr>
           <w:p>
             <w:pPr>
               <w:pStyle w:val="BCLabel"/>
               <w:spacing w:before="120" w:after="120"/>
-              <w:cnfStyle w:val="000000000000" w:firstRow="0" w:lastRow="0" w:firstColumn="0" w:lastColumn="0" w:oddVBand="0" w:evenVBand="0" w:oddHBand="0" w:evenHBand="0" w:firstRowFirstColumn="0" w:firstRowLastColumn="0" w:lastRowFirstColumn="0" w:lastRowLastColumn="0"/>
               <w:rPr>
                 <w:lang w:eastAsia="en-US"/>
               </w:rPr>
@@ -2122,19 +1911,13 @@
         </w:tc>
         <w:tc>
           <w:tcPr>
-            <w:tcW w:w="1757" w:type="pct"/>
-            <w:tcBorders>
-              <w:top w:val="single" w:sz="4" w:space="0" w:color="auto"/>
-              <w:bottom w:val="single" w:sz="8" w:space="0" w:color="auto"/>
-            </w:tcBorders>
-            <w:vAlign w:val="center"/>
+            <w:tcW w:w="1900" w:type="pct"/>
           </w:tcPr>
           <w:p>
             <w:pPr>
               <w:pStyle w:val="BCLabelNumber"/>
               <w:spacing w:before="120" w:after="120"/>
               <w:jc w:val="right"/>
-              <w:cnfStyle w:val="000000000000" w:firstRow="0" w:lastRow="0" w:firstColumn="0" w:lastColumn="0" w:oddVBand="0" w:evenVBand="0" w:oddHBand="0" w:evenHBand="0" w:firstRowFirstColumn="0" w:firstRowLastColumn="0" w:lastRowFirstColumn="0" w:lastRowLastColumn="0"/>
               <w:rPr>
                 <w:lang w:eastAsia="en-US"/>
               </w:rPr>
@@ -2142,10 +1925,8 @@
             <w:r>
               <w:t> </w:t>
             </w:r>
-            <w:proofErr w:type="spellStart"/>
             <w:sdt>
               <w:sdtPr>
-                <w:rPr/>
                 <w:alias w:val="TotalAmountIncludingVAT"/>
                 <w:tag w:val="#BC:InsertDataItem,DataItems/Header/Totals/TotalAmountIncludingVAT"/>
                 <w:id w:val="-556017080"/>
@@ -2160,20 +1941,34 @@
                 <w:r>
                   <w:t>TotalAmountIncludingVAT</w:t>
                 </w:r>
-                <w:proofErr w:type="spellEnd"/>
               </w:sdtContent>
             </w:sdt>
           </w:p>
         </w:tc>
       </w:tr>
+    </w:tbl>
+    <w:p/>
+    <w:tbl>
+      <w:tblPr>
+        <w:tblStyle w:val="BCTotalsTable"/>
+        <w:tblW w:w="5000" w:type="pct"/>
+        <w:tblLook w:val="0640" w:firstRow="0" w:lastRow="1" w:firstColumn="0" w:lastColumn="0" w:noHBand="1" w:noVBand="1"/>
+        <w:tblCaption w:val="Table 4"/>
+        <w:tblDescription w:val="Document totals."/>
+      </w:tblPr>
+      <w:tblGrid>
+        <w:gridCol w:w="4921"/>
+        <w:gridCol w:w="884"/>
+        <w:gridCol w:w="348"/>
+        <w:gridCol w:w="353"/>
+        <w:gridCol w:w="3988"/>
+      </w:tblGrid>
       <w:tr>
         <w:trPr>
-          <w:cantSplit/>
           <w:trHeight w:val="490"/>
         </w:trPr>
         <w:sdt>
           <w:sdtPr>
-            <w:rPr/>
             <w:alias w:val="VATClausesHeader"/>
             <w:tag w:val="#BC:InsertDataItem,DataItems/Header/VATClauseLine/VATClausesHeader"/>
             <w:id w:val="-305391123"/>
@@ -2187,41 +1982,29 @@
           <w:sdtContent>
             <w:tc>
               <w:tcPr>
-                <w:cnfStyle w:val="001000000000" w:firstRow="0" w:lastRow="0" w:firstColumn="1" w:lastColumn="0" w:oddVBand="0" w:evenVBand="0" w:oddHBand="0" w:evenHBand="0" w:firstRowFirstColumn="0" w:firstRowLastColumn="0" w:lastRowFirstColumn="0" w:lastRowLastColumn="0"/>
-                <w:tcW w:w="2380" w:type="pct"/>
-                <w:tcBorders>
-                  <w:top w:val="single" w:sz="8" w:space="0" w:color="auto"/>
-                </w:tcBorders>
-                <w:vAlign w:val="center"/>
+                <w:tcW w:w="2344" w:type="pct"/>
               </w:tcPr>
               <w:p>
                 <w:pPr>
                   <w:pStyle w:val="NoSpacing"/>
-                  <w:spacing w:before="120" w:after="120" w:line="240" w:lineRule="auto"/>
+                  <w:spacing w:before="120" w:after="120"/>
                   <w:textAlignment w:val="baseline"/>
                 </w:pPr>
-                <w:proofErr w:type="spellStart"/>
                 <w:r>
                   <w:t>VATClausesHeader</w:t>
                 </w:r>
-                <w:proofErr w:type="spellEnd"/>
               </w:p>
             </w:tc>
           </w:sdtContent>
         </w:sdt>
         <w:tc>
           <w:tcPr>
-            <w:tcW w:w="457" w:type="pct"/>
-            <w:tcBorders>
-              <w:top w:val="single" w:sz="8" w:space="0" w:color="auto"/>
-            </w:tcBorders>
-            <w:vAlign w:val="center"/>
+            <w:tcW w:w="421" w:type="pct"/>
           </w:tcPr>
           <w:p>
             <w:pPr>
               <w:pStyle w:val="NoSpacing"/>
-              <w:spacing w:before="120" w:after="120" w:line="240" w:lineRule="auto"/>
-              <w:cnfStyle w:val="000000000000" w:firstRow="0" w:lastRow="0" w:firstColumn="0" w:lastColumn="0" w:oddVBand="0" w:evenVBand="0" w:oddHBand="0" w:evenHBand="0" w:firstRowFirstColumn="0" w:firstRowLastColumn="0" w:lastRowFirstColumn="0" w:lastRowLastColumn="0"/>
+              <w:spacing w:before="120" w:after="120"/>
               <w:rPr>
                 <w:lang w:eastAsia="en-US"/>
               </w:rPr>
@@ -2230,17 +2013,12 @@
         </w:tc>
         <w:tc>
           <w:tcPr>
-            <w:tcW w:w="202" w:type="pct"/>
-            <w:tcBorders>
-              <w:top w:val="single" w:sz="8" w:space="0" w:color="auto"/>
-            </w:tcBorders>
-            <w:vAlign w:val="center"/>
+            <w:tcW w:w="166" w:type="pct"/>
           </w:tcPr>
           <w:p>
             <w:pPr>
               <w:pStyle w:val="NoSpacing"/>
-              <w:spacing w:before="120" w:after="120" w:line="240" w:lineRule="auto"/>
-              <w:cnfStyle w:val="000000000000" w:firstRow="0" w:lastRow="0" w:firstColumn="0" w:lastColumn="0" w:oddVBand="0" w:evenVBand="0" w:oddHBand="0" w:evenHBand="0" w:firstRowFirstColumn="0" w:firstRowLastColumn="0" w:lastRowFirstColumn="0" w:lastRowLastColumn="0"/>
+              <w:spacing w:before="120" w:after="120"/>
               <w:rPr>
                 <w:lang w:eastAsia="en-US"/>
               </w:rPr>
@@ -2249,17 +2027,12 @@
         </w:tc>
         <w:tc>
           <w:tcPr>
-            <w:tcW w:w="204" w:type="pct"/>
-            <w:tcBorders>
-              <w:top w:val="single" w:sz="8" w:space="0" w:color="auto"/>
-            </w:tcBorders>
-            <w:vAlign w:val="center"/>
+            <w:tcW w:w="168" w:type="pct"/>
           </w:tcPr>
           <w:p>
             <w:pPr>
               <w:pStyle w:val="NoSpacing"/>
-              <w:spacing w:before="120" w:after="120" w:line="240" w:lineRule="auto"/>
-              <w:cnfStyle w:val="000000000000" w:firstRow="0" w:lastRow="0" w:firstColumn="0" w:lastColumn="0" w:oddVBand="0" w:evenVBand="0" w:oddHBand="0" w:evenHBand="0" w:firstRowFirstColumn="0" w:firstRowLastColumn="0" w:lastRowFirstColumn="0" w:lastRowLastColumn="0"/>
+              <w:spacing w:before="120" w:after="120"/>
               <w:rPr>
                 <w:lang w:eastAsia="en-US"/>
               </w:rPr>
@@ -2268,18 +2041,13 @@
         </w:tc>
         <w:tc>
           <w:tcPr>
-            <w:tcW w:w="1757" w:type="pct"/>
-            <w:tcBorders>
-              <w:top w:val="single" w:sz="8" w:space="0" w:color="auto"/>
-            </w:tcBorders>
-            <w:vAlign w:val="center"/>
+            <w:tcW w:w="1900" w:type="pct"/>
           </w:tcPr>
           <w:p>
             <w:pPr>
               <w:pStyle w:val="BCNumber"/>
-              <w:spacing w:before="120" w:after="120" w:line="240" w:lineRule="auto"/>
+              <w:spacing w:before="120" w:after="120"/>
               <w:jc w:val="right"/>
-              <w:cnfStyle w:val="000000000000" w:firstRow="0" w:lastRow="0" w:firstColumn="0" w:lastColumn="0" w:oddVBand="0" w:evenVBand="0" w:oddHBand="0" w:evenHBand="0" w:firstRowFirstColumn="0" w:firstRowLastColumn="0" w:lastRowFirstColumn="0" w:lastRowLastColumn="0"/>
             </w:pPr>
           </w:p>
         </w:tc>
@@ -2287,12 +2055,10 @@
       <w:tr>
         <w:trPr>
           <w:cnfStyle w:val="010000000000" w:firstRow="0" w:lastRow="1" w:firstColumn="0" w:lastColumn="0" w:oddVBand="0" w:evenVBand="0" w:oddHBand="0" w:evenHBand="0" w:firstRowFirstColumn="0" w:firstRowLastColumn="0" w:lastRowFirstColumn="0" w:lastRowLastColumn="0"/>
-          <w:cantSplit/>
           <w:trHeight w:val="490"/>
         </w:trPr>
         <w:sdt>
           <w:sdtPr>
-            <w:rPr/>
             <w:alias w:val="Description_VATClauseLine"/>
             <w:tag w:val="#BC:InsertDataItem,DataItems/Header/VATClauseLine/Description_VATClauseLine"/>
             <w:id w:val="1620184004"/>
@@ -2306,41 +2072,29 @@
           <w:sdtContent>
             <w:tc>
               <w:tcPr>
-                <w:cnfStyle w:val="001000000000" w:firstRow="0" w:lastRow="0" w:firstColumn="1" w:lastColumn="0" w:oddVBand="0" w:evenVBand="0" w:oddHBand="0" w:evenHBand="0" w:firstRowFirstColumn="0" w:firstRowLastColumn="0" w:lastRowFirstColumn="0" w:lastRowLastColumn="0"/>
-                <w:tcW w:w="2380" w:type="pct"/>
-                <w:tcBorders>
-                  <w:top w:val="none" w:sz="0" w:space="0" w:color="auto"/>
-                </w:tcBorders>
-                <w:vAlign w:val="center"/>
+                <w:tcW w:w="2344" w:type="pct"/>
               </w:tcPr>
               <w:p>
                 <w:pPr>
                   <w:pStyle w:val="BCLabel"/>
-                  <w:spacing w:before="120" w:after="120" w:line="240" w:lineRule="auto"/>
+                  <w:spacing w:before="120" w:after="120"/>
                   <w:textAlignment w:val="baseline"/>
                 </w:pPr>
-                <w:proofErr w:type="spellStart"/>
                 <w:r>
                   <w:t>Description_VATClauseLine</w:t>
                 </w:r>
-                <w:proofErr w:type="spellEnd"/>
               </w:p>
             </w:tc>
           </w:sdtContent>
         </w:sdt>
         <w:tc>
           <w:tcPr>
-            <w:tcW w:w="457" w:type="pct"/>
-            <w:tcBorders>
-              <w:top w:val="none" w:sz="0" w:space="0" w:color="auto"/>
-            </w:tcBorders>
-            <w:vAlign w:val="center"/>
+            <w:tcW w:w="421" w:type="pct"/>
           </w:tcPr>
           <w:p>
             <w:pPr>
               <w:pStyle w:val="BCLabel"/>
-              <w:spacing w:before="120" w:after="120" w:line="240" w:lineRule="auto"/>
-              <w:cnfStyle w:val="010000000000" w:firstRow="0" w:lastRow="1" w:firstColumn="0" w:lastColumn="0" w:oddVBand="0" w:evenVBand="0" w:oddHBand="0" w:evenHBand="0" w:firstRowFirstColumn="0" w:firstRowLastColumn="0" w:lastRowFirstColumn="0" w:lastRowLastColumn="0"/>
+              <w:spacing w:before="120" w:after="120"/>
               <w:rPr>
                 <w:lang w:eastAsia="en-US"/>
               </w:rPr>
@@ -2349,17 +2103,12 @@
         </w:tc>
         <w:tc>
           <w:tcPr>
-            <w:tcW w:w="202" w:type="pct"/>
-            <w:tcBorders>
-              <w:top w:val="none" w:sz="0" w:space="0" w:color="auto"/>
-            </w:tcBorders>
-            <w:vAlign w:val="center"/>
+            <w:tcW w:w="166" w:type="pct"/>
           </w:tcPr>
           <w:p>
             <w:pPr>
               <w:pStyle w:val="BCLabel"/>
-              <w:spacing w:before="120" w:after="120" w:line="240" w:lineRule="auto"/>
-              <w:cnfStyle w:val="010000000000" w:firstRow="0" w:lastRow="1" w:firstColumn="0" w:lastColumn="0" w:oddVBand="0" w:evenVBand="0" w:oddHBand="0" w:evenHBand="0" w:firstRowFirstColumn="0" w:firstRowLastColumn="0" w:lastRowFirstColumn="0" w:lastRowLastColumn="0"/>
+              <w:spacing w:before="120" w:after="120"/>
               <w:rPr>
                 <w:lang w:eastAsia="en-US"/>
               </w:rPr>
@@ -2368,17 +2117,12 @@
         </w:tc>
         <w:tc>
           <w:tcPr>
-            <w:tcW w:w="204" w:type="pct"/>
-            <w:tcBorders>
-              <w:top w:val="none" w:sz="0" w:space="0" w:color="auto"/>
-            </w:tcBorders>
-            <w:vAlign w:val="center"/>
+            <w:tcW w:w="168" w:type="pct"/>
           </w:tcPr>
           <w:p>
             <w:pPr>
               <w:pStyle w:val="BCLabel"/>
-              <w:spacing w:before="120" w:after="120" w:line="240" w:lineRule="auto"/>
-              <w:cnfStyle w:val="010000000000" w:firstRow="0" w:lastRow="1" w:firstColumn="0" w:lastColumn="0" w:oddVBand="0" w:evenVBand="0" w:oddHBand="0" w:evenHBand="0" w:firstRowFirstColumn="0" w:firstRowLastColumn="0" w:lastRowFirstColumn="0" w:lastRowLastColumn="0"/>
+              <w:spacing w:before="120" w:after="120"/>
               <w:rPr>
                 <w:lang w:eastAsia="en-US"/>
               </w:rPr>
@@ -2387,7 +2131,6 @@
         </w:tc>
         <w:sdt>
           <w:sdtPr>
-            <w:rPr/>
             <w:alias w:val="VATAmount_VATClauseLine"/>
             <w:tag w:val="#BC:InsertDataItem,DataItems/Header/VATClauseLine/VATAmount_VATClauseLine"/>
             <w:id w:val="825557612"/>
@@ -2401,36 +2144,26 @@
           <w:sdtContent>
             <w:tc>
               <w:tcPr>
-                <w:tcW w:w="1757" w:type="pct"/>
-                <w:tcBorders>
-                  <w:top w:val="none" w:sz="0" w:space="0" w:color="auto"/>
-                </w:tcBorders>
-                <w:vAlign w:val="center"/>
+                <w:tcW w:w="1900" w:type="pct"/>
               </w:tcPr>
               <w:p>
                 <w:pPr>
                   <w:pStyle w:val="BCLabelNumber"/>
-                  <w:spacing w:before="120" w:after="120" w:line="240" w:lineRule="auto"/>
+                  <w:spacing w:before="120" w:after="120"/>
                   <w:jc w:val="right"/>
-                  <w:cnfStyle w:val="010000000000" w:firstRow="0" w:lastRow="1" w:firstColumn="0" w:lastColumn="0" w:oddVBand="0" w:evenVBand="0" w:oddHBand="0" w:evenHBand="0" w:firstRowFirstColumn="0" w:firstRowLastColumn="0" w:lastRowFirstColumn="0" w:lastRowLastColumn="0"/>
                 </w:pPr>
-                <w:proofErr w:type="spellStart"/>
                 <w:r>
                   <w:t>VATAmount_VATClauseLine</w:t>
                 </w:r>
-                <w:proofErr w:type="spellEnd"/>
               </w:p>
             </w:tc>
           </w:sdtContent>
         </w:sdt>
       </w:tr>
     </w:tbl>
-    <w:p>
-      <w:pPr/>
-    </w:p>
+    <w:p/>
     <w:sdt>
       <w:sdtPr>
-        <w:rPr/>
         <w:alias w:val="WorkDescriptionLine"/>
         <w:tag w:val="#BC:InsertDataItem,DataItems/Header/WorkDescriptionLines/WorkDescriptionLine"/>
         <w:id w:val="1093668451"/>
@@ -2446,11 +2179,9 @@
           <w:pPr>
             <w:ind w:right="26"/>
           </w:pPr>
-          <w:proofErr w:type="spellStart"/>
           <w:r>
             <w:t>WorkDescriptionLine</w:t>
           </w:r>
-          <w:proofErr w:type="spellEnd"/>
         </w:p>
       </w:sdtContent>
     </w:sdt>
@@ -2474,7 +2205,7 @@
         <w:kern w:val="2"/>
         <w:sz w:val="24"/>
         <w:szCs w:val="24"/>
-        <w:lang w:val="en-DK" w:eastAsia="en-DK" w:bidi="ar-SA"/>
+        <w:lang w:bidi="ar-SA"/>
         <w14:ligatures w14:val="standardContextual"/>
       </w:rPr>
     </w:rPrDefault>
@@ -2980,6 +2711,7 @@
       <w:kern w:val="0"/>
       <w:sz w:val="20"/>
       <w:szCs w:val="20"/>
+      <w:lang w:val="en-US" w:eastAsia="en-US"/>
       <w14:ligatures w14:val="none"/>
     </w:rPr>
     <w:tblPr/>
@@ -3181,8 +2913,8 @@
       <w:spacing w:after="0" w:line="240" w:lineRule="auto"/>
     </w:pPr>
     <w:rPr>
-      <w:rFonts w:asciiTheme="minorHAnsi" w:hAnsiTheme="minorHAnsi" w:eastAsiaTheme="minorHAnsi" w:cstheme="minorBidi"/>
-      <w:color w:val="242424" w:themeColor="text1"/>
+      <w:rFonts w:eastAsiaTheme="minorHAnsi"/>
+      <w:color w:val="000000" w:themeColor="text1"/>
     </w:rPr>
   </w:style>
   <w:style w:type="paragraph" w:customStyle="1" w:styleId="BCNumber">
@@ -3191,13 +2923,7 @@
     <w:next w:val="Normal"/>
     <w:uiPriority w:val="2"/>
     <w:qFormat/>
-    <w:pPr>
-      <w:spacing w:before="0" w:after="0" w:line="240" w:lineRule="auto"/>
-    </w:pPr>
     <w:rPr>
-      <w:rFonts w:asciiTheme="minorHAnsi" w:hAnsiTheme="minorHAnsi" w:eastAsiaTheme="minorHAnsi" w:cstheme="minorBidi"/>
-      <w:color w:val="242424" w:themeColor="text1"/>
-      <w14:numForm w14:val="tabular"/>
       <w14:numSpacing w14:val="tabular"/>
     </w:rPr>
   </w:style>
@@ -3209,11 +2935,9 @@
     <w:qFormat/>
     <w:pPr>
       <w:keepNext/>
-      <w:spacing w:before="0" w:after="0" w:line="240" w:lineRule="auto"/>
     </w:pPr>
     <w:rPr>
-      <w:rFonts w:asciiTheme="majorHAnsi" w:hAnsiTheme="majorHAnsi" w:eastAsiaTheme="majorEastAsia" w:cstheme="majorBidi"/>
-      <w:color w:val="242424" w:themeColor="text1"/>
+      <w:rFonts w:asciiTheme="majorHAnsi" w:eastAsiaTheme="majorEastAsia" w:hAnsiTheme="majorHAnsi" w:cstheme="majorBidi"/>
     </w:rPr>
   </w:style>
   <w:style w:type="paragraph" w:customStyle="1" w:styleId="BCLabelNumber">
@@ -3222,13 +2946,7 @@
     <w:next w:val="Normal"/>
     <w:uiPriority w:val="2"/>
     <w:qFormat/>
-    <w:pPr>
-      <w:spacing w:before="0" w:after="0" w:line="240" w:lineRule="auto"/>
-    </w:pPr>
     <w:rPr>
-      <w:rFonts w:asciiTheme="majorHAnsi" w:hAnsiTheme="majorHAnsi" w:eastAsiaTheme="majorEastAsia" w:cstheme="majorBidi"/>
-      <w:color w:val="242424" w:themeColor="text1"/>
-      <w14:numForm w14:val="tabular"/>
       <w14:numSpacing w14:val="tabular"/>
     </w:rPr>
   </w:style>
@@ -3238,25 +2956,21 @@
     <w:uiPriority w:val="99"/>
     <w:qFormat/>
     <w:pPr>
-      <w:spacing w:before="0" w:after="0" w:line="240" w:lineRule="auto"/>
+      <w:spacing w:after="0" w:line="240" w:lineRule="auto"/>
     </w:pPr>
     <w:tblPr>
       <w:tblStyleRowBandSize w:val="1"/>
       <w:tblStyleColBandSize w:val="1"/>
       <w:tblCellMar>
-        <w:top w:w="0" w:type="dxa"/>
         <w:left w:w="0" w:type="dxa"/>
-        <w:bottom w:w="0" w:type="dxa"/>
         <w:right w:w="0" w:type="dxa"/>
       </w:tblCellMar>
     </w:tblPr>
-    <w:tcPr>
-      <w:vAlign w:val="top"/>
-    </w:tcPr>
     <w:tblStylePr w:type="firstRow">
       <w:rPr>
         <w:rFonts w:asciiTheme="majorHAnsi" w:hAnsiTheme="majorHAnsi" w:cstheme="majorBidi"/>
       </w:rPr>
+      <w:tblPr/>
       <w:tcPr>
         <w:vAlign w:val="top"/>
       </w:tcPr>
@@ -3268,15 +2982,13 @@
     <w:uiPriority w:val="99"/>
     <w:qFormat/>
     <w:pPr>
-      <w:spacing w:before="0" w:after="0" w:line="240" w:lineRule="auto"/>
+      <w:spacing w:after="0" w:line="240" w:lineRule="auto"/>
     </w:pPr>
     <w:tblPr>
       <w:tblStyleRowBandSize w:val="1"/>
       <w:tblStyleColBandSize w:val="1"/>
       <w:tblCellMar>
-        <w:top w:w="0" w:type="dxa"/>
         <w:left w:w="115" w:type="dxa"/>
-        <w:bottom w:w="0" w:type="dxa"/>
         <w:right w:w="115" w:type="dxa"/>
       </w:tblCellMar>
     </w:tblPr>
@@ -3290,28 +3002,32 @@
       <w:rPr>
         <w:rFonts w:asciiTheme="majorHAnsi" w:hAnsiTheme="majorHAnsi" w:cstheme="majorBidi"/>
       </w:rPr>
+      <w:tblPr/>
       <w:tcPr>
         <w:tcBorders>
-          <w:bottom w:val="single" w:sz="4" w:space="0" w:color="242424" w:themeColor="text1"/>
+          <w:bottom w:val="single" w:sz="4" w:space="0" w:color="000000" w:themeColor="text1"/>
         </w:tcBorders>
         <w:vAlign w:val="top"/>
       </w:tcPr>
     </w:tblStylePr>
     <w:tblStylePr w:type="lastRow">
+      <w:tblPr/>
       <w:tcPr>
         <w:tcBorders>
-          <w:bottom w:val="single" w:sz="4" w:space="0" w:color="F5F7F8" w:themeColor="background2"/>
+          <w:bottom w:val="single" w:sz="4" w:space="0" w:color="E8E8E8" w:themeColor="background2"/>
         </w:tcBorders>
       </w:tcPr>
     </w:tblStylePr>
     <w:tblStylePr w:type="band1Horz">
+      <w:tblPr/>
       <w:tcPr>
         <w:shd w:val="clear" w:color="auto" w:fill="auto"/>
       </w:tcPr>
     </w:tblStylePr>
     <w:tblStylePr w:type="band2Horz">
+      <w:tblPr/>
       <w:tcPr>
-        <w:shd w:val="clear" w:color="auto" w:fill="CCE6E9" w:themeFill="accent2" w:themeFillTint="33"/>
+        <w:shd w:val="clear" w:color="auto" w:fill="FAE2D5" w:themeFill="accent2" w:themeFillTint="33"/>
       </w:tcPr>
     </w:tblStylePr>
   </w:style>
@@ -3321,15 +3037,13 @@
     <w:uiPriority w:val="99"/>
     <w:qFormat/>
     <w:pPr>
-      <w:spacing w:before="0" w:after="0" w:line="240" w:lineRule="auto"/>
+      <w:spacing w:after="0" w:line="240" w:lineRule="auto"/>
     </w:pPr>
     <w:tblPr>
       <w:tblStyleRowBandSize w:val="1"/>
       <w:tblStyleColBandSize w:val="1"/>
       <w:tblCellMar>
-        <w:top w:w="0" w:type="dxa"/>
         <w:left w:w="115" w:type="dxa"/>
-        <w:bottom w:w="0" w:type="dxa"/>
         <w:right w:w="115" w:type="dxa"/>
       </w:tblCellMar>
     </w:tblPr>
@@ -3340,10 +3054,11 @@
       <w:rPr>
         <w:rFonts w:asciiTheme="majorHAnsi" w:hAnsiTheme="majorHAnsi" w:cstheme="majorBidi"/>
       </w:rPr>
+      <w:tblPr/>
       <w:tcPr>
         <w:tcBorders>
-          <w:top w:val="single" w:sz="4" w:space="0" w:color="242424" w:themeColor="text1"/>
-          <w:bottom w:val="single" w:sz="8" w:space="0" w:color="242424" w:themeColor="text1"/>
+          <w:top w:val="single" w:sz="4" w:space="0" w:color="000000" w:themeColor="text1"/>
+          <w:bottom w:val="single" w:sz="8" w:space="0" w:color="000000" w:themeColor="text1"/>
         </w:tcBorders>
       </w:tcPr>
     </w:tblStylePr>
@@ -3354,7 +3069,7 @@
     <w:uiPriority w:val="99"/>
     <w:qFormat/>
     <w:pPr>
-      <w:spacing w:before="0" w:after="0" w:line="240" w:lineRule="auto"/>
+      <w:spacing w:after="0" w:line="240" w:lineRule="auto"/>
     </w:pPr>
     <w:tblPr>
       <w:tblStyleRowBandSize w:val="1"/>
@@ -3373,6 +3088,7 @@
       <w:rPr>
         <w:rFonts w:asciiTheme="majorHAnsi" w:hAnsiTheme="majorHAnsi" w:cstheme="majorBidi"/>
       </w:rPr>
+      <w:tblPr/>
       <w:tcPr>
         <w:vAlign w:val="bottom"/>
       </w:tcPr>
@@ -3381,9 +3097,10 @@
       <w:rPr>
         <w:rFonts w:asciiTheme="majorHAnsi" w:hAnsiTheme="majorHAnsi" w:cstheme="majorBidi"/>
       </w:rPr>
+      <w:tblPr/>
       <w:tcPr>
         <w:tcBorders>
-          <w:top w:val="single" w:sz="4" w:space="0" w:color="242424" w:themeColor="text1"/>
+          <w:top w:val="single" w:sz="4" w:space="0" w:color="000000" w:themeColor="text1"/>
         </w:tcBorders>
       </w:tcPr>
     </w:tblStylePr>
@@ -3394,25 +3111,21 @@
     <w:uiPriority w:val="99"/>
     <w:qFormat/>
     <w:pPr>
-      <w:spacing w:before="0" w:after="0" w:line="240" w:lineRule="auto"/>
+      <w:spacing w:after="0" w:line="240" w:lineRule="auto"/>
     </w:pPr>
     <w:tblPr>
       <w:tblStyleRowBandSize w:val="1"/>
       <w:tblStyleColBandSize w:val="1"/>
       <w:tblCellMar>
-        <w:top w:w="0" w:type="dxa"/>
         <w:left w:w="0" w:type="dxa"/>
-        <w:bottom w:w="0" w:type="dxa"/>
         <w:right w:w="0" w:type="dxa"/>
       </w:tblCellMar>
     </w:tblPr>
-    <w:tcPr>
-      <w:vAlign w:val="top"/>
-    </w:tcPr>
     <w:tblStylePr w:type="lastRow">
+      <w:tblPr/>
       <w:tcPr>
         <w:tcBorders>
-          <w:bottom w:val="single" w:sz="4" w:space="0" w:color="242424" w:themeColor="text1"/>
+          <w:bottom w:val="single" w:sz="4" w:space="0" w:color="000000" w:themeColor="text1"/>
         </w:tcBorders>
       </w:tcPr>
     </w:tblStylePr>
@@ -3421,7 +3134,7 @@
 </file>
 
 <file path=word/glossary/document.xml><?xml version="1.0" encoding="utf-8"?>
-<w:glossaryDocument xmlns:wpc="http://schemas.microsoft.com/office/word/2010/wordprocessingCanvas" xmlns:cx="http://schemas.microsoft.com/office/drawing/2014/chartex" xmlns:cx1="http://schemas.microsoft.com/office/drawing/2015/9/8/chartex" xmlns:cx2="http://schemas.microsoft.com/office/drawing/2015/10/21/chartex" xmlns:cx3="http://schemas.microsoft.com/office/drawing/2016/5/9/chartex" xmlns:cx4="http://schemas.microsoft.com/office/drawing/2016/5/10/chartex" xmlns:cx5="http://schemas.microsoft.com/office/drawing/2016/5/11/chartex" xmlns:cx6="http://schemas.microsoft.com/office/drawing/2016/5/12/chartex" xmlns:cx7="http://schemas.microsoft.com/office/drawing/2016/5/13/chartex" xmlns:cx8="http://schemas.microsoft.com/office/drawing/2016/5/14/chartex" xmlns:mc="http://schemas.openxmlformats.org/markup-compatibility/2006" xmlns:aink="http://schemas.microsoft.com/office/drawing/2016/ink" xmlns:am3d="http://schemas.microsoft.com/office/drawing/2017/model3d" xmlns:o="urn:schemas-microsoft-com:office:office" xmlns:oel="http://schemas.microsoft.com/office/2019/extlst" xmlns:r="http://schemas.openxmlformats.org/officeDocument/2006/relationships" xmlns:m="http://schemas.openxmlformats.org/officeDocument/2006/math" xmlns:v="urn:schemas-microsoft-com:vml" xmlns:wp14="http://schemas.microsoft.com/office/word/2010/wordprocessingDrawing" xmlns:wp="http://schemas.openxmlformats.org/drawingml/2006/wordprocessingDrawing" xmlns:w10="urn:schemas-microsoft-com:office:word" xmlns:w="http://schemas.openxmlformats.org/wordprocessingml/2006/main" xmlns:w14="http://schemas.microsoft.com/office/word/2010/wordml" xmlns:w15="http://schemas.microsoft.com/office/word/2012/wordml" xmlns:w16cex="http://schemas.microsoft.com/office/word/2018/wordml/cex" xmlns:w16cid="http://schemas.microsoft.com/office/word/2016/wordml/cid" xmlns:w16="http://schemas.microsoft.com/office/word/2018/wordml" xmlns:w16du="http://schemas.microsoft.com/office/word/2023/wordml/word16du" xmlns:w16sdtdh="http://schemas.microsoft.com/office/word/2020/wordml/sdtdatahash" xmlns:w16sdtfl="http://schemas.microsoft.com/office/word/2024/wordml/sdtformatlock" xmlns:w16se="http://schemas.microsoft.com/office/word/2015/wordml/symex" xmlns:wpg="http://schemas.microsoft.com/office/word/2010/wordprocessingGroup" xmlns:wpi="http://schemas.microsoft.com/office/word/2010/wordprocessingInk" xmlns:wne="http://schemas.microsoft.com/office/word/2006/wordml" xmlns:wps="http://schemas.microsoft.com/office/word/2010/wordprocessingShape" mc:Ignorable="w14 w15 w16se w16cid w16 w16cex w16sdtdh w16sdtfl w16du wp14">
+<w:glossaryDocument xmlns:wpc="http://schemas.microsoft.com/office/word/2010/wordprocessingCanvas" xmlns:cx="http://schemas.microsoft.com/office/drawing/2014/chartex" xmlns:cx1="http://schemas.microsoft.com/office/drawing/2015/9/8/chartex" xmlns:cx2="http://schemas.microsoft.com/office/drawing/2015/10/21/chartex" xmlns:cx3="http://schemas.microsoft.com/office/drawing/2016/5/9/chartex" xmlns:cx4="http://schemas.microsoft.com/office/drawing/2016/5/10/chartex" xmlns:cx5="http://schemas.microsoft.com/office/drawing/2016/5/11/chartex" xmlns:cx6="http://schemas.microsoft.com/office/drawing/2016/5/12/chartex" xmlns:cx7="http://schemas.microsoft.com/office/drawing/2016/5/13/chartex" xmlns:cx8="http://schemas.microsoft.com/office/drawing/2016/5/14/chartex" xmlns:mc="http://schemas.openxmlformats.org/markup-compatibility/2006" xmlns:aink="http://schemas.microsoft.com/office/drawing/2016/ink" xmlns:am3d="http://schemas.microsoft.com/office/drawing/2017/model3d" xmlns:o="urn:schemas-microsoft-com:office:office" xmlns:oel="http://schemas.microsoft.com/office/2019/extlst" xmlns:r="http://schemas.openxmlformats.org/officeDocument/2006/relationships" xmlns:m="http://schemas.openxmlformats.org/officeDocument/2006/math" xmlns:v="urn:schemas-microsoft-com:vml" xmlns:wp14="http://schemas.microsoft.com/office/word/2010/wordprocessingDrawing" xmlns:wp="http://schemas.openxmlformats.org/drawingml/2006/wordprocessingDrawing" xmlns:w10="urn:schemas-microsoft-com:office:word" xmlns:w="http://schemas.openxmlformats.org/wordprocessingml/2006/main" xmlns:w14="http://schemas.microsoft.com/office/word/2010/wordml" xmlns:w15="http://schemas.microsoft.com/office/word/2012/wordml" xmlns:w16cei="http://schemas.microsoft.com/office/word/2026/wordml/cei" xmlns:w16cex="http://schemas.microsoft.com/office/word/2018/wordml/cex" xmlns:w16cid="http://schemas.microsoft.com/office/word/2016/wordml/cid" xmlns:w16="http://schemas.microsoft.com/office/word/2018/wordml" xmlns:w16du="http://schemas.microsoft.com/office/word/2023/wordml/word16du" xmlns:w16sdtdh="http://schemas.microsoft.com/office/word/2020/wordml/sdtdatahash" xmlns:w16sdtfl="http://schemas.microsoft.com/office/word/2024/wordml/sdtformatlock" xmlns:w16se="http://schemas.microsoft.com/office/word/2015/wordml/symex" xmlns:wpg="http://schemas.microsoft.com/office/word/2010/wordprocessingGroup" xmlns:wpi="http://schemas.microsoft.com/office/word/2010/wordprocessingInk" xmlns:wne="http://schemas.microsoft.com/office/word/2006/wordml" xmlns:wps="http://schemas.microsoft.com/office/word/2010/wordprocessingShape" mc:Ignorable="w14 w15 w16se w16cid w16 w16cex w16sdtdh w16sdtfl w16du wp14">
   <w:docParts>
     <w:docPart>
       <w:docPartPr>
@@ -4655,13 +4368,6 @@
     <w:pitch w:val="variable"/>
     <w:sig w:usb0="E4002EFF" w:usb1="C000E47F" w:usb2="00000009" w:usb3="00000000" w:csb0="000001FF" w:csb1="00000000"/>
   </w:font>
-  <w:font w:name="Arial">
-    <w:panose1 w:val="020B0604020202020204"/>
-    <w:charset w:val="00"/>
-    <w:family w:val="swiss"/>
-    <w:pitch w:val="variable"/>
-    <w:sig w:usb0="E0002EFF" w:usb1="C000785B" w:usb2="00000009" w:usb3="00000000" w:csb0="000001FF" w:csb1="00000000"/>
-  </w:font>
 </w:fonts>
 </file>
 
@@ -4687,9 +4393,12 @@
     <w:rsid w:val="0035765C"/>
     <w:rsid w:val="00401263"/>
     <w:rsid w:val="00593F97"/>
+    <w:rsid w:val="005E257D"/>
     <w:rsid w:val="006203BB"/>
+    <w:rsid w:val="00952D33"/>
     <w:rsid w:val="00DD3BC5"/>
     <w:rsid w:val="00DD4377"/>
+    <w:rsid w:val="00E5711F"/>
     <w:rsid w:val="00EF7BF0"/>
     <w:rsid w:val="00FC3EA0"/>
   </w:rsids>
@@ -4706,9 +4415,9 @@
     <m:intLim m:val="subSup"/>
     <m:naryLim m:val="undOvr"/>
   </m:mathPr>
-  <w:themeFontLang w:val="en-DK"/>
+  <w:themeFontLang/>
   <w:clrSchemeMapping w:bg1="light1" w:t1="dark1" w:bg2="light2" w:t2="dark2" w:accent1="accent1" w:accent2="accent2" w:accent3="accent3" w:accent4="accent4" w:accent5="accent5" w:accent6="accent6" w:hyperlink="hyperlink" w:followedHyperlink="followedHyperlink"/>
-  <w:decimalSymbol w:val=","/>
+  <w:decimalSymbol w:val="."/>
   <w:listSeparator w:val=","/>
   <w15:chartTrackingRefBased/>
 </w:settings>
@@ -4723,7 +4432,7 @@
         <w:kern w:val="2"/>
         <w:sz w:val="24"/>
         <w:szCs w:val="24"/>
-        <w:lang w:val="en-DK" w:eastAsia="en-DK" w:bidi="ar-SA"/>
+        <w:lang w:bidi="ar-SA"/>
         <w14:ligatures w14:val="standardContextual"/>
       </w:rPr>
     </w:rPrDefault>
@@ -5905,7 +5614,7 @@
 </we:webextension>
 </file>
 
-<file path=customXml/item1.xml>��< ? x m l   v e r s i o n = " 1 . 0 "   e n c o d i n g = " u t f - 1 6 " ? > < N a v W o r d R e p o r t X m l P a r t   x m l n s = " u r n : m i c r o s o f t - d y n a m i c s - n a v / r e p o r t s / S t a n d a r d _ S a l e s _ D r a f t _ I n v o i c e / 1 3 0 3 / " > +<file path=customXml/item1.xml>��< ? x m l   v e r s i o n = " 1 . 0 "   e n c o d i n g = " u t f - 1 6 " ? > < N a v W o r d R e p o r t X m l P a r t   x m l n s = " u r n : m i c r o s o f t - d y n a m i c s - b u s i n e s s c e n t r a l / i n t e r n a l / e x t e n d e d / r e p o r t s / S t a n d a r d _ S a l e s _ D r a f t _ I n v o i c e / 1 3 0 3 / " >   
      < B C R e p o r t I n f o r m a t i o n >   
@@ -5971,475 +5680,477 @@
  
      < / B C R e p o r t I n f o r m a t i o n >   
-     < H e a d e r > - 
-         < B i l l e d T o _ L b l > B i l l e d T o _ L b l < / B i l l e d T o _ L b l > - 
-         < B i l l T o C o n t a c t E m a i l > B i l l T o C o n t a c t E m a i l < / B i l l T o C o n t a c t E m a i l > - 
-         < B i l l T o C o n t a c t E m a i l L b l > B i l l T o C o n t a c t E m a i l L b l < / B i l l T o C o n t a c t E m a i l L b l > - 
-         < B i l l T o C o n t a c t M o b i l e P h o n e N o > B i l l T o C o n t a c t M o b i l e P h o n e N o < / B i l l T o C o n t a c t M o b i l e P h o n e N o > - 
-         < B i l l T o C o n t a c t M o b i l e P h o n e N o L b l > B i l l T o C o n t a c t M o b i l e P h o n e N o L b l < / B i l l T o C o n t a c t M o b i l e P h o n e N o L b l > - 
-         < B i l l T o C o n t a c t P h o n e N o > B i l l T o C o n t a c t P h o n e N o < / B i l l T o C o n t a c t P h o n e N o > - 
-         < B i l l T o C o n t a c t P h o n e N o L b l > B i l l T o C o n t a c t P h o n e N o L b l < / B i l l T o C o n t a c t P h o n e N o L b l > - 
-         < B i l l t o C u s t o m e r N o _ L b l > B i l l t o C u s t o m e r N o _ L b l < / B i l l t o C u s t o m e r N o _ L b l > - 
-         < B i l l t o C u s t u m e r N o > B i l l t o C u s t u m e r N o < / B i l l t o C u s t u m e r N o > - 
-         < C h e c k s P a y a b l e _ L b l > C h e c k s P a y a b l e _ L b l < / C h e c k s P a y a b l e _ L b l > - 
-         < C o m p a n y A d d r e s s 1 > C o m p a n y A d d r e s s 1 < / C o m p a n y A d d r e s s 1 > - 
-         < C o m p a n y A d d r e s s 2 > C o m p a n y A d d r e s s 2 < / C o m p a n y A d d r e s s 2 > - 
-         < C o m p a n y A d d r e s s 3 > C o m p a n y A d d r e s s 3 < / C o m p a n y A d d r e s s 3 > - 
-         < C o m p a n y A d d r e s s 4 > C o m p a n y A d d r e s s 4 < / C o m p a n y A d d r e s s 4 > - 
-         < C o m p a n y A d d r e s s 5 > C o m p a n y A d d r e s s 5 < / C o m p a n y A d d r e s s 5 > - 
-         < C o m p a n y A d d r e s s 6 > C o m p a n y A d d r e s s 6 < / C o m p a n y A d d r e s s 6 > - 
-         < C o m p a n y A d d r e s s 7 > C o m p a n y A d d r e s s 7 < / C o m p a n y A d d r e s s 7 > - 
-         < C o m p a n y A d d r e s s 8 > C o m p a n y A d d r e s s 8 < / C o m p a n y A d d r e s s 8 > - 
-         < C o m p a n y B a n k A c c o u n t N o > C o m p a n y B a n k A c c o u n t N o < / C o m p a n y B a n k A c c o u n t N o > - 
-         < C o m p a n y B a n k A c c o u n t N o _ L b l > C o m p a n y B a n k A c c o u n t N o _ L b l < / C o m p a n y B a n k A c c o u n t N o _ L b l > - 
-         < C o m p a n y B a n k B r a n c h N o > C o m p a n y B a n k B r a n c h N o < / C o m p a n y B a n k B r a n c h N o > - 
-         < C o m p a n y B a n k B r a n c h N o _ L b l > C o m p a n y B a n k B r a n c h N o _ L b l < / C o m p a n y B a n k B r a n c h N o _ L b l > - 
-         < C o m p a n y B a n k N a m e > C o m p a n y B a n k N a m e < / C o m p a n y B a n k N a m e > - 
-         < C o m p a n y B a n k N a m e _ L b l > C o m p a n y B a n k N a m e _ L b l < / C o m p a n y B a n k N a m e _ L b l > - 
-         < C o m p a n y C u s t o m G i r o > C o m p a n y C u s t o m G i r o < / C o m p a n y C u s t o m G i r o > - 
-         < C o m p a n y C u s t o m G i r o _ L b l > C o m p a n y C u s t o m G i r o _ L b l < / C o m p a n y C u s t o m G i r o _ L b l > - 
-         < C o m p a n y E M a i l > C o m p a n y E M a i l < / C o m p a n y E M a i l > - 
-         < C o m p a n y G i r o N o > C o m p a n y G i r o N o < / C o m p a n y G i r o N o > - 
-         < C o m p a n y G i r o N o _ L b l > C o m p a n y G i r o N o _ L b l < / C o m p a n y G i r o N o _ L b l > - 
-         < C o m p a n y H o m e P a g e > C o m p a n y H o m e P a g e < / C o m p a n y H o m e P a g e > - 
-         < C o m p a n y I B A N > C o m p a n y I B A N < / C o m p a n y I B A N > - 
-         < C o m p a n y I B A N _ L b l > C o m p a n y I B A N _ L b l < / C o m p a n y I B A N _ L b l > - 
-         < C o m p a n y L e g a l O f f i c e > C o m p a n y L e g a l O f f i c e < / C o m p a n y L e g a l O f f i c e > - 
-         < C o m p a n y L e g a l O f f i c e _ L b l > C o m p a n y L e g a l O f f i c e _ L b l < / C o m p a n y L e g a l O f f i c e _ L b l > - 
-         < C o m p a n y L e g a l S t a t e m e n t > C o m p a n y L e g a l S t a t e m e n t < / C o m p a n y L e g a l S t a t e m e n t > - 
-         < C o m p a n y L o g o P o s i t i o n > C o m p a n y L o g o P o s i t i o n < / C o m p a n y L o g o P o s i t i o n > - 
-         < C o m p a n y P h o n e N o > C o m p a n y P h o n e N o < / C o m p a n y P h o n e N o > - 
-         < C o m p a n y P h o n e N o _ L b l > C o m p a n y P h o n e N o _ L b l < / C o m p a n y P h o n e N o _ L b l > - 
-         < C o m p a n y P i c t u r e / > - 
-         < C o m p a n y R e g i s t r a t i o n N u m b e r > C o m p a n y R e g i s t r a t i o n N u m b e r < / C o m p a n y R e g i s t r a t i o n N u m b e r > - 
-         < C o m p a n y R e g i s t r a t i o n N u m b e r _ L b l > C o m p a n y R e g i s t r a t i o n N u m b e r _ L b l < / C o m p a n y R e g i s t r a t i o n N u m b e r _ L b l > - 
-         < C o m p a n y S W I F T > C o m p a n y S W I F T < / C o m p a n y S W I F T > - 
-         < C o m p a n y S W I F T _ L b l > C o m p a n y S W I F T _ L b l < / C o m p a n y S W I F T _ L b l > - 
-         < C o m p a n y V A T R e g i s t r a t i o n N o > C o m p a n y V A T R e g i s t r a t i o n N o < / C o m p a n y V A T R e g i s t r a t i o n N o > - 
-         < C o m p a n y V A T R e g i s t r a t i o n N o _ L b l > C o m p a n y V A T R e g i s t r a t i o n N o _ L b l < / C o m p a n y V A T R e g i s t r a t i o n N o _ L b l > - 
-         < C o m p a n y V A T R e g N o > C o m p a n y V A T R e g N o < / C o m p a n y V A T R e g N o > - 
-         < C o m p a n y V A T R e g N o _ L b l > C o m p a n y V A T R e g N o _ L b l < / C o m p a n y V A T R e g N o _ L b l > - 
-         < C o n t a c t _ L b l > C o n t a c t _ L b l < / C o n t a c t _ L b l > - 
-         < C o p y _ L b l > C o p y _ L b l < / C o p y _ L b l > - 
-         < C u s t o m e r A d d r e s s 1 > C u s t o m e r A d d r e s s 1 < / C u s t o m e r A d d r e s s 1 > - 
-         < C u s t o m e r A d d r e s s 2 > C u s t o m e r A d d r e s s 2 < / C u s t o m e r A d d r e s s 2 > - 
-         < C u s t o m e r A d d r e s s 3 > C u s t o m e r A d d r e s s 3 < / C u s t o m e r A d d r e s s 3 > - 
-         < C u s t o m e r A d d r e s s 4 > C u s t o m e r A d d r e s s 4 < / C u s t o m e r A d d r e s s 4 > - 
-         < C u s t o m e r A d d r e s s 5 > C u s t o m e r A d d r e s s 5 < / C u s t o m e r A d d r e s s 5 > - 
-         < C u s t o m e r A d d r e s s 6 > C u s t o m e r A d d r e s s 6 < / C u s t o m e r A d d r e s s 6 > - 
-         < C u s t o m e r A d d r e s s 7 > C u s t o m e r A d d r e s s 7 < / C u s t o m e r A d d r e s s 7 > - 
-         < C u s t o m e r A d d r e s s 8 > C u s t o m e r A d d r e s s 8 < / C u s t o m e r A d d r e s s 8 > - 
-         < C u s t o m e r P o s t a l B a r C o d e > C u s t o m e r P o s t a l B a r C o d e < / C u s t o m e r P o s t a l B a r C o d e > - 
-         < D o c u m e n t D a t e > D o c u m e n t D a t e < / D o c u m e n t D a t e > - 
-         < D o c u m e n t D a t e _ L b l > D o c u m e n t D a t e _ L b l < / D o c u m e n t D a t e _ L b l > - 
-         < D o c u m e n t N o > D o c u m e n t N o < / D o c u m e n t N o > - 
-         < D o c u m e n t N o _ L b l > D o c u m e n t N o _ L b l < / D o c u m e n t N o _ L b l > - 
-         < D o c u m e n t T i t l e _ L b l > D o c u m e n t T i t l e _ L b l < / D o c u m e n t T i t l e _ L b l > - 
-         < D u e D a t e > D u e D a t e < / D u e D a t e > - 
-         < D u e D a t e _ L b l > D u e D a t e _ L b l < / D u e D a t e _ L b l > - 
-         < E M a i l _ L b l > E M a i l _ L b l < / E M a i l _ L b l > - 
-         < E x c h a n g e R a t e A s T e x t > E x c h a n g e R a t e A s T e x t < / E x c h a n g e R a t e A s T e x t > - 
-         < E x t e r n a l D o c u m e n t N o > E x t e r n a l D o c u m e n t N o < / E x t e r n a l D o c u m e n t N o > - 
-         < E x t e r n a l D o c u m e n t N o _ _ L b l > E x t e r n a l D o c u m e n t N o _ _ L b l < / E x t e r n a l D o c u m e n t N o _ _ L b l > - 
-         < F r o m _ L b l > F r o m _ L b l < / F r o m _ L b l > - 
-         < H o m e P a g e _ L b l > H o m e P a g e _ L b l < / H o m e P a g e _ L b l > - 
-         < I n v o i c e D i s c o u n t A m o u n t _ L b l > I n v o i c e D i s c o u n t A m o u n t _ L b l < / I n v o i c e D i s c o u n t A m o u n t _ L b l > - 
-         < I n v o i c e D i s c o u n t B a s e A m o u n t _ L b l > I n v o i c e D i s c o u n t B a s e A m o u n t _ L b l < / I n v o i c e D i s c o u n t B a s e A m o u n t _ L b l > - 
-         < I n v o i c e N o P o s i t i o n _ L b l > I n v o i c e N o P o s i t i o n _ L b l < / I n v o i c e N o P o s i t i o n _ L b l > - 
-         < L e g a l E n t i t y T y p e > L e g a l E n t i t y T y p e < / L e g a l E n t i t y T y p e > - 
-         < L e g a l E n t i t y T y p e _ L b l > L e g a l E n t i t y T y p e _ L b l < / L e g a l E n t i t y T y p e _ L b l > - 
-         < L i n e A m o u n t A f t e r I n v o i c e D i s c o u n t _ L b l > L i n e A m o u n t A f t e r I n v o i c e D i s c o u n t _ L b l < / L i n e A m o u n t A f t e r I n v o i c e D i s c o u n t _ L b l > - 
-         < L o c a l C u r r e n c y _ L b l > L o c a l C u r r e n c y _ L b l < / L o c a l C u r r e n c y _ L b l > - 
-         < P a g e _ L b l > P a g e _ L b l < / P a g e _ L b l > - 
-         < P a y m e n t I n s t r u c t i o n s _ T x t > P a y m e n t I n s t r u c t i o n s _ T x t < / P a y m e n t I n s t r u c t i o n s _ T x t > - 
-         < P a y m e n t M e t h o d D e s c r i p t i o n > P a y m e n t M e t h o d D e s c r i p t i o n < / P a y m e n t M e t h o d D e s c r i p t i o n > - 
-         < P a y m e n t M e t h o d D e s c r i p t i o n _ L b l > P a y m e n t M e t h o d D e s c r i p t i o n _ L b l < / P a y m e n t M e t h o d D e s c r i p t i o n _ L b l > - 
-         < P a y m e n t T e r m s D e s c r i p t i o n > P a y m e n t T e r m s D e s c r i p t i o n < / P a y m e n t T e r m s D e s c r i p t i o n > - 
-         < P a y m e n t T e r m s D e s c r i p t i o n _ L b l > P a y m e n t T e r m s D e s c r i p t i o n _ L b l < / P a y m e n t T e r m s D e s c r i p t i o n _ L b l > - 
-         < P r i c e s I n c l u d i n g V A T > P r i c e s I n c l u d i n g V A T < / P r i c e s I n c l u d i n g V A T > - 
-         < P r i c e s I n c l u d i n g V A T _ L b l > P r i c e s I n c l u d i n g V A T _ L b l < / P r i c e s I n c l u d i n g V A T _ L b l > - 
-         < P r i c e s I n c l u d i n g V A T Y e s N o > P r i c e s I n c l u d i n g V A T Y e s N o < / P r i c e s I n c l u d i n g V A T Y e s N o > - 
-         < Q u e s t i o n s _ L b l > Q u e s t i o n s _ L b l < / Q u e s t i o n s _ L b l > - 
-         < S a l e s I n v o i c e L i n e D i s c o u n t _ L b l > S a l e s I n v o i c e L i n e D i s c o u n t _ L b l < / S a l e s I n v o i c e L i n e D i s c o u n t _ L b l > - 
-         < S a l e s P e r s o n _ L b l > S a l e s P e r s o n _ L b l < / S a l e s P e r s o n _ L b l > - 
-         < S a l e s P e r s o n B l a n k _ L b l > S a l e s P e r s o n B l a n k _ L b l < / S a l e s P e r s o n B l a n k _ L b l > - 
-         < S a l e s P e r s o n N a m e > S a l e s P e r s o n N a m e < / S a l e s P e r s o n N a m e > - 
-         < S e l l T o C o n t a c t E m a i l > S e l l T o C o n t a c t E m a i l < / S e l l T o C o n t a c t E m a i l > - 
-         < S e l l T o C o n t a c t E m a i l L b l > S e l l T o C o n t a c t E m a i l L b l < / S e l l T o C o n t a c t E m a i l L b l > - 
-         < S e l l T o C o n t a c t M o b i l e P h o n e N o > S e l l T o C o n t a c t M o b i l e P h o n e N o < / S e l l T o C o n t a c t M o b i l e P h o n e N o > - 
-         < S e l l T o C o n t a c t M o b i l e P h o n e N o L b l > S e l l T o C o n t a c t M o b i l e P h o n e N o L b l < / S e l l T o C o n t a c t M o b i l e P h o n e N o L b l > - 
-         < S e l l T o C o n t a c t P h o n e N o > S e l l T o C o n t a c t P h o n e N o < / S e l l T o C o n t a c t P h o n e N o > - 
-         < S e l l T o C o n t a c t P h o n e N o L b l > S e l l T o C o n t a c t P h o n e N o L b l < / S e l l T o C o n t a c t P h o n e N o L b l > - 
-         < S e l l t o C u s t o m e r N o > S e l l t o C u s t o m e r N o < / S e l l t o C u s t o m e r N o > - 
-         < S e l l t o C u s t o m e r N o _ L b l > S e l l t o C u s t o m e r N o _ L b l < / S e l l t o C u s t o m e r N o _ L b l > - 
-         < S h i p m e n t _ L b l > S h i p m e n t _ L b l < / S h i p m e n t _ L b l > - 
-         < S h i p m e n t M e t h o d D e s c r i p t i o n > S h i p m e n t M e t h o d D e s c r i p t i o n < / S h i p m e n t M e t h o d D e s c r i p t i o n > - 
-         < S h i p m e n t M e t h o d D e s c r i p t i o n _ L b l > S h i p m e n t M e t h o d D e s c r i p t i o n _ L b l < / S h i p m e n t M e t h o d D e s c r i p t i o n _ L b l > - 
-         < S h i p T o A d d r e s s _ L b l > S h i p T o A d d r e s s _ L b l < / S h i p T o A d d r e s s _ L b l > - 
-         < S h i p T o A d d r e s s 1 > S h i p T o A d d r e s s 1 < / S h i p T o A d d r e s s 1 > - 
-         < S h i p T o A d d r e s s 2 > S h i p T o A d d r e s s 2 < / S h i p T o A d d r e s s 2 > - 
-         < S h i p T o A d d r e s s 3 > S h i p T o A d d r e s s 3 < / S h i p T o A d d r e s s 3 > - 
-         < S h i p T o A d d r e s s 4 > S h i p T o A d d r e s s 4 < / S h i p T o A d d r e s s 4 > - 
-         < S h i p T o A d d r e s s 5 > S h i p T o A d d r e s s 5 < / S h i p T o A d d r e s s 5 > - 
-         < S h i p T o A d d r e s s 6 > S h i p T o A d d r e s s 6 < / S h i p T o A d d r e s s 6 > - 
-         < S h i p T o A d d r e s s 7 > S h i p T o A d d r e s s 7 < / S h i p T o A d d r e s s 7 > - 
-         < S h i p T o A d d r e s s 8 > S h i p T o A d d r e s s 8 < / S h i p T o A d d r e s s 8 > - 
-         < S h i p T o P h o n e N o > S h i p T o P h o n e N o < / S h i p T o P h o n e N o > - 
-         < S h o w S h i p p i n g A d d r e s s > S h o w S h i p p i n g A d d r e s s < / S h o w S h i p p i n g A d d r e s s > - 
-         < S h o w W o r k D e s c r i p t i o n > S h o w W o r k D e s c r i p t i o n < / S h o w W o r k D e s c r i p t i o n > - 
-         < S u b t o t a l _ L b l > S u b t o t a l _ L b l < / S u b t o t a l _ L b l > - 
-         < T h a n k s _ L b l > T h a n k s _ L b l < / T h a n k s _ L b l > - 
-         < T o t a l _ L b l > T o t a l _ L b l < / T o t a l _ L b l > - 
-         < V A T A m o u n t _ L b l > V A T A m o u n t _ L b l < / V A T A m o u n t _ L b l > - 
-         < V A T A m o u n t S p e c i f i c a t i o n _ L b l > V A T A m o u n t S p e c i f i c a t i o n _ L b l < / V A T A m o u n t S p e c i f i c a t i o n _ L b l > - 
-         < V A T B a s e _ L b l > V A T B a s e _ L b l < / V A T B a s e _ L b l > - 
-         < V A T C l a u s e _ L b l > V A T C l a u s e _ L b l < / V A T C l a u s e _ L b l > - 
-         < V A T C l a u s e s _ L b l > V A T C l a u s e s _ L b l < / V A T C l a u s e s _ L b l > - 
-         < V A T I d e n t i f i e r _ L b l > V A T I d e n t i f i e r _ L b l < / V A T I d e n t i f i e r _ L b l > - 
-         < V A T P e r c e n t a g e _ L b l > V A T P e r c e n t a g e _ L b l < / V A T P e r c e n t a g e _ L b l > - 
-         < V A T R e g i s t r a t i o n N o > V A T R e g i s t r a t i o n N o < / V A T R e g i s t r a t i o n N o > - 
-         < V A T R e g i s t r a t i o n N o _ L b l > V A T R e g i s t r a t i o n N o _ L b l < / V A T R e g i s t r a t i o n N o _ L b l > - 
-         < Y o u r D o c u m e n t T i t l e _ L b l > Y o u r D o c u m e n t T i t l e _ L b l < / Y o u r D o c u m e n t T i t l e _ L b l > - 
-         < Y o u r R e f e r e n c e > Y o u r R e f e r e n c e < / Y o u r R e f e r e n c e > - 
-         < Y o u r R e f e r e n c e _ _ L b l > Y o u r R e f e r e n c e _ _ L b l < / Y o u r R e f e r e n c e _ _ L b l > - 
-         < L i n e > - 
-             < A m o u n t E x c l u d i n g V A T _ L i n e > A m o u n t E x c l u d i n g V A T _ L i n e < / A m o u n t E x c l u d i n g V A T _ L i n e > - 
-             < A m o u n t E x c l u d i n g V A T _ L i n e _ L b l > A m o u n t E x c l u d i n g V A T _ L i n e _ L b l < / A m o u n t E x c l u d i n g V A T _ L i n e _ L b l > - 
-             < A m o u n t I n c l u d i n g V A T _ L i n e > A m o u n t I n c l u d i n g V A T _ L i n e < / A m o u n t I n c l u d i n g V A T _ L i n e > - 
-             < A m o u n t I n c l u d i n g V A T _ L i n e _ L b l > A m o u n t I n c l u d i n g V A T _ L i n e _ L b l < / A m o u n t I n c l u d i n g V A T _ L i n e _ L b l > - 
-             < D e s c r i p t i o n _ L i n e > D e s c r i p t i o n _ L i n e < / D e s c r i p t i o n _ L i n e > - 
-             < D e s c r i p t i o n _ L i n e _ L b l > D e s c r i p t i o n _ L i n e _ L b l < / D e s c r i p t i o n _ L i n e _ L b l > - 
-             < I t e m N o _ L i n e > I t e m N o _ L i n e < / I t e m N o _ L i n e > - 
-             < I t e m N o _ L i n e _ L b l > I t e m N o _ L i n e _ L b l < / I t e m N o _ L i n e _ L b l > - 
-             < I t e m R e f e r e n c e N o _ L i n e > I t e m R e f e r e n c e N o _ L i n e < / I t e m R e f e r e n c e N o _ L i n e > - 
-             < I t e m R e f e r e n c e N o _ L i n e _ L b l > I t e m R e f e r e n c e N o _ L i n e _ L b l < / I t e m R e f e r e n c e N o _ L i n e _ L b l > - 
-             < L i n e A m o u n t _ L i n e > L i n e A m o u n t _ L i n e < / L i n e A m o u n t _ L i n e > - 
-             < L i n e A m o u n t _ L i n e _ L b l > L i n e A m o u n t _ L i n e _ L b l < / L i n e A m o u n t _ L i n e _ L b l > - 
-             < L i n e D i s c o u n t P e r c e n t _ L i n e > L i n e D i s c o u n t P e r c e n t _ L i n e < / L i n e D i s c o u n t P e r c e n t _ L i n e > - 
-             < L i n e D i s c o u n t P e r c e n t T e x t _ L i n e > L i n e D i s c o u n t P e r c e n t T e x t _ L i n e < / L i n e D i s c o u n t P e r c e n t T e x t _ L i n e > - 
-             < L i n e N o _ L i n e > L i n e N o _ L i n e < / L i n e N o _ L i n e > - 
-             < P r i c e _ L b l > P r i c e _ L b l < / P r i c e _ L b l > - 
-             < P r i c e P e r _ L b l > P r i c e P e r _ L b l < / P r i c e P e r _ L b l > - 
-             < Q t y _ L b l > Q t y _ L b l < / Q t y _ L b l > - 
-             < Q u a n t i t y _ L i n e > Q u a n t i t y _ L i n e < / Q u a n t i t y _ L i n e > - 
-             < Q u a n t i t y _ L i n e _ L b l > Q u a n t i t y _ L i n e _ L b l < / Q u a n t i t y _ L i n e _ L b l > - 
-             < S h i p m e n t D a t e _ L b l > S h i p m e n t D a t e _ L b l < / S h i p m e n t D a t e _ L b l > - 
-             < S h i p m e n t D a t e _ L i n e > S h i p m e n t D a t e _ L i n e < / S h i p m e n t D a t e _ L i n e > - 
-             < T r a n s H e a d e r A m o u n t > T r a n s H e a d e r A m o u n t < / T r a n s H e a d e r A m o u n t > - 
-             < T y p e _ L i n e > T y p e _ L i n e < / T y p e _ L i n e > - 
-             < U n i t _ L b l > U n i t _ L b l < / U n i t _ L b l > - 
-             < U n i t O f M e a s u r e > U n i t O f M e a s u r e < / U n i t O f M e a s u r e > - 
-             < U n i t O f M e a s u r e _ L b l > U n i t O f M e a s u r e _ L b l < / U n i t O f M e a s u r e _ L b l > - 
-             < U n i t P r i c e > U n i t P r i c e < / U n i t P r i c e > - 
-             < U n i t P r i c e _ L b l > U n i t P r i c e _ L b l < / U n i t P r i c e _ L b l > - 
-             < V A T I d e n t i f i e r _ L i n e > V A T I d e n t i f i e r _ L i n e < / V A T I d e n t i f i e r _ L i n e > - 
-             < V A T I d e n t i f i e r _ L i n e _ L b l > V A T I d e n t i f i e r _ L i n e _ L b l < / V A T I d e n t i f i e r _ L i n e _ L b l > - 
-             < V A T P c t _ L i n e > V A T P c t _ L i n e < / V A T P c t _ L i n e > - 
-             < V A T P c t _ L i n e _ L b l > V A T P c t _ L i n e _ L b l < / V A T P c t _ L i n e _ L b l > +     < T o o l t i p s / > + 
+     < H e a d e r   E l e m e n t T y p e = " D a t a I t e m "   E l e m e n t I d = " 1 2 4 0 3 7 3 8 8 6 " > + 
+         < B i l l e d T o _ L b l   E l e m e n t T y p e = " C o l u m n "   E l e m e n t I d = " 1 7 4 5 4 4 9 0 7 9 "   D a t a T y p e = " T e x t C o n s t " > B i l l e d T o _ L b l < / B i l l e d T o _ L b l > + 
+         < B i l l T o C o n t a c t E m a i l   E l e m e n t T y p e = " C o l u m n "   E l e m e n t I d = " 3 3 5 8 2 7 8 9 5 "   D a t a T y p e = " T e x t " > B i l l T o C o n t a c t E m a i l < / B i l l T o C o n t a c t E m a i l > + 
+         < B i l l T o C o n t a c t E m a i l L b l   E l e m e n t T y p e = " C o l u m n "   E l e m e n t I d = " 2 9 6 4 7 8 3 6 5 "   D a t a T y p e = " T e x t C o n s t " > B i l l T o C o n t a c t E m a i l L b l < / B i l l T o C o n t a c t E m a i l L b l > + 
+         < B i l l T o C o n t a c t M o b i l e P h o n e N o   E l e m e n t T y p e = " C o l u m n "   E l e m e n t I d = " 2 4 8 4 8 8 6 9 6 "   D a t a T y p e = " T e x t " > B i l l T o C o n t a c t M o b i l e P h o n e N o < / B i l l T o C o n t a c t M o b i l e P h o n e N o > + 
+         < B i l l T o C o n t a c t M o b i l e P h o n e N o L b l   E l e m e n t T y p e = " C o l u m n "   E l e m e n t I d = " 2 7 6 3 1 1 3 3 8 "   D a t a T y p e = " T e x t C o n s t " > B i l l T o C o n t a c t M o b i l e P h o n e N o L b l < / B i l l T o C o n t a c t M o b i l e P h o n e N o L b l > + 
+         < B i l l T o C o n t a c t P h o n e N o   E l e m e n t T y p e = " C o l u m n "   E l e m e n t I d = " 3 6 2 4 7 7 4 8 8 "   D a t a T y p e = " T e x t " > B i l l T o C o n t a c t P h o n e N o < / B i l l T o C o n t a c t P h o n e N o > + 
+         < B i l l T o C o n t a c t P h o n e N o L b l   E l e m e n t T y p e = " C o l u m n "   E l e m e n t I d = " 2 1 2 3 3 4 5 9 6 6 "   D a t a T y p e = " T e x t C o n s t " > B i l l T o C o n t a c t P h o n e N o L b l < / B i l l T o C o n t a c t P h o n e N o L b l > + 
+         < B i l l t o C u s t o m e r N o _ L b l   E l e m e n t T y p e = " C o l u m n "   E l e m e n t I d = " 3 6 9 3 0 7 8 1 3 "   D a t a T y p e = " S t r i n g " > B i l l t o C u s t o m e r N o _ L b l < / B i l l t o C u s t o m e r N o _ L b l > + 
+         < B i l l t o C u s t u m e r N o   E l e m e n t T y p e = " C o l u m n "   E l e m e n t I d = " 2 8 0 4 7 3 0 5 8 "   D a t a T y p e = " C o d e " > B i l l t o C u s t u m e r N o < / B i l l t o C u s t u m e r N o > + 
+         < C h e c k s P a y a b l e _ L b l   E l e m e n t T y p e = " C o l u m n "   E l e m e n t I d = " 1 0 5 3 1 5 6 0 6 5 "   D a t a T y p e = " T e x t " > C h e c k s P a y a b l e _ L b l < / C h e c k s P a y a b l e _ L b l > + 
+         < C o m p a n y A d d r e s s 1   E l e m e n t T y p e = " C o l u m n "   E l e m e n t I d = " 1 8 8 4 1 6 4 3 2 3 "   D a t a T y p e = " T e x t " > C o m p a n y A d d r e s s 1 < / C o m p a n y A d d r e s s 1 > + 
+         < C o m p a n y A d d r e s s 2   E l e m e n t T y p e = " C o l u m n "   E l e m e n t I d = " 1 2 4 6 4 6 7 7 0 6 "   D a t a T y p e = " T e x t " > C o m p a n y A d d r e s s 2 < / C o m p a n y A d d r e s s 2 > + 
+         < C o m p a n y A d d r e s s 3   E l e m e n t T y p e = " C o l u m n "   E l e m e n t I d = " 6 0 8 7 7 1 0 8 9 "   D a t a T y p e = " T e x t " > C o m p a n y A d d r e s s 3 < / C o m p a n y A d d r e s s 3 > + 
+         < C o m p a n y A d d r e s s 4   E l e m e n t T y p e = " C o l u m n "   E l e m e n t I d = " 7 7 7 6 8 0 1 1 2 "   D a t a T y p e = " T e x t " > C o m p a n y A d d r e s s 4 < / C o m p a n y A d d r e s s 4 > + 
+         < C o m p a n y A d d r e s s 5   E l e m e n t T y p e = " C o l u m n "   E l e m e n t I d = " 1 3 9 9 8 3 4 9 5 "   D a t a T y p e = " T e x t " > C o m p a n y A d d r e s s 5 < / C o m p a n y A d d r e s s 5 > + 
+         < C o m p a n y A d d r e s s 6   E l e m e n t T y p e = " C o l u m n "   E l e m e n t I d = " 4 9 7 7 1 3 1 2 2 "   D a t a T y p e = " T e x t " > C o m p a n y A d d r e s s 6 < / C o m p a n y A d d r e s s 6 > + 
+         < C o m p a n y A d d r e s s 7   E l e m e n t T y p e = " C o l u m n "   E l e m e n t I d = " 1 1 3 5 4 0 9 7 3 9 "   D a t a T y p e = " T e x t " > C o m p a n y A d d r e s s 7 < / C o m p a n y A d d r e s s 7 > + 
+         < C o m p a n y A d d r e s s 8   E l e m e n t T y p e = " C o l u m n "   E l e m e n t I d = " 1 7 1 5 2 5 5 3 0 0 "   D a t a T y p e = " T e x t " > C o m p a n y A d d r e s s 8 < / C o m p a n y A d d r e s s 8 > + 
+         < C o m p a n y B a n k A c c o u n t N o   E l e m e n t T y p e = " C o l u m n "   E l e m e n t I d = " 3 0 1 4 0 2 0 4 "   D a t a T y p e = " T e x t " > C o m p a n y B a n k A c c o u n t N o < / C o m p a n y B a n k A c c o u n t N o > + 
+         < C o m p a n y B a n k A c c o u n t N o _ L b l   E l e m e n t T y p e = " C o l u m n "   E l e m e n t I d = " 1 0 9 7 7 4 3 3 4 5 "   D a t a T y p e = " T e x t C o n s t " > C o m p a n y B a n k A c c o u n t N o _ L b l < / C o m p a n y B a n k A c c o u n t N o _ L b l > + 
+         < C o m p a n y B a n k B r a n c h N o   E l e m e n t T y p e = " C o l u m n "   E l e m e n t I d = " 7 9 3 1 3 3 0 5 7 "   D a t a T y p e = " T e x t " > C o m p a n y B a n k B r a n c h N o < / C o m p a n y B a n k B r a n c h N o > + 
+         < C o m p a n y B a n k B r a n c h N o _ L b l   E l e m e n t T y p e = " C o l u m n "   E l e m e n t I d = " 3 2 7 9 0 6 6 9 2 "   D a t a T y p e = " S t r i n g " > C o m p a n y B a n k B r a n c h N o _ L b l < / C o m p a n y B a n k B r a n c h N o _ L b l > + 
+         < C o m p a n y B a n k N a m e   E l e m e n t T y p e = " C o l u m n "   E l e m e n t I d = " 1 5 3 4 9 0 5 6 0 5 "   D a t a T y p e = " T e x t " > C o m p a n y B a n k N a m e < / C o m p a n y B a n k N a m e > + 
+         < C o m p a n y B a n k N a m e _ L b l   E l e m e n t T y p e = " C o l u m n "   E l e m e n t I d = " 1 2 0 4 3 0 7 0 1 4 "   D a t a T y p e = " T e x t C o n s t " > C o m p a n y B a n k N a m e _ L b l < / C o m p a n y B a n k N a m e _ L b l > + 
+         < C o m p a n y C u s t o m G i r o   E l e m e n t T y p e = " C o l u m n "   E l e m e n t I d = " 1 6 7 0 4 7 5 7 9 8 "   D a t a T y p e = " T e x t " > C o m p a n y C u s t o m G i r o < / C o m p a n y C u s t o m G i r o > + 
+         < C o m p a n y C u s t o m G i r o _ L b l   E l e m e n t T y p e = " C o l u m n "   E l e m e n t I d = " 8 9 1 4 3 9 6 2 5 "   D a t a T y p e = " T e x t " > C o m p a n y C u s t o m G i r o _ L b l < / C o m p a n y C u s t o m G i r o _ L b l > + 
+         < C o m p a n y E M a i l   E l e m e n t T y p e = " C o l u m n "   E l e m e n t I d = " 1 6 7 7 0 7 4 0 5 8 "   D a t a T y p e = " T e x t " > C o m p a n y E M a i l < / C o m p a n y E M a i l > + 
+         < C o m p a n y G i r o N o   E l e m e n t T y p e = " C o l u m n "   E l e m e n t I d = " 1 3 6 0 1 9 6 3 2 0 "   D a t a T y p e = " T e x t " > C o m p a n y G i r o N o < / C o m p a n y G i r o N o > + 
+         < C o m p a n y G i r o N o _ L b l   E l e m e n t T y p e = " C o l u m n "   E l e m e n t I d = " 8 6 1 6 0 2 1 1 5 "   D a t a T y p e = " T e x t C o n s t " > C o m p a n y G i r o N o _ L b l < / C o m p a n y G i r o N o _ L b l > + 
+         < C o m p a n y H o m e P a g e   E l e m e n t T y p e = " C o l u m n "   E l e m e n t I d = " 1 9 8 9 1 8 8 7 0 "   D a t a T y p e = " T e x t " > C o m p a n y H o m e P a g e < / C o m p a n y H o m e P a g e > + 
+         < C o m p a n y I B A N   E l e m e n t T y p e = " C o l u m n "   E l e m e n t I d = " 9 0 6 5 4 9 1 8 2 "   D a t a T y p e = " C o d e " > C o m p a n y I B A N < / C o m p a n y I B A N > + 
+         < C o m p a n y I B A N _ L b l   E l e m e n t T y p e = " C o l u m n "   E l e m e n t I d = " 1 2 6 7 9 5 2 2 2 7 "   D a t a T y p e = " S t r i n g " > C o m p a n y I B A N _ L b l < / C o m p a n y I B A N _ L b l > + 
+         < C o m p a n y L e g a l O f f i c e   E l e m e n t T y p e = " C o l u m n "   E l e m e n t I d = " 7 1 4 2 5 8 1 1 1 "   D a t a T y p e = " T e x t " > C o m p a n y L e g a l O f f i c e < / C o m p a n y L e g a l O f f i c e > + 
+         < C o m p a n y L e g a l O f f i c e _ L b l   E l e m e n t T y p e = " C o l u m n "   E l e m e n t I d = " 1 5 3 3 1 7 5 1 0 8 "   D a t a T y p e = " T e x t " > C o m p a n y L e g a l O f f i c e _ L b l < / C o m p a n y L e g a l O f f i c e _ L b l > + 
+         < C o m p a n y L e g a l S t a t e m e n t   E l e m e n t T y p e = " C o l u m n "   E l e m e n t I d = " 4 4 8 3 5 8 8 7 6 "   D a t a T y p e = " T e x t " > C o m p a n y L e g a l S t a t e m e n t < / C o m p a n y L e g a l S t a t e m e n t > + 
+         < C o m p a n y L o g o P o s i t i o n   E l e m e n t T y p e = " C o l u m n "   E l e m e n t I d = " 1 4 2 5 2 6 6 6 8 8 "   D a t a T y p e = " I n t e g e r " > C o m p a n y L o g o P o s i t i o n < / C o m p a n y L o g o P o s i t i o n > + 
+         < C o m p a n y P h o n e N o   E l e m e n t T y p e = " C o l u m n "   E l e m e n t I d = " 2 5 0 4 4 0 6 5 5 "   D a t a T y p e = " T e x t " > C o m p a n y P h o n e N o < / C o m p a n y P h o n e N o > + 
+         < C o m p a n y P h o n e N o _ L b l   E l e m e n t T y p e = " C o l u m n "   E l e m e n t I d = " 5 5 8 5 9 3 5 8 6 "   D a t a T y p e = " T e x t C o n s t " > C o m p a n y P h o n e N o _ L b l < / C o m p a n y P h o n e N o _ L b l > + 
+         < C o m p a n y P i c t u r e   E l e m e n t T y p e = " C o l u m n "   E l e m e n t I d = " 1 3 9 7 4 1 1 0 7 4 "   D a t a T y p e = " B L O B " / > + 
+         < C o m p a n y R e g i s t r a t i o n N u m b e r   E l e m e n t T y p e = " C o l u m n "   E l e m e n t I d = " 2 0 2 3 6 3 9 4 2 4 "   D a t a T y p e = " T e x t " > C o m p a n y R e g i s t r a t i o n N u m b e r < / C o m p a n y R e g i s t r a t i o n N u m b e r > + 
+         < C o m p a n y R e g i s t r a t i o n N u m b e r _ L b l   E l e m e n t T y p e = " C o l u m n "   E l e m e n t I d = " 1 8 3 3 1 0 6 6 5 3 "   D a t a T y p e = " T e x t " > C o m p a n y R e g i s t r a t i o n N u m b e r _ L b l < / C o m p a n y R e g i s t r a t i o n N u m b e r _ L b l > + 
+         < C o m p a n y S W I F T   E l e m e n t T y p e = " C o l u m n "   E l e m e n t I d = " 6 6 8 2 5 0 2 4 5 "   D a t a T y p e = " C o d e " > C o m p a n y S W I F T < / C o m p a n y S W I F T > + 
+         < C o m p a n y S W I F T _ L b l   E l e m e n t T y p e = " C o l u m n "   E l e m e n t I d = " 2 0 2 9 5 9 7 3 8 4 "   D a t a T y p e = " S t r i n g " > C o m p a n y S W I F T _ L b l < / C o m p a n y S W I F T _ L b l > + 
+         < C o m p a n y V A T R e g i s t r a t i o n N o   E l e m e n t T y p e = " C o l u m n "   E l e m e n t I d = " 1 9 1 4 0 1 3 6 4 9 "   D a t a T y p e = " T e x t " > C o m p a n y V A T R e g i s t r a t i o n N o < / C o m p a n y V A T R e g i s t r a t i o n N o > + 
+         < C o m p a n y V A T R e g i s t r a t i o n N o _ L b l   E l e m e n t T y p e = " C o l u m n "   E l e m e n t I d = " 9 2 4 5 0 3 1 2 4 "   D a t a T y p e = " T e x t " > C o m p a n y V A T R e g i s t r a t i o n N o _ L b l < / C o m p a n y V A T R e g i s t r a t i o n N o _ L b l > + 
+         < C o m p a n y V A T R e g N o   E l e m e n t T y p e = " C o l u m n "   E l e m e n t I d = " 1 7 1 4 3 1 9 3 6 "   D a t a T y p e = " T e x t " > C o m p a n y V A T R e g N o < / C o m p a n y V A T R e g N o > + 
+         < C o m p a n y V A T R e g N o _ L b l   E l e m e n t T y p e = " C o l u m n "   E l e m e n t I d = " 7 7 3 2 0 1 5 0 1 "   D a t a T y p e = " T e x t " > C o m p a n y V A T R e g N o _ L b l < / C o m p a n y V A T R e g N o _ L b l > + 
+         < C o n t a c t _ L b l   E l e m e n t T y p e = " C o l u m n "   E l e m e n t I d = " 1 1 5 5 0 9 4 7 5 2 "   D a t a T y p e = " T e x t " > C o n t a c t _ L b l < / C o n t a c t _ L b l > + 
+         < C o p y _ L b l   E l e m e n t T y p e = " C o l u m n "   E l e m e n t I d = " 6 0 4 7 8 2 7 8 1 "   D a t a T y p e = " T e x t C o n s t " > C o p y _ L b l < / C o p y _ L b l > + 
+         < C u s t o m e r A d d r e s s 1   E l e m e n t T y p e = " C o l u m n "   E l e m e n t I d = " 1 8 0 1 9 6 6 4 5 4 "   D a t a T y p e = " T e x t " > C u s t o m e r A d d r e s s 1 < / C u s t o m e r A d d r e s s 1 > + 
+         < C u s t o m e r A d d r e s s 2   E l e m e n t T y p e = " C o l u m n "   E l e m e n t I d = " 1 1 6 4 2 6 9 8 3 7 "   D a t a T y p e = " T e x t " > C u s t o m e r A d d r e s s 2 < / C u s t o m e r A d d r e s s 2 > + 
+         < C u s t o m e r A d d r e s s 3   E l e m e n t T y p e = " C o l u m n "   E l e m e n t I d = " 5 2 6 5 7 3 2 2 0 "   D a t a T y p e = " T e x t " > C u s t o m e r A d d r e s s 3 < / C u s t o m e r A d d r e s s 3 > + 
+         < C u s t o m e r A d d r e s s 4   E l e m e n t T y p e = " C o l u m n "   E l e m e n t I d = " 1 1 1 1 2 3 3 9 7 "   D a t a T y p e = " T e x t " > C u s t o m e r A d d r e s s 4 < / C u s t o m e r A d d r e s s 4 > + 
+         < C u s t o m e r A d d r e s s 5   E l e m e n t T y p e = " C o l u m n "   E l e m e n t I d = " 7 4 8 8 2 0 0 1 4 "   D a t a T y p e = " T e x t " > C u s t o m e r A d d r e s s 5 < / C u s t o m e r A d d r e s s 5 > + 
+         < C u s t o m e r A d d r e s s 6   E l e m e n t T y p e = " C o l u m n "   E l e m e n t I d = " 1 3 8 6 5 1 6 6 3 1 "   D a t a T y p e = " T e x t " > C u s t o m e r A d d r e s s 6 < / C u s t o m e r A d d r e s s 6 > + 
+         < C u s t o m e r A d d r e s s 7   E l e m e n t T y p e = " C o l u m n "   E l e m e n t I d = " 2 0 2 4 2 1 3 2 4 8 "   D a t a T y p e = " T e x t " > C u s t o m e r A d d r e s s 7 < / C u s t o m e r A d d r e s s 7 > + 
+         < C u s t o m e r A d d r e s s 8   E l e m e n t T y p e = " C o l u m n "   E l e m e n t I d = " 1 0 4 8 6 9 8 5 8 5 "   D a t a T y p e = " T e x t " > C u s t o m e r A d d r e s s 8 < / C u s t o m e r A d d r e s s 8 > + 
+         < C u s t o m e r P o s t a l B a r C o d e   E l e m e n t T y p e = " C o l u m n "   E l e m e n t I d = " 3 9 8 5 8 0 6 8 8 "   D a t a T y p e = " T e x t " > C u s t o m e r P o s t a l B a r C o d e < / C u s t o m e r P o s t a l B a r C o d e > + 
+         < D o c u m e n t D a t e   E l e m e n t T y p e = " C o l u m n "   E l e m e n t I d = " 5 5 2 8 7 1 9 1 4 "   D a t a T y p e = " S t r i n g " > D o c u m e n t D a t e < / D o c u m e n t D a t e > + 
+         < D o c u m e n t D a t e _ L b l   E l e m e n t T y p e = " C o l u m n "   E l e m e n t I d = " 1 0 2 6 4 9 4 8 3 "   D a t a T y p e = " S t r i n g " > D o c u m e n t D a t e _ L b l < / D o c u m e n t D a t e _ L b l > + 
+         < D o c u m e n t N o   E l e m e n t T y p e = " C o l u m n "   E l e m e n t I d = " 9 7 0 3 5 0 5 3 9 "   D a t a T y p e = " C o d e " > D o c u m e n t N o < / D o c u m e n t N o > + 
+         < D o c u m e n t N o _ L b l   E l e m e n t T y p e = " C o l u m n "   E l e m e n t I d = " 7 8 9 7 9 5 9 7 8 "   D a t a T y p e = " T e x t " > D o c u m e n t N o _ L b l < / D o c u m e n t N o _ L b l > + 
+         < D o c u m e n t T i t l e _ L b l   E l e m e n t T y p e = " C o l u m n "   E l e m e n t I d = " 8 5 8 4 2 3 9 2 9 "   D a t a T y p e = " T e x t " > D o c u m e n t T i t l e _ L b l < / D o c u m e n t T i t l e _ L b l > + 
+         < D u e D a t e   E l e m e n t T y p e = " C o l u m n "   E l e m e n t I d = " 7 4 5 1 7 0 2 0 3 "   D a t a T y p e = " S t r i n g " > D u e D a t e < / D u e D a t e > + 
+         < D u e D a t e _ L b l   E l e m e n t T y p e = " C o l u m n "   E l e m e n t I d = " 1 6 4 8 2 8 4 6 4 8 "   D a t a T y p e = " S t r i n g " > D u e D a t e _ L b l < / D u e D a t e _ L b l > + 
+         < E M a i l _ L b l   E l e m e n t T y p e = " C o l u m n "   E l e m e n t I d = " 1 4 3 8 8 6 8 0 1 2 "   D a t a T y p e = " T e x t C o n s t " > E M a i l _ L b l < / E M a i l _ L b l > + 
+         < E x c h a n g e R a t e A s T e x t   E l e m e n t T y p e = " C o l u m n "   E l e m e n t I d = " 5 9 2 9 5 5 8 4 5 "   D a t a T y p e = " T e x t " > E x c h a n g e R a t e A s T e x t < / E x c h a n g e R a t e A s T e x t > + 
+         < E x t e r n a l D o c u m e n t N o   E l e m e n t T y p e = " C o l u m n "   E l e m e n t I d = " 7 3 3 9 5 3 9 6 6 "   D a t a T y p e = " C o d e " > E x t e r n a l D o c u m e n t N o < / E x t e r n a l D o c u m e n t N o > + 
+         < E x t e r n a l D o c u m e n t N o _ _ L b l   E l e m e n t T y p e = " C o l u m n "   E l e m e n t I d = " 2 2 3 4 3 3 3 2 "   D a t a T y p e = " S t r i n g " > E x t e r n a l D o c u m e n t N o _ _ L b l < / E x t e r n a l D o c u m e n t N o _ _ L b l > + 
+         < F r o m _ L b l   E l e m e n t T y p e = " C o l u m n "   E l e m e n t I d = " 4 8 5 4 2 6 1 3 8 "   D a t a T y p e = " T e x t C o n s t " > F r o m _ L b l < / F r o m _ L b l > + 
+         < H o m e P a g e _ L b l   E l e m e n t T y p e = " C o l u m n "   E l e m e n t I d = " 1 4 3 3 5 9 2 3 0 0 "   D a t a T y p e = " T e x t C o n s t " > H o m e P a g e _ L b l < / H o m e P a g e _ L b l > + 
+         < I n v o i c e D i s c o u n t A m o u n t _ L b l   E l e m e n t T y p e = " C o l u m n "   E l e m e n t I d = " 1 5 9 3 0 1 2 7 3 6 "   D a t a T y p e = " T e x t C o n s t " > I n v o i c e D i s c o u n t A m o u n t _ L b l < / I n v o i c e D i s c o u n t A m o u n t _ L b l > + 
+         < I n v o i c e D i s c o u n t B a s e A m o u n t _ L b l   E l e m e n t T y p e = " C o l u m n "   E l e m e n t I d = " 2 0 2 9 2 6 6 8 7 5 "   D a t a T y p e = " T e x t C o n s t " > I n v o i c e D i s c o u n t B a s e A m o u n t _ L b l < / I n v o i c e D i s c o u n t B a s e A m o u n t _ L b l > + 
+         < I n v o i c e N o P o s i t i o n _ L b l   E l e m e n t T y p e = " C o l u m n "   E l e m e n t I d = " 1 4 5 8 4 6 7 4 4 1 "   D a t a T y p e = " T e x t " > I n v o i c e N o P o s i t i o n _ L b l < / I n v o i c e N o P o s i t i o n _ L b l > + 
+         < L e g a l E n t i t y T y p e   E l e m e n t T y p e = " C o l u m n "   E l e m e n t I d = " 2 0 5 1 8 7 3 5 6 3 "   D a t a T y p e = " T e x t " > L e g a l E n t i t y T y p e < / L e g a l E n t i t y T y p e > + 
+         < L e g a l E n t i t y T y p e _ L b l   E l e m e n t T y p e = " C o l u m n "   E l e m e n t I d = " 2 0 8 0 2 2 4 7 9 2 "   D a t a T y p e = " T e x t " > L e g a l E n t i t y T y p e _ L b l < / L e g a l E n t i t y T y p e _ L b l > + 
+         < L i n e A m o u n t A f t e r I n v o i c e D i s c o u n t _ L b l   E l e m e n t T y p e = " C o l u m n "   E l e m e n t I d = " 6 7 3 7 2 1 0 9 4 "   D a t a T y p e = " T e x t C o n s t " > L i n e A m o u n t A f t e r I n v o i c e D i s c o u n t _ L b l < / L i n e A m o u n t A f t e r I n v o i c e D i s c o u n t _ L b l > + 
+         < L o c a l C u r r e n c y _ L b l   E l e m e n t T y p e = " C o l u m n "   E l e m e n t I d = " 1 5 5 9 6 9 3 4 2 2 "   D a t a T y p e = " T e x t C o n s t " > L o c a l C u r r e n c y _ L b l < / L o c a l C u r r e n c y _ L b l > + 
+         < P a g e _ L b l   E l e m e n t T y p e = " C o l u m n "   E l e m e n t I d = " 6 8 0 6 4 8 0 9 1 "   D a t a T y p e = " T e x t C o n s t " > P a g e _ L b l < / P a g e _ L b l > + 
+         < P a y m e n t I n s t r u c t i o n s _ T x t   E l e m e n t T y p e = " C o l u m n "   E l e m e n t I d = " 1 8 7 2 0 8 8 3 "   D a t a T y p e = " T e x t " > P a y m e n t I n s t r u c t i o n s _ T x t < / P a y m e n t I n s t r u c t i o n s _ T x t > + 
+         < P a y m e n t M e t h o d D e s c r i p t i o n   E l e m e n t T y p e = " C o l u m n "   E l e m e n t I d = " 5 8 5 7 5 7 9 7 4 "   D a t a T y p e = " T e x t " > P a y m e n t M e t h o d D e s c r i p t i o n < / P a y m e n t M e t h o d D e s c r i p t i o n > + 
+         < P a y m e n t M e t h o d D e s c r i p t i o n _ L b l   E l e m e n t T y p e = " C o l u m n "   E l e m e n t I d = " 7 9 7 1 1 7 3 2 3 "   D a t a T y p e = " T e x t C o n s t " > P a y m e n t M e t h o d D e s c r i p t i o n _ L b l < / P a y m e n t M e t h o d D e s c r i p t i o n _ L b l > + 
+         < P a y m e n t T e r m s D e s c r i p t i o n   E l e m e n t T y p e = " C o l u m n "   E l e m e n t I d = " 2 0 3 8 7 4 2 7 0 0 "   D a t a T y p e = " T e x t " > P a y m e n t T e r m s D e s c r i p t i o n < / P a y m e n t T e r m s D e s c r i p t i o n > + 
+         < P a y m e n t T e r m s D e s c r i p t i o n _ L b l   E l e m e n t T y p e = " C o l u m n "   E l e m e n t I d = " 1 8 7 4 4 9 4 3 2 1 "   D a t a T y p e = " T e x t C o n s t " > P a y m e n t T e r m s D e s c r i p t i o n _ L b l < / P a y m e n t T e r m s D e s c r i p t i o n _ L b l > + 
+         < P r i c e s I n c l u d i n g V A T   E l e m e n t T y p e = " C o l u m n "   E l e m e n t I d = " 5 1 8 8 1 7 1 6 7 "   D a t a T y p e = " B o o l e a n " > P r i c e s I n c l u d i n g V A T < / P r i c e s I n c l u d i n g V A T > + 
+         < P r i c e s I n c l u d i n g V A T _ L b l   E l e m e n t T y p e = " C o l u m n "   E l e m e n t I d = " 1 3 7 7 9 7 9 4 4 4 "   D a t a T y p e = " S t r i n g " > P r i c e s I n c l u d i n g V A T _ L b l < / P r i c e s I n c l u d i n g V A T _ L b l > + 
+         < P r i c e s I n c l u d i n g V A T Y e s N o   E l e m e n t T y p e = " C o l u m n "   E l e m e n t I d = " 1 4 1 1 1 4 7 5 9 9 "   D a t a T y p e = " S t r i n g " > P r i c e s I n c l u d i n g V A T Y e s N o < / P r i c e s I n c l u d i n g V A T Y e s N o > + 
+         < Q u e s t i o n s _ L b l   E l e m e n t T y p e = " C o l u m n "   E l e m e n t I d = " 2 0 7 0 8 9 0 0 1 9 "   D a t a T y p e = " T e x t C o n s t " > Q u e s t i o n s _ L b l < / Q u e s t i o n s _ L b l > + 
+         < S a l e s I n v o i c e L i n e D i s c o u n t _ L b l   E l e m e n t T y p e = " C o l u m n "   E l e m e n t I d = " 6 6 4 6 0 1 5 8 2 "   D a t a T y p e = " T e x t C o n s t " > S a l e s I n v o i c e L i n e D i s c o u n t _ L b l < / S a l e s I n v o i c e L i n e D i s c o u n t _ L b l > + 
+         < S a l e s P e r s o n _ L b l   E l e m e n t T y p e = " C o l u m n "   E l e m e n t I d = " 1 5 6 4 1 9 6 3 6 5 "   D a t a T y p e = " T e x t C o n s t " > S a l e s P e r s o n _ L b l < / S a l e s P e r s o n _ L b l > + 
+         < S a l e s P e r s o n B l a n k _ L b l   E l e m e n t T y p e = " C o l u m n "   E l e m e n t I d = " 6 5 4 6 2 4 6 0 1 "   D a t a T y p e = " T e x t " > S a l e s P e r s o n B l a n k _ L b l < / S a l e s P e r s o n B l a n k _ L b l > + 
+         < S a l e s P e r s o n N a m e   E l e m e n t T y p e = " C o l u m n "   E l e m e n t I d = " 8 7 1 4 9 2 9 8 3 "   D a t a T y p e = " T e x t " > S a l e s P e r s o n N a m e < / S a l e s P e r s o n N a m e > + 
+         < S e l l T o C o n t a c t E m a i l   E l e m e n t T y p e = " C o l u m n "   E l e m e n t I d = " 2 6 2 8 2 4 5 6 4 "   D a t a T y p e = " T e x t " > S e l l T o C o n t a c t E m a i l < / S e l l T o C o n t a c t E m a i l > + 
+         < S e l l T o C o n t a c t E m a i l L b l   E l e m e n t T y p e = " C o l u m n "   E l e m e n t I d = " 3 7 0 9 2 0 3 7 4 "   D a t a T y p e = " T e x t C o n s t " > S e l l T o C o n t a c t E m a i l L b l < / S e l l T o C o n t a c t E m a i l L b l > + 
+         < S e l l T o C o n t a c t M o b i l e P h o n e N o   E l e m e n t T y p e = " C o l u m n "   E l e m e n t I d = " 1 8 4 3 5 8 7 4 7 "   D a t a T y p e = " T e x t " > S e l l T o C o n t a c t M o b i l e P h o n e N o < / S e l l T o C o n t a c t M o b i l e P h o n e N o > + 
+         < S e l l T o C o n t a c t M o b i l e P h o n e N o L b l   E l e m e n t T y p e = " C o l u m n "   E l e m e n t I d = " 1 4 5 7 5 2 8 4 1 7 "   D a t a T y p e = " T e x t C o n s t " > S e l l T o C o n t a c t M o b i l e P h o n e N o L b l < / S e l l T o C o n t a c t M o b i l e P h o n e N o L b l > + 
+         < S e l l T o C o n t a c t P h o n e N o   E l e m e n t T y p e = " C o l u m n "   E l e m e n t I d = " 1 6 1 3 8 2 2 4 8 3 "   D a t a T y p e = " T e x t " > S e l l T o C o n t a c t P h o n e N o < / S e l l T o C o n t a c t P h o n e N o > + 
+         < S e l l T o C o n t a c t P h o n e N o L b l   E l e m e n t T y p e = " C o l u m n "   E l e m e n t I d = " 1 0 5 0 6 8 6 8 0 9 "   D a t a T y p e = " T e x t C o n s t " > S e l l T o C o n t a c t P h o n e N o L b l < / S e l l T o C o n t a c t P h o n e N o L b l > + 
+         < S e l l t o C u s t o m e r N o   E l e m e n t T y p e = " C o l u m n "   E l e m e n t I d = " 2 0 5 0 6 4 7 3 4 9 "   D a t a T y p e = " C o d e " > S e l l t o C u s t o m e r N o < / S e l l t o C u s t o m e r N o > + 
+         < S e l l t o C u s t o m e r N o _ L b l   E l e m e n t T y p e = " C o l u m n "   E l e m e n t I d = " 2 9 8 3 8 1 5 1 2 "   D a t a T y p e = " S t r i n g " > S e l l t o C u s t o m e r N o _ L b l < / S e l l t o C u s t o m e r N o _ L b l > + 
+         < S h i p m e n t _ L b l   E l e m e n t T y p e = " C o l u m n "   E l e m e n t I d = " 2 0 8 5 7 6 7 1 2 0 "   D a t a T y p e = " T e x t C o n s t " > S h i p m e n t _ L b l < / S h i p m e n t _ L b l > + 
+         < S h i p m e n t M e t h o d D e s c r i p t i o n   E l e m e n t T y p e = " C o l u m n "   E l e m e n t I d = " 2 0 5 9 4 0 3 2 6 0 "   D a t a T y p e = " T e x t " > S h i p m e n t M e t h o d D e s c r i p t i o n < / S h i p m e n t M e t h o d D e s c r i p t i o n > + 
+         < S h i p m e n t M e t h o d D e s c r i p t i o n _ L b l   E l e m e n t T y p e = " C o l u m n "   E l e m e n t I d = " 1 1 7 9 9 7 8 4 6 5 "   D a t a T y p e = " T e x t C o n s t " > S h i p m e n t M e t h o d D e s c r i p t i o n _ L b l < / S h i p m e n t M e t h o d D e s c r i p t i o n _ L b l > + 
+         < S h i p T o A d d r e s s _ L b l   E l e m e n t T y p e = " C o l u m n "   E l e m e n t I d = " 1 6 5 0 5 0 5 0 1 7 "   D a t a T y p e = " T e x t C o n s t " > S h i p T o A d d r e s s _ L b l < / S h i p T o A d d r e s s _ L b l > + 
+         < S h i p T o A d d r e s s 1   E l e m e n t T y p e = " C o l u m n "   E l e m e n t I d = " 1 3 5 7 6 7 2 8 6 1 "   D a t a T y p e = " T e x t " > S h i p T o A d d r e s s 1 < / S h i p T o A d d r e s s 1 > + 
+         < S h i p T o A d d r e s s 2   E l e m e n t T y p e = " C o l u m n "   E l e m e n t I d = " 1 0 2 4 2 0 4 5 8 4 "   D a t a T y p e = " T e x t " > S h i p T o A d d r e s s 2 < / S h i p T o A d d r e s s 2 > + 
+         < S h i p T o A d d r e s s 3   E l e m e n t T y p e = " C o l u m n "   E l e m e n t I d = " 1 6 6 1 9 0 1 2 0 1 "   D a t a T y p e = " T e x t " > S h i p T o A d d r e s s 3 < / S h i p T o A d d r e s s 3 > + 
+         < S h i p T o A d d r e s s 4   E l e m e n t T y p e = " C o l u m n "   E l e m e n t I d = " 5 5 5 4 1 6 9 9 0 "   D a t a T y p e = " T e x t " > S h i p T o A d d r e s s 4 < / S h i p T o A d d r e s s 4 > + 
+         < S h i p T o A d d r e s s 5   E l e m e n t T y p e = " C o l u m n "   E l e m e n t I d = " 1 1 9 3 1 1 3 6 0 7 "   D a t a T y p e = " T e x t " > S h i p T o A d d r e s s 5 < / S h i p T o A d d r e s s 5 > + 
+         < S h i p T o A d d r e s s 6   E l e m e n t T y p e = " C o l u m n "   E l e m e n t I d = " 7 1 9 9 7 6 2 4 4 "   D a t a T y p e = " T e x t " > S h i p T o A d d r e s s 6 < / S h i p T o A d d r e s s 6 > + 
+         < S h i p T o A d d r e s s 7   E l e m e n t T y p e = " C o l u m n "   E l e m e n t I d = " 8 2 2 7 9 6 2 7 "   D a t a T y p e = " T e x t " > S h i p T o A d d r e s s 7 < / S h i p T o A d d r e s s 7 > + 
+         < S h i p T o A d d r e s s 8   E l e m e n t T y p e = " C o l u m n "   E l e m e n t I d = " 1 4 9 2 9 9 2 1 7 8 "   D a t a T y p e = " T e x t " > S h i p T o A d d r e s s 8 < / S h i p T o A d d r e s s 8 > + 
+         < S h i p T o P h o n e N o   E l e m e n t T y p e = " C o l u m n "   E l e m e n t I d = " 3 6 9 7 0 2 2 5 5 "   D a t a T y p e = " T e x t " > S h i p T o P h o n e N o < / S h i p T o P h o n e N o > + 
+         < S h o w S h i p p i n g A d d r e s s   E l e m e n t T y p e = " C o l u m n "   E l e m e n t I d = " 1 1 2 0 0 7 1 2 6 6 "   D a t a T y p e = " B o o l e a n " > S h o w S h i p p i n g A d d r e s s < / S h o w S h i p p i n g A d d r e s s > + 
+         < S h o w W o r k D e s c r i p t i o n   E l e m e n t T y p e = " C o l u m n "   E l e m e n t I d = " 7 8 5 4 6 8 8 6 5 "   D a t a T y p e = " B o o l e a n " > S h o w W o r k D e s c r i p t i o n < / S h o w W o r k D e s c r i p t i o n > + 
+         < S u b t o t a l _ L b l   E l e m e n t T y p e = " C o l u m n "   E l e m e n t I d = " 1 9 6 7 7 9 5 1 4 2 "   D a t a T y p e = " T e x t C o n s t " > S u b t o t a l _ L b l < / S u b t o t a l _ L b l > + 
+         < T h a n k s _ L b l   E l e m e n t T y p e = " C o l u m n "   E l e m e n t I d = " 2 1 0 3 3 0 5 5 2 5 "   D a t a T y p e = " T e x t C o n s t " > T h a n k s _ L b l < / T h a n k s _ L b l > + 
+         < T o t a l _ L b l   E l e m e n t T y p e = " C o l u m n "   E l e m e n t I d = " 1 2 1 0 1 0 0 8 7 8 "   D a t a T y p e = " T e x t C o n s t " > T o t a l _ L b l < / T o t a l _ L b l > + 
+         < V A T A m o u n t _ L b l   E l e m e n t T y p e = " C o l u m n "   E l e m e n t I d = " 1 0 9 4 6 5 7 2 9 "   D a t a T y p e = " T e x t C o n s t " > V A T A m o u n t _ L b l < / V A T A m o u n t _ L b l > + 
+         < V A T A m o u n t S p e c i f i c a t i o n _ L b l   E l e m e n t T y p e = " C o l u m n "   E l e m e n t I d = " 8 7 8 7 0 6 8 4 6 "   D a t a T y p e = " T e x t C o n s t " > V A T A m o u n t S p e c i f i c a t i o n _ L b l < / V A T A m o u n t S p e c i f i c a t i o n _ L b l > + 
+         < V A T B a s e _ L b l   E l e m e n t T y p e = " C o l u m n "   E l e m e n t I d = " 1 8 6 6 1 5 8 2 7 8 "   D a t a T y p e = " T e x t C o n s t " > V A T B a s e _ L b l < / V A T B a s e _ L b l > + 
+         < V A T C l a u s e _ L b l   E l e m e n t T y p e = " C o l u m n "   E l e m e n t I d = " 1 5 7 0 4 9 5 4 9 0 "   D a t a T y p e = " S t r i n g " > V A T C l a u s e _ L b l < / V A T C l a u s e _ L b l > + 
+         < V A T C l a u s e s _ L b l   E l e m e n t T y p e = " C o l u m n "   E l e m e n t I d = " 1 3 8 3 9 2 0 0 1 9 "   D a t a T y p e = " T e x t C o n s t " > V A T C l a u s e s _ L b l < / V A T C l a u s e s _ L b l > + 
+         < V A T I d e n t i f i e r _ L b l   E l e m e n t T y p e = " C o l u m n "   E l e m e n t I d = " 1 6 8 6 6 2 3 9 8 4 "   D a t a T y p e = " T e x t C o n s t " > V A T I d e n t i f i e r _ L b l < / V A T I d e n t i f i e r _ L b l > + 
+         < V A T P e r c e n t a g e _ L b l   E l e m e n t T y p e = " C o l u m n "   E l e m e n t I d = " 6 7 6 6 5 4 5 6 5 "   D a t a T y p e = " T e x t C o n s t " > V A T P e r c e n t a g e _ L b l < / V A T P e r c e n t a g e _ L b l > + 
+         < V A T R e g i s t r a t i o n N o   E l e m e n t T y p e = " C o l u m n "   E l e m e n t I d = " 1 8 8 9 1 9 5 4 0 2 "   D a t a T y p e = " T e x t " > V A T R e g i s t r a t i o n N o < / V A T R e g i s t r a t i o n N o > + 
+         < V A T R e g i s t r a t i o n N o _ L b l   E l e m e n t T y p e = " C o l u m n "   E l e m e n t I d = " 1 4 2 4 6 1 6 0 8 5 "   D a t a T y p e = " T e x t " > V A T R e g i s t r a t i o n N o _ L b l < / V A T R e g i s t r a t i o n N o _ L b l > + 
+         < Y o u r D o c u m e n t T i t l e _ L b l   E l e m e n t T y p e = " C o l u m n "   E l e m e n t I d = " 1 8 2 1 7 1 6 9 3 4 "   D a t a T y p e = " T e x t " > Y o u r D o c u m e n t T i t l e _ L b l < / Y o u r D o c u m e n t T i t l e _ L b l > + 
+         < Y o u r R e f e r e n c e   E l e m e n t T y p e = " C o l u m n "   E l e m e n t I d = " 1 1 0 3 9 9 5 1 "   D a t a T y p e = " T e x t " > Y o u r R e f e r e n c e < / Y o u r R e f e r e n c e > + 
+         < Y o u r R e f e r e n c e _ _ L b l   E l e m e n t T y p e = " C o l u m n "   E l e m e n t I d = " 1 1 2 6 2 8 0 3 7 1 "   D a t a T y p e = " S t r i n g " > Y o u r R e f e r e n c e _ _ L b l < / Y o u r R e f e r e n c e _ _ L b l > + 
+         < L i n e   E l e m e n t T y p e = " D a t a I t e m "   E l e m e n t I d = " 4 1 1 9 7 6 1 3 3 " > + 
+             < A m o u n t E x c l u d i n g V A T _ L i n e   E l e m e n t T y p e = " C o l u m n "   E l e m e n t I d = " 1 0 6 2 4 6 0 0 4 0 "   D a t a T y p e = " D e c i m a l " > A m o u n t E x c l u d i n g V A T _ L i n e < / A m o u n t E x c l u d i n g V A T _ L i n e > + 
+             < A m o u n t E x c l u d i n g V A T _ L i n e _ L b l   E l e m e n t T y p e = " C o l u m n "   E l e m e n t I d = " 2 0 0 2 8 7 4 4 7 5 "   D a t a T y p e = " S t r i n g " > A m o u n t E x c l u d i n g V A T _ L i n e _ L b l < / A m o u n t E x c l u d i n g V A T _ L i n e _ L b l > + 
+             < A m o u n t I n c l u d i n g V A T _ L i n e   E l e m e n t T y p e = " C o l u m n "   E l e m e n t I d = " 7 7 0 9 2 8 4 0 2 "   D a t a T y p e = " D e c i m a l " > A m o u n t I n c l u d i n g V A T _ L i n e < / A m o u n t I n c l u d i n g V A T _ L i n e > + 
+             < A m o u n t I n c l u d i n g V A T _ L i n e _ L b l   E l e m e n t T y p e = " C o l u m n "   E l e m e n t I d = " 9 3 0 7 4 7 3 1 3 "   D a t a T y p e = " S t r i n g " > A m o u n t I n c l u d i n g V A T _ L i n e _ L b l < / A m o u n t I n c l u d i n g V A T _ L i n e _ L b l > + 
+             < D e s c r i p t i o n _ L i n e   E l e m e n t T y p e = " C o l u m n "   E l e m e n t I d = " 1 4 0 6 8 2 2 3 1 0 "   D a t a T y p e = " T e x t " > D e s c r i p t i o n _ L i n e < / D e s c r i p t i o n _ L i n e > + 
+             < D e s c r i p t i o n _ L i n e _ L b l   E l e m e n t T y p e = " C o l u m n "   E l e m e n t I d = " 2 1 1 8 9 5 1 4 9 5 "   D a t a T y p e = " S t r i n g " > D e s c r i p t i o n _ L i n e _ L b l < / D e s c r i p t i o n _ L i n e _ L b l > + 
+             < I t e m N o _ L i n e   E l e m e n t T y p e = " C o l u m n "   E l e m e n t I d = " 1 9 1 0 2 9 6 2 8 8 "   D a t a T y p e = " C o d e " > I t e m N o _ L i n e < / I t e m N o _ L i n e > + 
+             < I t e m N o _ L i n e _ L b l   E l e m e n t T y p e = " C o l u m n "   E l e m e n t I d = " 1 3 4 0 0 7 9 6 1 3 "   D a t a T y p e = " S t r i n g " > I t e m N o _ L i n e _ L b l < / I t e m N o _ L i n e _ L b l > + 
+             < I t e m R e f e r e n c e N o _ L i n e   E l e m e n t T y p e = " C o l u m n "   E l e m e n t I d = " 9 2 7 2 3 5 7 "   D a t a T y p e = " C o d e " > I t e m R e f e r e n c e N o _ L i n e < / I t e m R e f e r e n c e N o _ L i n e > + 
+             < I t e m R e f e r e n c e N o _ L i n e _ L b l   E l e m e n t T y p e = " C o l u m n "   E l e m e n t I d = " 1 9 8 0 6 3 1 1 3 0 "   D a t a T y p e = " S t r i n g " > I t e m R e f e r e n c e N o _ L i n e _ L b l < / I t e m R e f e r e n c e N o _ L i n e _ L b l > + 
+             < L i n e A m o u n t _ L i n e   E l e m e n t T y p e = " C o l u m n "   E l e m e n t I d = " 2 6 8 9 3 7 1 6 2 "   D a t a T y p e = " T e x t " > L i n e A m o u n t _ L i n e < / L i n e A m o u n t _ L i n e > + 
+             < L i n e A m o u n t _ L i n e _ L b l   E l e m e n t T y p e = " C o l u m n "   E l e m e n t I d = " 9 9 2 9 0 1 8 4 5 "   D a t a T y p e = " S t r i n g " > L i n e A m o u n t _ L i n e _ L b l < / L i n e A m o u n t _ L i n e _ L b l > + 
+             < L i n e D i s c o u n t P e r c e n t _ L i n e   E l e m e n t T y p e = " C o l u m n "   E l e m e n t I d = " 9 0 7 8 2 7 4 3 6 "   D a t a T y p e = " D e c i m a l " > L i n e D i s c o u n t P e r c e n t _ L i n e < / L i n e D i s c o u n t P e r c e n t _ L i n e > + 
+             < L i n e D i s c o u n t P e r c e n t T e x t _ L i n e   E l e m e n t T y p e = " C o l u m n "   E l e m e n t I d = " 6 1 3 1 3 5 1 9 "   D a t a T y p e = " T e x t " > L i n e D i s c o u n t P e r c e n t T e x t _ L i n e < / L i n e D i s c o u n t P e r c e n t T e x t _ L i n e > + 
+             < L i n e N o _ L i n e   E l e m e n t T y p e = " C o l u m n "   E l e m e n t I d = " 6 9 8 9 8 5 9 7 9 "   D a t a T y p e = " I n t e g e r " > L i n e N o _ L i n e < / L i n e N o _ L i n e > + 
+             < P r i c e _ L b l   E l e m e n t T y p e = " C o l u m n "   E l e m e n t I d = " 2 1 2 6 7 6 4 9 2 5 "   D a t a T y p e = " T e x t C o n s t " > P r i c e _ L b l < / P r i c e _ L b l > + 
+             < P r i c e P e r _ L b l   E l e m e n t T y p e = " C o l u m n "   E l e m e n t I d = " 9 7 3 2 8 0 1 3 4 "   D a t a T y p e = " T e x t C o n s t " > P r i c e P e r _ L b l < / P r i c e P e r _ L b l > + 
+             < Q t y _ L b l   E l e m e n t T y p e = " C o l u m n "   E l e m e n t I d = " 2 6 3 6 7 3 7 6 4 "   D a t a T y p e = " T e x t C o n s t " > Q t y _ L b l < / Q t y _ L b l > + 
+             < Q u a n t i t y _ L i n e   E l e m e n t T y p e = " C o l u m n "   E l e m e n t I d = " 1 0 6 8 5 4 3 5 3 7 "   D a t a T y p e = " T e x t " > Q u a n t i t y _ L i n e < / Q u a n t i t y _ L i n e > + 
+             < Q u a n t i t y _ L i n e _ L b l   E l e m e n t T y p e = " C o l u m n "   E l e m e n t I d = " 2 0 3 4 5 0 6 8 0 2 "   D a t a T y p e = " S t r i n g " > Q u a n t i t y _ L i n e _ L b l < / Q u a n t i t y _ L i n e _ L b l > + 
+             < S h i p m e n t D a t e _ L b l   E l e m e n t T y p e = " C o l u m n "   E l e m e n t I d = " 6 1 4 4 0 0 3 6 4 "   D a t a T y p e = " T e x t C o n s t " > S h i p m e n t D a t e _ L b l < / S h i p m e n t D a t e _ L b l > + 
+             < S h i p m e n t D a t e _ L i n e   E l e m e n t T y p e = " C o l u m n "   E l e m e n t I d = " 1 6 7 3 3 7 5 4 1 6 "   D a t a T y p e = " S t r i n g " > S h i p m e n t D a t e _ L i n e < / S h i p m e n t D a t e _ L i n e > + 
+             < T r a n s H e a d e r A m o u n t   E l e m e n t T y p e = " C o l u m n "   E l e m e n t I d = " 2 0 2 8 3 0 6 2 7 6 "   D a t a T y p e = " D e c i m a l " > T r a n s H e a d e r A m o u n t < / T r a n s H e a d e r A m o u n t > + 
+             < T y p e _ L i n e   E l e m e n t T y p e = " C o l u m n "   E l e m e n t I d = " 2 7 2 8 0 4 9 2 4 "   D a t a T y p e = " S t r i n g " > T y p e _ L i n e < / T y p e _ L i n e > + 
+             < U n i t _ L b l   E l e m e n t T y p e = " C o l u m n "   E l e m e n t I d = " 8 1 4 3 6 4 3 1 8 "   D a t a T y p e = " T e x t C o n s t " > U n i t _ L b l < / U n i t _ L b l > + 
+             < U n i t O f M e a s u r e   E l e m e n t T y p e = " C o l u m n "   E l e m e n t I d = " 1 8 0 8 2 2 8 0 1 8 "   D a t a T y p e = " T e x t " > U n i t O f M e a s u r e < / U n i t O f M e a s u r e > + 
+             < U n i t O f M e a s u r e _ L b l   E l e m e n t T y p e = " C o l u m n "   E l e m e n t I d = " 9 8 1 9 5 1 2 4 9 "   D a t a T y p e = " S t r i n g " > U n i t O f M e a s u r e _ L b l < / U n i t O f M e a s u r e _ L b l > + 
+             < U n i t P r i c e   E l e m e n t T y p e = " C o l u m n "   E l e m e n t I d = " 1 4 7 8 2 2 1 5 2 6 "   D a t a T y p e = " T e x t " > U n i t P r i c e < / U n i t P r i c e > + 
+             < U n i t P r i c e _ L b l   E l e m e n t T y p e = " C o l u m n "   E l e m e n t I d = " 1 1 6 3 9 2 6 6 0 3 "   D a t a T y p e = " S t r i n g " > U n i t P r i c e _ L b l < / U n i t P r i c e _ L b l > + 
+             < V A T I d e n t i f i e r _ L i n e   E l e m e n t T y p e = " C o l u m n "   E l e m e n t I d = " 1 7 7 3 6 2 2 4 1 2 "   D a t a T y p e = " C o d e " > V A T I d e n t i f i e r _ L i n e < / V A T I d e n t i f i e r _ L i n e > + 
+             < V A T I d e n t i f i e r _ L i n e _ L b l   E l e m e n t T y p e = " C o l u m n "   E l e m e n t I d = " 5 3 3 7 8 2 7 0 3 "   D a t a T y p e = " S t r i n g " > V A T I d e n t i f i e r _ L i n e _ L b l < / V A T I d e n t i f i e r _ L i n e _ L b l > + 
+             < V A T P c t _ L i n e   E l e m e n t T y p e = " C o l u m n "   E l e m e n t I d = " 1 9 7 4 0 0 1 9 4 4 "   D a t a T y p e = " T e x t " > V A T P c t _ L i n e < / V A T P c t _ L i n e > + 
+             < V A T P c t _ L i n e _ L b l   E l e m e n t T y p e = " C o l u m n "   E l e m e n t I d = " 1 2 0 7 5 2 9 9 1 5 "   D a t a T y p e = " S t r i n g " > V A T P c t _ L i n e _ L b l < / V A T P c t _ L i n e _ L b l >   
          < / L i n e >   
-         < W o r k D e s c r i p t i o n L i n e s > - 
-             < W o r k D e s c r i p t i o n L i n e > W o r k D e s c r i p t i o n L i n e < / W o r k D e s c r i p t i o n L i n e > - 
-             < W o r k D e s c r i p t i o n L i n e N u m b e r > W o r k D e s c r i p t i o n L i n e N u m b e r < / W o r k D e s c r i p t i o n L i n e N u m b e r > +         < W o r k D e s c r i p t i o n L i n e s   E l e m e n t T y p e = " D a t a I t e m "   E l e m e n t I d = " 2 7 6 8 1 9 4 4 7 " > + 
+             < W o r k D e s c r i p t i o n L i n e   E l e m e n t T y p e = " C o l u m n "   E l e m e n t I d = " 1 9 4 7 6 2 1 6 7 6 "   D a t a T y p e = " T e x t " > W o r k D e s c r i p t i o n L i n e < / W o r k D e s c r i p t i o n L i n e > + 
+             < W o r k D e s c r i p t i o n L i n e N u m b e r   E l e m e n t T y p e = " C o l u m n "   E l e m e n t I d = " 7 9 7 3 0 7 2 2 3 "   D a t a T y p e = " I n t e g e r " > W o r k D e s c r i p t i o n L i n e N u m b e r < / W o r k D e s c r i p t i o n L i n e N u m b e r >   
          < / W o r k D e s c r i p t i o n L i n e s >   
-         < V A T A m o u n t L i n e > - 
-             < I n v o i c e D i s c o u n t A m o u n t _ V A T A m o u n t L i n e > I n v o i c e D i s c o u n t A m o u n t _ V A T A m o u n t L i n e < / I n v o i c e D i s c o u n t A m o u n t _ V A T A m o u n t L i n e > - 
-             < I n v o i c e D i s c o u n t A m o u n t _ V A T A m o u n t L i n e _ L b l > I n v o i c e D i s c o u n t A m o u n t _ V A T A m o u n t L i n e _ L b l < / I n v o i c e D i s c o u n t A m o u n t _ V A T A m o u n t L i n e _ L b l > - 
-             < I n v o i c e D i s c o u n t B a s e A m o u n t _ V A T A m o u n t L i n e > I n v o i c e D i s c o u n t B a s e A m o u n t _ V A T A m o u n t L i n e < / I n v o i c e D i s c o u n t B a s e A m o u n t _ V A T A m o u n t L i n e > - 
-             < I n v o i c e D i s c o u n t B a s e A m o u n t _ V A T A m o u n t L i n e _ L b l > I n v o i c e D i s c o u n t B a s e A m o u n t _ V A T A m o u n t L i n e _ L b l < / I n v o i c e D i s c o u n t B a s e A m o u n t _ V A T A m o u n t L i n e _ L b l > - 
-             < L i n e A m o u n t _ V a t A m o u n t L i n e > L i n e A m o u n t _ V a t A m o u n t L i n e < / L i n e A m o u n t _ V a t A m o u n t L i n e > - 
-             < L i n e A m o u n t _ V a t A m o u n t L i n e _ L b l > L i n e A m o u n t _ V a t A m o u n t L i n e _ L b l < / L i n e A m o u n t _ V a t A m o u n t L i n e _ L b l > - 
-             < N o O f V A T I d e n t i f i e r s > N o O f V A T I d e n t i f i e r s < / N o O f V A T I d e n t i f i e r s > - 
-             < V A T A m o u n t _ V a t A m o u n t L i n e > V A T A m o u n t _ V a t A m o u n t L i n e < / V A T A m o u n t _ V a t A m o u n t L i n e > - 
-             < V A T A m o u n t _ V a t A m o u n t L i n e _ L b l > V A T A m o u n t _ V a t A m o u n t L i n e _ L b l < / V A T A m o u n t _ V a t A m o u n t L i n e _ L b l > - 
-             < V A T A m o u n t L C Y _ V A T A m o u n t L i n e > V A T A m o u n t L C Y _ V A T A m o u n t L i n e < / V A T A m o u n t L C Y _ V A T A m o u n t L i n e > - 
-             < V A T A m o u n t L C Y _ V A T A m o u n t L i n e _ L b l > V A T A m o u n t L C Y _ V A T A m o u n t L i n e _ L b l < / V A T A m o u n t L C Y _ V A T A m o u n t L i n e _ L b l > - 
-             < V A T B a s e _ V a t A m o u n t L i n e > V A T B a s e _ V a t A m o u n t L i n e < / V A T B a s e _ V a t A m o u n t L i n e > - 
-             < V A T B a s e _ V a t A m o u n t L i n e _ L b l > V A T B a s e _ V a t A m o u n t L i n e _ L b l < / V A T B a s e _ V a t A m o u n t L i n e _ L b l > - 
-             < V A T B a s e L C Y _ V A T A m o u n t L i n e > V A T B a s e L C Y _ V A T A m o u n t L i n e < / V A T B a s e L C Y _ V A T A m o u n t L i n e > - 
-             < V A T B a s e L C Y _ V A T A m o u n t L i n e _ L b l > V A T B a s e L C Y _ V A T A m o u n t L i n e _ L b l < / V A T B a s e L C Y _ V A T A m o u n t L i n e _ L b l > - 
-             < V A T I d e n t i f i e r _ V a t A m o u n t L i n e > V A T I d e n t i f i e r _ V a t A m o u n t L i n e < / V A T I d e n t i f i e r _ V a t A m o u n t L i n e > - 
-             < V A T I d e n t i f i e r _ V a t A m o u n t L i n e _ L b l > V A T I d e n t i f i e r _ V a t A m o u n t L i n e _ L b l < / V A T I d e n t i f i e r _ V a t A m o u n t L i n e _ L b l > - 
-             < V A T P c t _ V a t A m o u n t L i n e > V A T P c t _ V a t A m o u n t L i n e < / V A T P c t _ V a t A m o u n t L i n e > - 
-             < V A T P c t _ V a t A m o u n t L i n e _ L b l > V A T P c t _ V a t A m o u n t L i n e _ L b l < / V A T P c t _ V a t A m o u n t L i n e _ L b l > +         < V A T A m o u n t L i n e   E l e m e n t T y p e = " D a t a I t e m "   E l e m e n t I d = " 8 2 7 5 3 4 3 4 8 " > + 
+             < I n v o i c e D i s c o u n t A m o u n t _ V A T A m o u n t L i n e   E l e m e n t T y p e = " C o l u m n "   E l e m e n t I d = " 8 2 4 7 3 0 1 4 1 "   D a t a T y p e = " D e c i m a l " > I n v o i c e D i s c o u n t A m o u n t _ V A T A m o u n t L i n e < / I n v o i c e D i s c o u n t A m o u n t _ V A T A m o u n t L i n e > + 
+             < I n v o i c e D i s c o u n t A m o u n t _ V A T A m o u n t L i n e _ L b l   E l e m e n t T y p e = " C o l u m n "   E l e m e n t I d = " 1 5 6 2 2 0 0 0 3 4 "   D a t a T y p e = " S t r i n g " > I n v o i c e D i s c o u n t A m o u n t _ V A T A m o u n t L i n e _ L b l < / I n v o i c e D i s c o u n t A m o u n t _ V A T A m o u n t L i n e _ L b l > + 
+             < I n v o i c e D i s c o u n t B a s e A m o u n t _ V A T A m o u n t L i n e   E l e m e n t T y p e = " C o l u m n "   E l e m e n t I d = " 2 0 4 0 3 3 2 2 6 6 "   D a t a T y p e = " D e c i m a l " > I n v o i c e D i s c o u n t B a s e A m o u n t _ V A T A m o u n t L i n e < / I n v o i c e D i s c o u n t B a s e A m o u n t _ V A T A m o u n t L i n e > + 
+             < I n v o i c e D i s c o u n t B a s e A m o u n t _ V A T A m o u n t L i n e _ L b l   E l e m e n t T y p e = " C o l u m n "   E l e m e n t I d = " 4 0 5 9 6 0 3 3 1 "   D a t a T y p e = " S t r i n g " > I n v o i c e D i s c o u n t B a s e A m o u n t _ V A T A m o u n t L i n e _ L b l < / I n v o i c e D i s c o u n t B a s e A m o u n t _ V A T A m o u n t L i n e _ L b l > + 
+             < L i n e A m o u n t _ V a t A m o u n t L i n e   E l e m e n t T y p e = " C o l u m n "   E l e m e n t I d = " 2 1 4 6 5 4 0 1 "   D a t a T y p e = " D e c i m a l " > L i n e A m o u n t _ V a t A m o u n t L i n e < / L i n e A m o u n t _ V a t A m o u n t L i n e > + 
+             < L i n e A m o u n t _ V a t A m o u n t L i n e _ L b l   E l e m e n t T y p e = " C o l u m n "   E l e m e n t I d = " 1 1 1 0 9 1 2 1 2 4 "   D a t a T y p e = " S t r i n g " > L i n e A m o u n t _ V a t A m o u n t L i n e _ L b l < / L i n e A m o u n t _ V a t A m o u n t L i n e _ L b l > + 
+             < N o O f V A T I d e n t i f i e r s   E l e m e n t T y p e = " C o l u m n "   E l e m e n t I d = " 1 1 5 3 2 6 3 0 2 6 "   D a t a T y p e = " I n t e g e r " > N o O f V A T I d e n t i f i e r s < / N o O f V A T I d e n t i f i e r s > + 
+             < V A T A m o u n t _ V a t A m o u n t L i n e   E l e m e n t T y p e = " C o l u m n "   E l e m e n t I d = " 1 8 9 1 8 2 0 6 2 0 "   D a t a T y p e = " D e c i m a l " > V A T A m o u n t _ V a t A m o u n t L i n e < / V A T A m o u n t _ V a t A m o u n t L i n e > + 
+             < V A T A m o u n t _ V a t A m o u n t L i n e _ L b l   E l e m e n t T y p e = " C o l u m n "   E l e m e n t I d = " 1 5 1 3 5 5 5 4 7 3 "   D a t a T y p e = " S t r i n g " > V A T A m o u n t _ V a t A m o u n t L i n e _ L b l < / V A T A m o u n t _ V a t A m o u n t L i n e _ L b l > + 
+             < V A T A m o u n t L C Y _ V A T A m o u n t L i n e   E l e m e n t T y p e = " C o l u m n "   E l e m e n t I d = " 1 5 8 1 9 9 4 3 5 0 "   D a t a T y p e = " D e c i m a l " > V A T A m o u n t L C Y _ V A T A m o u n t L i n e < / V A T A m o u n t L C Y _ V A T A m o u n t L i n e > + 
+             < V A T A m o u n t L C Y _ V A T A m o u n t L i n e _ L b l   E l e m e n t T y p e = " C o l u m n "   E l e m e n t I d = " 9 2 3 0 0 3 3 7 "   D a t a T y p e = " T e x t C o n s t " > V A T A m o u n t L C Y _ V A T A m o u n t L i n e _ L b l < / V A T A m o u n t L C Y _ V A T A m o u n t L i n e _ L b l > + 
+             < V A T B a s e _ V a t A m o u n t L i n e   E l e m e n t T y p e = " C o l u m n "   E l e m e n t I d = " 1 4 5 8 9 3 7 8 1 9 "   D a t a T y p e = " D e c i m a l " > V A T B a s e _ V a t A m o u n t L i n e < / V A T B a s e _ V a t A m o u n t L i n e > + 
+             < V A T B a s e _ V a t A m o u n t L i n e _ L b l   E l e m e n t T y p e = " C o l u m n "   E l e m e n t I d = " 1 6 9 1 3 0 2 4 8 8 "   D a t a T y p e = " S t r i n g " > V A T B a s e _ V a t A m o u n t L i n e _ L b l < / V A T B a s e _ V a t A m o u n t L i n e _ L b l > + 
+             < V A T B a s e L C Y _ V A T A m o u n t L i n e   E l e m e n t T y p e = " C o l u m n "   E l e m e n t I d = " 1 8 6 0 9 4 5 6 3 5 "   D a t a T y p e = " D e c i m a l " > V A T B a s e L C Y _ V A T A m o u n t L i n e < / V A T B a s e L C Y _ V A T A m o u n t L i n e > + 
+             < V A T B a s e L C Y _ V A T A m o u n t L i n e _ L b l   E l e m e n t T y p e = " C o l u m n "   E l e m e n t I d = " 1 2 3 6 4 6 7 9 9 8 "   D a t a T y p e = " T e x t C o n s t " > V A T B a s e L C Y _ V A T A m o u n t L i n e _ L b l < / V A T B a s e L C Y _ V A T A m o u n t L i n e _ L b l > + 
+             < V A T I d e n t i f i e r _ V a t A m o u n t L i n e   E l e m e n t T y p e = " C o l u m n "   E l e m e n t I d = " 1 1 4 2 0 7 0 0 3 5 "   D a t a T y p e = " C o d e " > V A T I d e n t i f i e r _ V a t A m o u n t L i n e < / V A T I d e n t i f i e r _ V a t A m o u n t L i n e > + 
+             < V A T I d e n t i f i e r _ V a t A m o u n t L i n e _ L b l   E l e m e n t T y p e = " C o l u m n "   E l e m e n t I d = " 8 6 4 5 0 4 5 0 "   D a t a T y p e = " S t r i n g " > V A T I d e n t i f i e r _ V a t A m o u n t L i n e _ L b l < / V A T I d e n t i f i e r _ V a t A m o u n t L i n e _ L b l > + 
+             < V A T P c t _ V a t A m o u n t L i n e   E l e m e n t T y p e = " C o l u m n "   E l e m e n t I d = " 1 4 5 3 5 4 2 7 7 7 "   D a t a T y p e = " D e c i m a l " > V A T P c t _ V a t A m o u n t L i n e < / V A T P c t _ V a t A m o u n t L i n e > + 
+             < V A T P c t _ V a t A m o u n t L i n e _ L b l   E l e m e n t T y p e = " C o l u m n "   E l e m e n t I d = " 6 7 6 3 2 3 7 8 "   D a t a T y p e = " S t r i n g " > V A T P c t _ V a t A m o u n t L i n e _ L b l < / V A T P c t _ V a t A m o u n t L i n e _ L b l >   
          < / V A T A m o u n t L i n e >   
-         < V A T C l a u s e L i n e > - 
-             < C o d e _ V A T C l a u s e L i n e > C o d e _ V A T C l a u s e L i n e < / C o d e _ V A T C l a u s e L i n e > - 
-             < C o d e _ V A T C l a u s e L i n e _ L b l > C o d e _ V A T C l a u s e L i n e _ L b l < / C o d e _ V A T C l a u s e L i n e _ L b l > - 
-             < D e s c r i p t i o n _ V A T C l a u s e L i n e > D e s c r i p t i o n _ V A T C l a u s e L i n e < / D e s c r i p t i o n _ V A T C l a u s e L i n e > - 
-             < D e s c r i p t i o n 2 _ V A T C l a u s e L i n e > D e s c r i p t i o n 2 _ V A T C l a u s e L i n e < / D e s c r i p t i o n 2 _ V A T C l a u s e L i n e > - 
-             < N o O f V A T C l a u s e s > N o O f V A T C l a u s e s < / N o O f V A T C l a u s e s > - 
-             < V A T A m o u n t _ V A T C l a u s e L i n e > V A T A m o u n t _ V A T C l a u s e L i n e < / V A T A m o u n t _ V A T C l a u s e L i n e > - 
-             < V A T C l a u s e s H e a d e r > V A T C l a u s e s H e a d e r < / V A T C l a u s e s H e a d e r > - 
-             < V A T I d e n t i f i e r _ V A T C l a u s e L i n e > V A T I d e n t i f i e r _ V A T C l a u s e L i n e < / V A T I d e n t i f i e r _ V A T C l a u s e L i n e > +         < V A T C l a u s e L i n e   E l e m e n t T y p e = " D a t a I t e m "   E l e m e n t I d = " 1 6 6 5 5 0 0 1 6 3 " > + 
+             < C o d e _ V A T C l a u s e L i n e   E l e m e n t T y p e = " C o l u m n "   E l e m e n t I d = " 1 8 2 4 5 8 9 8 4 7 "   D a t a T y p e = " C o d e " > C o d e _ V A T C l a u s e L i n e < / C o d e _ V A T C l a u s e L i n e > + 
+             < C o d e _ V A T C l a u s e L i n e _ L b l   E l e m e n t T y p e = " C o l u m n "   E l e m e n t I d = " 4 6 1 5 3 3 0 2 "   D a t a T y p e = " S t r i n g " > C o d e _ V A T C l a u s e L i n e _ L b l < / C o d e _ V A T C l a u s e L i n e _ L b l > + 
+             < D e s c r i p t i o n _ V A T C l a u s e L i n e   E l e m e n t T y p e = " C o l u m n "   E l e m e n t I d = " 1 3 0 5 5 4 5 9 2 4 "   D a t a T y p e = " T e x t " > D e s c r i p t i o n _ V A T C l a u s e L i n e < / D e s c r i p t i o n _ V A T C l a u s e L i n e > + 
+             < D e s c r i p t i o n 2 _ V A T C l a u s e L i n e   E l e m e n t T y p e = " C o l u m n "   E l e m e n t I d = " 1 3 7 9 6 6 7 4 7 0 "   D a t a T y p e = " T e x t " > D e s c r i p t i o n 2 _ V A T C l a u s e L i n e < / D e s c r i p t i o n 2 _ V A T C l a u s e L i n e > + 
+             < N o O f V A T C l a u s e s   E l e m e n t T y p e = " C o l u m n "   E l e m e n t I d = " 7 5 6 4 1 7 3 9 2 "   D a t a T y p e = " I n t e g e r " > N o O f V A T C l a u s e s < / N o O f V A T C l a u s e s > + 
+             < V A T A m o u n t _ V A T C l a u s e L i n e   E l e m e n t T y p e = " C o l u m n "   E l e m e n t I d = " 2 2 2 4 6 9 0 5 9 "   D a t a T y p e = " D e c i m a l " > V A T A m o u n t _ V A T C l a u s e L i n e < / V A T A m o u n t _ V A T C l a u s e L i n e > + 
+             < V A T C l a u s e s H e a d e r   E l e m e n t T y p e = " C o l u m n "   E l e m e n t I d = " 1 9 7 2 4 0 9 9 2 9 "   D a t a T y p e = " T e x t " > V A T C l a u s e s H e a d e r < / V A T C l a u s e s H e a d e r > + 
+             < V A T I d e n t i f i e r _ V A T C l a u s e L i n e   E l e m e n t T y p e = " C o l u m n "   E l e m e n t I d = " 1 4 6 4 4 7 2 4 7 8 "   D a t a T y p e = " C o d e " > V A T I d e n t i f i e r _ V A T C l a u s e L i n e < / V A T I d e n t i f i e r _ V A T C l a u s e L i n e >   
          < / V A T C l a u s e L i n e >   
-         < R e p o r t T o t a l s L i n e > - 
-             < A m o u n t _ R e p o r t T o t a l s L i n e > A m o u n t _ R e p o r t T o t a l s L i n e < / A m o u n t _ R e p o r t T o t a l s L i n e > - 
-             < A m o u n t F o r m a t t e d _ R e p o r t T o t a l s L i n e > A m o u n t F o r m a t t e d _ R e p o r t T o t a l s L i n e < / A m o u n t F o r m a t t e d _ R e p o r t T o t a l s L i n e > - 
-             < D e s c r i p t i o n _ R e p o r t T o t a l s L i n e > D e s c r i p t i o n _ R e p o r t T o t a l s L i n e < / D e s c r i p t i o n _ R e p o r t T o t a l s L i n e > - 
-             < F o n t B o l d _ R e p o r t T o t a l s L i n e > F o n t B o l d _ R e p o r t T o t a l s L i n e < / F o n t B o l d _ R e p o r t T o t a l s L i n e > - 
-             < F o n t U n d e r l i n e _ R e p o r t T o t a l s L i n e > F o n t U n d e r l i n e _ R e p o r t T o t a l s L i n e < / F o n t U n d e r l i n e _ R e p o r t T o t a l s L i n e > +         < R e p o r t T o t a l s L i n e   E l e m e n t T y p e = " D a t a I t e m "   E l e m e n t I d = " 2 1 2 2 5 4 9 8 3 6 " > + 
+             < A m o u n t _ R e p o r t T o t a l s L i n e   E l e m e n t T y p e = " C o l u m n "   E l e m e n t I d = " 4 1 9 9 1 8 3 6 9 "   D a t a T y p e = " D e c i m a l " > A m o u n t _ R e p o r t T o t a l s L i n e < / A m o u n t _ R e p o r t T o t a l s L i n e > + 
+             < A m o u n t F o r m a t t e d _ R e p o r t T o t a l s L i n e   E l e m e n t T y p e = " C o l u m n "   E l e m e n t I d = " 1 5 0 6 1 3 6 8 2 5 "   D a t a T y p e = " T e x t " > A m o u n t F o r m a t t e d _ R e p o r t T o t a l s L i n e < / A m o u n t F o r m a t t e d _ R e p o r t T o t a l s L i n e > + 
+             < D e s c r i p t i o n _ R e p o r t T o t a l s L i n e   E l e m e n t T y p e = " C o l u m n "   E l e m e n t I d = " 5 8 1 9 9 6 0 6 7 "   D a t a T y p e = " T e x t " > D e s c r i p t i o n _ R e p o r t T o t a l s L i n e < / D e s c r i p t i o n _ R e p o r t T o t a l s L i n e > + 
+             < F o n t B o l d _ R e p o r t T o t a l s L i n e   E l e m e n t T y p e = " C o l u m n "   E l e m e n t I d = " 9 4 6 5 4 0 5 4 9 "   D a t a T y p e = " B o o l e a n " > F o n t B o l d _ R e p o r t T o t a l s L i n e < / F o n t B o l d _ R e p o r t T o t a l s L i n e > + 
+             < F o n t U n d e r l i n e _ R e p o r t T o t a l s L i n e   E l e m e n t T y p e = " C o l u m n "   E l e m e n t I d = " 2 0 2 1 5 3 3 6 9 4 "   D a t a T y p e = " B o o l e a n " > F o n t U n d e r l i n e _ R e p o r t T o t a l s L i n e < / F o n t U n d e r l i n e _ R e p o r t T o t a l s L i n e >   
          < / R e p o r t T o t a l s L i n e >   
-         < P a y m e n t R e p o r t i n g A r g u m e n t > - 
-             < P a y m e n t S e r v i c e L o g o / > - 
-             < P a y m e n t S e r v i c e L o g o _ U r l > P a y m e n t S e r v i c e L o g o _ U r l < / P a y m e n t S e r v i c e L o g o _ U r l > - 
-             < P a y m e n t S e r v i c e L o g o _ U r l T e x t > P a y m e n t S e r v i c e L o g o _ U r l T e x t < / P a y m e n t S e r v i c e L o g o _ U r l T e x t > - 
-             < P a y m e n t S e r v i c e T e x t _ U r l > P a y m e n t S e r v i c e T e x t _ U r l < / P a y m e n t S e r v i c e T e x t _ U r l > - 
-             < P a y m e n t S e r v i c e T e x t _ U r l T e x t > P a y m e n t S e r v i c e T e x t _ U r l T e x t < / P a y m e n t S e r v i c e T e x t _ U r l T e x t > +         < P a y m e n t R e p o r t i n g A r g u m e n t   E l e m e n t T y p e = " D a t a I t e m "   E l e m e n t I d = " 3 1 3 7 4 4 1 9 4 " > + 
+             < P a y m e n t S e r v i c e L o g o   E l e m e n t T y p e = " C o l u m n "   E l e m e n t I d = " 4 1 6 7 9 0 7 6 7 "   D a t a T y p e = " B L O B " / > + 
+             < P a y m e n t S e r v i c e L o g o _ U r l   E l e m e n t T y p e = " C o l u m n "   E l e m e n t I d = " 6 4 4 9 7 5 1 3 9 "   D a t a T y p e = " T e x t " > P a y m e n t S e r v i c e L o g o _ U r l < / P a y m e n t S e r v i c e L o g o _ U r l > + 
+             < P a y m e n t S e r v i c e L o g o _ U r l T e x t   E l e m e n t T y p e = " C o l u m n "   E l e m e n t I d = " 1 4 1 1 7 0 3 9 7 6 "   D a t a T y p e = " T e x t " > P a y m e n t S e r v i c e L o g o _ U r l T e x t < / P a y m e n t S e r v i c e L o g o _ U r l T e x t > + 
+             < P a y m e n t S e r v i c e T e x t _ U r l   E l e m e n t T y p e = " C o l u m n "   E l e m e n t I d = " 1 7 4 2 3 3 4 7 "   D a t a T y p e = " T e x t " > P a y m e n t S e r v i c e T e x t _ U r l < / P a y m e n t S e r v i c e T e x t _ U r l > + 
+             < P a y m e n t S e r v i c e T e x t _ U r l T e x t   E l e m e n t T y p e = " C o l u m n "   E l e m e n t I d = " 1 6 3 6 7 7 2 9 3 4 "   D a t a T y p e = " T e x t " > P a y m e n t S e r v i c e T e x t _ U r l T e x t < / P a y m e n t S e r v i c e T e x t _ U r l T e x t >   
          < / P a y m e n t R e p o r t i n g A r g u m e n t >   
-         < L e t t e r T e x t > - 
-             < B o d y T e x t > B o d y T e x t < / B o d y T e x t > - 
-             < C l o s i n g T e x t > C l o s i n g T e x t < / C l o s i n g T e x t > - 
-             < G r e e t i n g T e x t > G r e e t i n g T e x t < / G r e e t i n g T e x t > - 
-             < P m t D i s c T e x t > P m t D i s c T e x t < / P m t D i s c T e x t > +         < L e t t e r T e x t   E l e m e n t T y p e = " D a t a I t e m "   E l e m e n t I d = " 1 5 1 0 3 5 3 8 3 4 " > + 
+             < B o d y T e x t   E l e m e n t T y p e = " C o l u m n "   E l e m e n t I d = " 1 4 9 7 5 9 8 0 8 "   D a t a T y p e = " T e x t " > B o d y T e x t < / B o d y T e x t > + 
+             < C l o s i n g T e x t   E l e m e n t T y p e = " C o l u m n "   E l e m e n t I d = " 5 1 2 1 3 5 9 0 9 "   D a t a T y p e = " T e x t C o n s t " > C l o s i n g T e x t < / C l o s i n g T e x t > + 
+             < G r e e t i n g T e x t   E l e m e n t T y p e = " C o l u m n "   E l e m e n t I d = " 1 1 7 5 2 7 9 2 8 9 "   D a t a T y p e = " T e x t C o n s t " > G r e e t i n g T e x t < / G r e e t i n g T e x t > + 
+             < P m t D i s c T e x t   E l e m e n t T y p e = " C o l u m n "   E l e m e n t I d = " 2 0 1 3 8 4 9 9 4 8 "   D a t a T y p e = " T e x t " > P m t D i s c T e x t < / P m t D i s c T e x t >   
          < / L e t t e r T e x t >   
-         < T o t a l s > - 
-             < T o t a l A m o u n t I n c l u d i n g V A T > T o t a l A m o u n t I n c l u d i n g V A T < / T o t a l A m o u n t I n c l u d i n g V A T > - 
-             < T o t a l E x c l u d i n g V A T T e x t > T o t a l E x c l u d i n g V A T T e x t < / T o t a l E x c l u d i n g V A T T e x t > - 
-             < T o t a l I n c l u d i n g V A T T e x t > T o t a l I n c l u d i n g V A T T e x t < / T o t a l I n c l u d i n g V A T T e x t > - 
-             < T o t a l I n v o i c e D i s c o u n t A m o u n t > T o t a l I n v o i c e D i s c o u n t A m o u n t < / T o t a l I n v o i c e D i s c o u n t A m o u n t > - 
-             < T o t a l N e t A m o u n t > T o t a l N e t A m o u n t < / T o t a l N e t A m o u n t > - 
-             < T o t a l P a y m e n t D i s c o u n t O n V A T > T o t a l P a y m e n t D i s c o u n t O n V A T < / T o t a l P a y m e n t D i s c o u n t O n V A T > - 
-             < T o t a l S u b T o t a l > T o t a l S u b T o t a l < / T o t a l S u b T o t a l > - 
-             < T o t a l S u b T o t a l M i n u s I n v o i c e D i s c o u n t > T o t a l S u b T o t a l M i n u s I n v o i c e D i s c o u n t < / T o t a l S u b T o t a l M i n u s I n v o i c e D i s c o u n t > - 
-             < T o t a l T e x t > T o t a l T e x t < / T o t a l T e x t > - 
-             < T o t a l V A T A m o u n t > T o t a l V A T A m o u n t < / T o t a l V A T A m o u n t > - 
-             < T o t a l V A T A m o u n t L C Y > T o t a l V A T A m o u n t L C Y < / T o t a l V A T A m o u n t L C Y > - 
-             < T o t a l V A T A m o u n t T e x t > T o t a l V A T A m o u n t T e x t < / T o t a l V A T A m o u n t T e x t > - 
-             < T o t a l V A T B a s e L C Y > T o t a l V A T B a s e L C Y < / T o t a l V A T B a s e L C Y > +         < T o t a l s   E l e m e n t T y p e = " D a t a I t e m "   E l e m e n t I d = " 1 8 2 3 9 5 0 0 4 4 " > + 
+             < T o t a l A m o u n t I n c l u d i n g V A T   E l e m e n t T y p e = " C o l u m n "   E l e m e n t I d = " 9 1 0 5 1 1 5 7 5 "   D a t a T y p e = " D e c i m a l " > T o t a l A m o u n t I n c l u d i n g V A T < / T o t a l A m o u n t I n c l u d i n g V A T > + 
+             < T o t a l E x c l u d i n g V A T T e x t   E l e m e n t T y p e = " C o l u m n "   E l e m e n t I d = " 1 9 2 2 9 4 6 3 1 0 "   D a t a T y p e = " T e x t " > T o t a l E x c l u d i n g V A T T e x t < / T o t a l E x c l u d i n g V A T T e x t > + 
+             < T o t a l I n c l u d i n g V A T T e x t   E l e m e n t T y p e = " C o l u m n "   E l e m e n t I d = " 1 2 0 4 0 1 6 3 5 2 "   D a t a T y p e = " T e x t " > T o t a l I n c l u d i n g V A T T e x t < / T o t a l I n c l u d i n g V A T T e x t > + 
+             < T o t a l I n v o i c e D i s c o u n t A m o u n t   E l e m e n t T y p e = " C o l u m n "   E l e m e n t I d = " 4 0 2 1 7 7 5 1 "   D a t a T y p e = " D e c i m a l " > T o t a l I n v o i c e D i s c o u n t A m o u n t < / T o t a l I n v o i c e D i s c o u n t A m o u n t > + 
+             < T o t a l N e t A m o u n t   E l e m e n t T y p e = " C o l u m n "   E l e m e n t I d = " 4 8 3 1 9 3 3 7 2 "   D a t a T y p e = " D e c i m a l " > T o t a l N e t A m o u n t < / T o t a l N e t A m o u n t > + 
+             < T o t a l P a y m e n t D i s c o u n t O n V A T   E l e m e n t T y p e = " C o l u m n "   E l e m e n t I d = " 7 3 6 0 4 1 8 8 6 "   D a t a T y p e = " D e c i m a l " > T o t a l P a y m e n t D i s c o u n t O n V A T < / T o t a l P a y m e n t D i s c o u n t O n V A T > + 
+             < T o t a l S u b T o t a l   E l e m e n t T y p e = " C o l u m n "   E l e m e n t I d = " 2 0 9 7 8 7 6 8 0 1 "   D a t a T y p e = " D e c i m a l " > T o t a l S u b T o t a l < / T o t a l S u b T o t a l > + 
+             < T o t a l S u b T o t a l M i n u s I n v o i c e D i s c o u n t   E l e m e n t T y p e = " C o l u m n "   E l e m e n t I d = " 7 6 9 4 3 1 8 8 7 "   D a t a T y p e = " D e c i m a l " > T o t a l S u b T o t a l M i n u s I n v o i c e D i s c o u n t < / T o t a l S u b T o t a l M i n u s I n v o i c e D i s c o u n t > + 
+             < T o t a l T e x t   E l e m e n t T y p e = " C o l u m n "   E l e m e n t I d = " 2 3 1 9 1 0 5 1 8 "   D a t a T y p e = " T e x t " > T o t a l T e x t < / T o t a l T e x t > + 
+             < T o t a l V A T A m o u n t   E l e m e n t T y p e = " C o l u m n "   E l e m e n t I d = " 1 6 2 7 1 0 2 3 2 8 "   D a t a T y p e = " D e c i m a l " > T o t a l V A T A m o u n t < / T o t a l V A T A m o u n t > + 
+             < T o t a l V A T A m o u n t L C Y   E l e m e n t T y p e = " C o l u m n "   E l e m e n t I d = " 1 5 0 6 5 7 0 2 1 8 "   D a t a T y p e = " D e c i m a l " > T o t a l V A T A m o u n t L C Y < / T o t a l V A T A m o u n t L C Y > + 
+             < T o t a l V A T A m o u n t T e x t   E l e m e n t T y p e = " C o l u m n "   E l e m e n t I d = " 9 7 3 6 6 6 3 3 9 "   D a t a T y p e = " T e x t " > T o t a l V A T A m o u n t T e x t < / T o t a l V A T A m o u n t T e x t > + 
+             < T o t a l V A T B a s e L C Y   E l e m e n t T y p e = " C o l u m n "   E l e m e n t I d = " 8 3 4 4 5 0 5 2 1 "   D a t a T y p e = " D e c i m a l " > T o t a l V A T B a s e L C Y < / T o t a l V A T B a s e L C Y >   
          < / T o t a l s >   
@@ -6448,7 +6159,7 @@
  < / N a v W o r d R e p o r t X m l P a r t > 
 </file>
 
-<file path=customXml/item2.xml>��< ? x m l   v e r s i o n = " 1 . 0 "   e n c o d i n g = " u t f - 1 6 " ? > < N a v W o r d R e p o r t X m l P a r t   x m l n s = " u r n : m i c r o s o f t - d y n a m i c s - b u s i n e s s c e n t r a l / i n t e r n a l / e x t e n d e d / r e p o r t s / S t a n d a r d _ S a l e s _ D r a f t _ I n v o i c e / 1 3 0 3 / " > +<file path=customXml/item2.xml>��< ? x m l   v e r s i o n = " 1 . 0 "   e n c o d i n g = " u t f - 1 6 " ? > < N a v W o r d R e p o r t X m l P a r t   x m l n s = " u r n : m i c r o s o f t - d y n a m i c s - n a v / r e p o r t s / S t a n d a r d _ S a l e s _ D r a f t _ I n v o i c e / 1 3 0 3 / " >   
      < B C R e p o r t I n f o r m a t i o n >   
@@ -6514,477 +6225,475 @@
  
      < / B C R e p o r t I n f o r m a t i o n >   
-     < T o o l t i p s / > - 
-     < H e a d e r   E l e m e n t T y p e = " D a t a I t e m "   E l e m e n t I d = " 1 2 4 0 3 7 3 8 8 6 " > - 
-         < B i l l e d T o _ L b l   E l e m e n t T y p e = " C o l u m n "   E l e m e n t I d = " 1 7 4 5 4 4 9 0 7 9 "   D a t a T y p e = " T e x t C o n s t " > B i l l e d T o _ L b l < / B i l l e d T o _ L b l > - 
-         < B i l l T o C o n t a c t E m a i l   E l e m e n t T y p e = " C o l u m n "   E l e m e n t I d = " 3 3 5 8 2 7 8 9 5 "   D a t a T y p e = " T e x t " > B i l l T o C o n t a c t E m a i l < / B i l l T o C o n t a c t E m a i l > - 
-         < B i l l T o C o n t a c t E m a i l L b l   E l e m e n t T y p e = " C o l u m n "   E l e m e n t I d = " 2 9 6 4 7 8 3 6 5 "   D a t a T y p e = " T e x t C o n s t " > B i l l T o C o n t a c t E m a i l L b l < / B i l l T o C o n t a c t E m a i l L b l > - 
-         < B i l l T o C o n t a c t M o b i l e P h o n e N o   E l e m e n t T y p e = " C o l u m n "   E l e m e n t I d = " 2 4 8 4 8 8 6 9 6 "   D a t a T y p e = " T e x t " > B i l l T o C o n t a c t M o b i l e P h o n e N o < / B i l l T o C o n t a c t M o b i l e P h o n e N o > - 
-         < B i l l T o C o n t a c t M o b i l e P h o n e N o L b l   E l e m e n t T y p e = " C o l u m n "   E l e m e n t I d = " 2 7 6 3 1 1 3 3 8 "   D a t a T y p e = " T e x t C o n s t " > B i l l T o C o n t a c t M o b i l e P h o n e N o L b l < / B i l l T o C o n t a c t M o b i l e P h o n e N o L b l > - 
-         < B i l l T o C o n t a c t P h o n e N o   E l e m e n t T y p e = " C o l u m n "   E l e m e n t I d = " 3 6 2 4 7 7 4 8 8 "   D a t a T y p e = " T e x t " > B i l l T o C o n t a c t P h o n e N o < / B i l l T o C o n t a c t P h o n e N o > - 
-         < B i l l T o C o n t a c t P h o n e N o L b l   E l e m e n t T y p e = " C o l u m n "   E l e m e n t I d = " 2 1 2 3 3 4 5 9 6 6 "   D a t a T y p e = " T e x t C o n s t " > B i l l T o C o n t a c t P h o n e N o L b l < / B i l l T o C o n t a c t P h o n e N o L b l > - 
-         < B i l l t o C u s t o m e r N o _ L b l   E l e m e n t T y p e = " C o l u m n "   E l e m e n t I d = " 3 6 9 3 0 7 8 1 3 "   D a t a T y p e = " S t r i n g " > B i l l t o C u s t o m e r N o _ L b l < / B i l l t o C u s t o m e r N o _ L b l > - 
-         < B i l l t o C u s t u m e r N o   E l e m e n t T y p e = " C o l u m n "   E l e m e n t I d = " 2 8 0 4 7 3 0 5 8 "   D a t a T y p e = " C o d e " > B i l l t o C u s t u m e r N o < / B i l l t o C u s t u m e r N o > - 
-         < C h e c k s P a y a b l e _ L b l   E l e m e n t T y p e = " C o l u m n "   E l e m e n t I d = " 1 0 5 3 1 5 6 0 6 5 "   D a t a T y p e = " T e x t " > C h e c k s P a y a b l e _ L b l < / C h e c k s P a y a b l e _ L b l > - 
-         < C o m p a n y A d d r e s s 1   E l e m e n t T y p e = " C o l u m n "   E l e m e n t I d = " 1 8 8 4 1 6 4 3 2 3 "   D a t a T y p e = " T e x t " > C o m p a n y A d d r e s s 1 < / C o m p a n y A d d r e s s 1 > - 
-         < C o m p a n y A d d r e s s 2   E l e m e n t T y p e = " C o l u m n "   E l e m e n t I d = " 1 2 4 6 4 6 7 7 0 6 "   D a t a T y p e = " T e x t " > C o m p a n y A d d r e s s 2 < / C o m p a n y A d d r e s s 2 > - 
-         < C o m p a n y A d d r e s s 3   E l e m e n t T y p e = " C o l u m n "   E l e m e n t I d = " 6 0 8 7 7 1 0 8 9 "   D a t a T y p e = " T e x t " > C o m p a n y A d d r e s s 3 < / C o m p a n y A d d r e s s 3 > - 
-         < C o m p a n y A d d r e s s 4   E l e m e n t T y p e = " C o l u m n "   E l e m e n t I d = " 7 7 7 6 8 0 1 1 2 "   D a t a T y p e = " T e x t " > C o m p a n y A d d r e s s 4 < / C o m p a n y A d d r e s s 4 > - 
-         < C o m p a n y A d d r e s s 5   E l e m e n t T y p e = " C o l u m n "   E l e m e n t I d = " 1 3 9 9 8 3 4 9 5 "   D a t a T y p e = " T e x t " > C o m p a n y A d d r e s s 5 < / C o m p a n y A d d r e s s 5 > - 
-         < C o m p a n y A d d r e s s 6   E l e m e n t T y p e = " C o l u m n "   E l e m e n t I d = " 4 9 7 7 1 3 1 2 2 "   D a t a T y p e = " T e x t " > C o m p a n y A d d r e s s 6 < / C o m p a n y A d d r e s s 6 > - 
-         < C o m p a n y A d d r e s s 7   E l e m e n t T y p e = " C o l u m n "   E l e m e n t I d = " 1 1 3 5 4 0 9 7 3 9 "   D a t a T y p e = " T e x t " > C o m p a n y A d d r e s s 7 < / C o m p a n y A d d r e s s 7 > - 
-         < C o m p a n y A d d r e s s 8   E l e m e n t T y p e = " C o l u m n "   E l e m e n t I d = " 1 7 1 5 2 5 5 3 0 0 "   D a t a T y p e = " T e x t " > C o m p a n y A d d r e s s 8 < / C o m p a n y A d d r e s s 8 > - 
-         < C o m p a n y B a n k A c c o u n t N o   E l e m e n t T y p e = " C o l u m n "   E l e m e n t I d = " 3 0 1 4 0 2 0 4 "   D a t a T y p e = " T e x t " > C o m p a n y B a n k A c c o u n t N o < / C o m p a n y B a n k A c c o u n t N o > - 
-         < C o m p a n y B a n k A c c o u n t N o _ L b l   E l e m e n t T y p e = " C o l u m n "   E l e m e n t I d = " 1 0 9 7 7 4 3 3 4 5 "   D a t a T y p e = " T e x t C o n s t " > C o m p a n y B a n k A c c o u n t N o _ L b l < / C o m p a n y B a n k A c c o u n t N o _ L b l > - 
-         < C o m p a n y B a n k B r a n c h N o   E l e m e n t T y p e = " C o l u m n "   E l e m e n t I d = " 7 9 3 1 3 3 0 5 7 "   D a t a T y p e = " T e x t " > C o m p a n y B a n k B r a n c h N o < / C o m p a n y B a n k B r a n c h N o > - 
-         < C o m p a n y B a n k B r a n c h N o _ L b l   E l e m e n t T y p e = " C o l u m n "   E l e m e n t I d = " 3 2 7 9 0 6 6 9 2 "   D a t a T y p e = " S t r i n g " > C o m p a n y B a n k B r a n c h N o _ L b l < / C o m p a n y B a n k B r a n c h N o _ L b l > - 
-         < C o m p a n y B a n k N a m e   E l e m e n t T y p e = " C o l u m n "   E l e m e n t I d = " 1 5 3 4 9 0 5 6 0 5 "   D a t a T y p e = " T e x t " > C o m p a n y B a n k N a m e < / C o m p a n y B a n k N a m e > - 
-         < C o m p a n y B a n k N a m e _ L b l   E l e m e n t T y p e = " C o l u m n "   E l e m e n t I d = " 1 2 0 4 3 0 7 0 1 4 "   D a t a T y p e = " T e x t C o n s t " > C o m p a n y B a n k N a m e _ L b l < / C o m p a n y B a n k N a m e _ L b l > - 
-         < C o m p a n y C u s t o m G i r o   E l e m e n t T y p e = " C o l u m n "   E l e m e n t I d = " 1 6 7 0 4 7 5 7 9 8 "   D a t a T y p e = " T e x t " > C o m p a n y C u s t o m G i r o < / C o m p a n y C u s t o m G i r o > - 
-         < C o m p a n y C u s t o m G i r o _ L b l   E l e m e n t T y p e = " C o l u m n "   E l e m e n t I d = " 8 9 1 4 3 9 6 2 5 "   D a t a T y p e = " T e x t " > C o m p a n y C u s t o m G i r o _ L b l < / C o m p a n y C u s t o m G i r o _ L b l > - 
-         < C o m p a n y E M a i l   E l e m e n t T y p e = " C o l u m n "   E l e m e n t I d = " 1 6 7 7 0 7 4 0 5 8 "   D a t a T y p e = " T e x t " > C o m p a n y E M a i l < / C o m p a n y E M a i l > - 
-         < C o m p a n y G i r o N o   E l e m e n t T y p e = " C o l u m n "   E l e m e n t I d = " 1 3 6 0 1 9 6 3 2 0 "   D a t a T y p e = " T e x t " > C o m p a n y G i r o N o < / C o m p a n y G i r o N o > - 
-         < C o m p a n y G i r o N o _ L b l   E l e m e n t T y p e = " C o l u m n "   E l e m e n t I d = " 8 6 1 6 0 2 1 1 5 "   D a t a T y p e = " T e x t C o n s t " > C o m p a n y G i r o N o _ L b l < / C o m p a n y G i r o N o _ L b l > - 
-         < C o m p a n y H o m e P a g e   E l e m e n t T y p e = " C o l u m n "   E l e m e n t I d = " 1 9 8 9 1 8 8 7 0 "   D a t a T y p e = " T e x t " > C o m p a n y H o m e P a g e < / C o m p a n y H o m e P a g e > - 
-         < C o m p a n y I B A N   E l e m e n t T y p e = " C o l u m n "   E l e m e n t I d = " 9 0 6 5 4 9 1 8 2 "   D a t a T y p e = " C o d e " > C o m p a n y I B A N < / C o m p a n y I B A N > - 
-         < C o m p a n y I B A N _ L b l   E l e m e n t T y p e = " C o l u m n "   E l e m e n t I d = " 1 2 6 7 9 5 2 2 2 7 "   D a t a T y p e = " S t r i n g " > C o m p a n y I B A N _ L b l < / C o m p a n y I B A N _ L b l > - 
-         < C o m p a n y L e g a l O f f i c e   E l e m e n t T y p e = " C o l u m n "   E l e m e n t I d = " 7 1 4 2 5 8 1 1 1 "   D a t a T y p e = " T e x t " > C o m p a n y L e g a l O f f i c e < / C o m p a n y L e g a l O f f i c e > - 
-         < C o m p a n y L e g a l O f f i c e _ L b l   E l e m e n t T y p e = " C o l u m n "   E l e m e n t I d = " 1 5 3 3 1 7 5 1 0 8 "   D a t a T y p e = " T e x t " > C o m p a n y L e g a l O f f i c e _ L b l < / C o m p a n y L e g a l O f f i c e _ L b l > - 
-         < C o m p a n y L e g a l S t a t e m e n t   E l e m e n t T y p e = " C o l u m n "   E l e m e n t I d = " 4 4 8 3 5 8 8 7 6 "   D a t a T y p e = " T e x t " > C o m p a n y L e g a l S t a t e m e n t < / C o m p a n y L e g a l S t a t e m e n t > - 
-         < C o m p a n y L o g o P o s i t i o n   E l e m e n t T y p e = " C o l u m n "   E l e m e n t I d = " 1 4 2 5 2 6 6 6 8 8 "   D a t a T y p e = " I n t e g e r " > C o m p a n y L o g o P o s i t i o n < / C o m p a n y L o g o P o s i t i o n > - 
-         < C o m p a n y P h o n e N o   E l e m e n t T y p e = " C o l u m n "   E l e m e n t I d = " 2 5 0 4 4 0 6 5 5 "   D a t a T y p e = " T e x t " > C o m p a n y P h o n e N o < / C o m p a n y P h o n e N o > - 
-         < C o m p a n y P h o n e N o _ L b l   E l e m e n t T y p e = " C o l u m n "   E l e m e n t I d = " 5 5 8 5 9 3 5 8 6 "   D a t a T y p e = " T e x t C o n s t " > C o m p a n y P h o n e N o _ L b l < / C o m p a n y P h o n e N o _ L b l > - 
-         < C o m p a n y P i c t u r e   E l e m e n t T y p e = " C o l u m n "   E l e m e n t I d = " 1 3 9 7 4 1 1 0 7 4 "   D a t a T y p e = " B L O B " / > - 
-         < C o m p a n y R e g i s t r a t i o n N u m b e r   E l e m e n t T y p e = " C o l u m n "   E l e m e n t I d = " 2 0 2 3 6 3 9 4 2 4 "   D a t a T y p e = " T e x t " > C o m p a n y R e g i s t r a t i o n N u m b e r < / C o m p a n y R e g i s t r a t i o n N u m b e r > - 
-         < C o m p a n y R e g i s t r a t i o n N u m b e r _ L b l   E l e m e n t T y p e = " C o l u m n "   E l e m e n t I d = " 1 8 3 3 1 0 6 6 5 3 "   D a t a T y p e = " T e x t " > C o m p a n y R e g i s t r a t i o n N u m b e r _ L b l < / C o m p a n y R e g i s t r a t i o n N u m b e r _ L b l > - 
-         < C o m p a n y S W I F T   E l e m e n t T y p e = " C o l u m n "   E l e m e n t I d = " 6 6 8 2 5 0 2 4 5 "   D a t a T y p e = " C o d e " > C o m p a n y S W I F T < / C o m p a n y S W I F T > - 
-         < C o m p a n y S W I F T _ L b l   E l e m e n t T y p e = " C o l u m n "   E l e m e n t I d = " 2 0 2 9 5 9 7 3 8 4 "   D a t a T y p e = " S t r i n g " > C o m p a n y S W I F T _ L b l < / C o m p a n y S W I F T _ L b l > - 
-         < C o m p a n y V A T R e g i s t r a t i o n N o   E l e m e n t T y p e = " C o l u m n "   E l e m e n t I d = " 1 9 1 4 0 1 3 6 4 9 "   D a t a T y p e = " T e x t " > C o m p a n y V A T R e g i s t r a t i o n N o < / C o m p a n y V A T R e g i s t r a t i o n N o > - 
-         < C o m p a n y V A T R e g i s t r a t i o n N o _ L b l   E l e m e n t T y p e = " C o l u m n "   E l e m e n t I d = " 9 2 4 5 0 3 1 2 4 "   D a t a T y p e = " T e x t " > C o m p a n y V A T R e g i s t r a t i o n N o _ L b l < / C o m p a n y V A T R e g i s t r a t i o n N o _ L b l > - 
-         < C o m p a n y V A T R e g N o   E l e m e n t T y p e = " C o l u m n "   E l e m e n t I d = " 1 7 1 4 3 1 9 3 6 "   D a t a T y p e = " T e x t " > C o m p a n y V A T R e g N o < / C o m p a n y V A T R e g N o > - 
-         < C o m p a n y V A T R e g N o _ L b l   E l e m e n t T y p e = " C o l u m n "   E l e m e n t I d = " 7 7 3 2 0 1 5 0 1 "   D a t a T y p e = " T e x t " > C o m p a n y V A T R e g N o _ L b l < / C o m p a n y V A T R e g N o _ L b l > - 
-         < C o n t a c t _ L b l   E l e m e n t T y p e = " C o l u m n "   E l e m e n t I d = " 1 1 5 5 0 9 4 7 5 2 "   D a t a T y p e = " T e x t " > C o n t a c t _ L b l < / C o n t a c t _ L b l > - 
-         < C o p y _ L b l   E l e m e n t T y p e = " C o l u m n "   E l e m e n t I d = " 6 0 4 7 8 2 7 8 1 "   D a t a T y p e = " T e x t C o n s t " > C o p y _ L b l < / C o p y _ L b l > - 
-         < C u s t o m e r A d d r e s s 1   E l e m e n t T y p e = " C o l u m n "   E l e m e n t I d = " 1 8 0 1 9 6 6 4 5 4 "   D a t a T y p e = " T e x t " > C u s t o m e r A d d r e s s 1 < / C u s t o m e r A d d r e s s 1 > - 
-         < C u s t o m e r A d d r e s s 2   E l e m e n t T y p e = " C o l u m n "   E l e m e n t I d = " 1 1 6 4 2 6 9 8 3 7 "   D a t a T y p e = " T e x t " > C u s t o m e r A d d r e s s 2 < / C u s t o m e r A d d r e s s 2 > - 
-         < C u s t o m e r A d d r e s s 3   E l e m e n t T y p e = " C o l u m n "   E l e m e n t I d = " 5 2 6 5 7 3 2 2 0 "   D a t a T y p e = " T e x t " > C u s t o m e r A d d r e s s 3 < / C u s t o m e r A d d r e s s 3 > - 
-         < C u s t o m e r A d d r e s s 4   E l e m e n t T y p e = " C o l u m n "   E l e m e n t I d = " 1 1 1 1 2 3 3 9 7 "   D a t a T y p e = " T e x t " > C u s t o m e r A d d r e s s 4 < / C u s t o m e r A d d r e s s 4 > - 
-         < C u s t o m e r A d d r e s s 5   E l e m e n t T y p e = " C o l u m n "   E l e m e n t I d = " 7 4 8 8 2 0 0 1 4 "   D a t a T y p e = " T e x t " > C u s t o m e r A d d r e s s 5 < / C u s t o m e r A d d r e s s 5 > - 
-         < C u s t o m e r A d d r e s s 6   E l e m e n t T y p e = " C o l u m n "   E l e m e n t I d = " 1 3 8 6 5 1 6 6 3 1 "   D a t a T y p e = " T e x t " > C u s t o m e r A d d r e s s 6 < / C u s t o m e r A d d r e s s 6 > - 
-         < C u s t o m e r A d d r e s s 7   E l e m e n t T y p e = " C o l u m n "   E l e m e n t I d = " 2 0 2 4 2 1 3 2 4 8 "   D a t a T y p e = " T e x t " > C u s t o m e r A d d r e s s 7 < / C u s t o m e r A d d r e s s 7 > - 
-         < C u s t o m e r A d d r e s s 8   E l e m e n t T y p e = " C o l u m n "   E l e m e n t I d = " 1 0 4 8 6 9 8 5 8 5 "   D a t a T y p e = " T e x t " > C u s t o m e r A d d r e s s 8 < / C u s t o m e r A d d r e s s 8 > - 
-         < C u s t o m e r P o s t a l B a r C o d e   E l e m e n t T y p e = " C o l u m n "   E l e m e n t I d = " 3 9 8 5 8 0 6 8 8 "   D a t a T y p e = " T e x t " > C u s t o m e r P o s t a l B a r C o d e < / C u s t o m e r P o s t a l B a r C o d e > - 
-         < D o c u m e n t D a t e   E l e m e n t T y p e = " C o l u m n "   E l e m e n t I d = " 5 5 2 8 7 1 9 1 4 "   D a t a T y p e = " S t r i n g " > D o c u m e n t D a t e < / D o c u m e n t D a t e > - 
-         < D o c u m e n t D a t e _ L b l   E l e m e n t T y p e = " C o l u m n "   E l e m e n t I d = " 1 0 2 6 4 9 4 8 3 "   D a t a T y p e = " S t r i n g " > D o c u m e n t D a t e _ L b l < / D o c u m e n t D a t e _ L b l > - 
-         < D o c u m e n t N o   E l e m e n t T y p e = " C o l u m n "   E l e m e n t I d = " 9 7 0 3 5 0 5 3 9 "   D a t a T y p e = " C o d e " > D o c u m e n t N o < / D o c u m e n t N o > - 
-         < D o c u m e n t N o _ L b l   E l e m e n t T y p e = " C o l u m n "   E l e m e n t I d = " 7 8 9 7 9 5 9 7 8 "   D a t a T y p e = " T e x t " > D o c u m e n t N o _ L b l < / D o c u m e n t N o _ L b l > - 
-         < D o c u m e n t T i t l e _ L b l   E l e m e n t T y p e = " C o l u m n "   E l e m e n t I d = " 8 5 8 4 2 3 9 2 9 "   D a t a T y p e = " T e x t " > D o c u m e n t T i t l e _ L b l < / D o c u m e n t T i t l e _ L b l > - 
-         < D u e D a t e   E l e m e n t T y p e = " C o l u m n "   E l e m e n t I d = " 7 4 5 1 7 0 2 0 3 "   D a t a T y p e = " S t r i n g " > D u e D a t e < / D u e D a t e > - 
-         < D u e D a t e _ L b l   E l e m e n t T y p e = " C o l u m n "   E l e m e n t I d = " 1 6 4 8 2 8 4 6 4 8 "   D a t a T y p e = " S t r i n g " > D u e D a t e _ L b l < / D u e D a t e _ L b l > - 
-         < E M a i l _ L b l   E l e m e n t T y p e = " C o l u m n "   E l e m e n t I d = " 1 4 3 8 8 6 8 0 1 2 "   D a t a T y p e = " T e x t C o n s t " > E M a i l _ L b l < / E M a i l _ L b l > - 
-         < E x c h a n g e R a t e A s T e x t   E l e m e n t T y p e = " C o l u m n "   E l e m e n t I d = " 5 9 2 9 5 5 8 4 5 "   D a t a T y p e = " T e x t " > E x c h a n g e R a t e A s T e x t < / E x c h a n g e R a t e A s T e x t > - 
-         < E x t e r n a l D o c u m e n t N o   E l e m e n t T y p e = " C o l u m n "   E l e m e n t I d = " 7 3 3 9 5 3 9 6 6 "   D a t a T y p e = " C o d e " > E x t e r n a l D o c u m e n t N o < / E x t e r n a l D o c u m e n t N o > - 
-         < E x t e r n a l D o c u m e n t N o _ _ L b l   E l e m e n t T y p e = " C o l u m n "   E l e m e n t I d = " 2 2 3 4 3 3 3 2 "   D a t a T y p e = " S t r i n g " > E x t e r n a l D o c u m e n t N o _ _ L b l < / E x t e r n a l D o c u m e n t N o _ _ L b l > - 
-         < F r o m _ L b l   E l e m e n t T y p e = " C o l u m n "   E l e m e n t I d = " 4 8 5 4 2 6 1 3 8 "   D a t a T y p e = " T e x t C o n s t " > F r o m _ L b l < / F r o m _ L b l > - 
-         < H o m e P a g e _ L b l   E l e m e n t T y p e = " C o l u m n "   E l e m e n t I d = " 1 4 3 3 5 9 2 3 0 0 "   D a t a T y p e = " T e x t C o n s t " > H o m e P a g e _ L b l < / H o m e P a g e _ L b l > - 
-         < I n v o i c e D i s c o u n t A m o u n t _ L b l   E l e m e n t T y p e = " C o l u m n "   E l e m e n t I d = " 1 5 9 3 0 1 2 7 3 6 "   D a t a T y p e = " T e x t C o n s t " > I n v o i c e D i s c o u n t A m o u n t _ L b l < / I n v o i c e D i s c o u n t A m o u n t _ L b l > - 
-         < I n v o i c e D i s c o u n t B a s e A m o u n t _ L b l   E l e m e n t T y p e = " C o l u m n "   E l e m e n t I d = " 2 0 2 9 2 6 6 8 7 5 "   D a t a T y p e = " T e x t C o n s t " > I n v o i c e D i s c o u n t B a s e A m o u n t _ L b l < / I n v o i c e D i s c o u n t B a s e A m o u n t _ L b l > - 
-         < I n v o i c e N o P o s i t i o n _ L b l   E l e m e n t T y p e = " C o l u m n "   E l e m e n t I d = " 1 4 5 8 4 6 7 4 4 1 "   D a t a T y p e = " T e x t " > I n v o i c e N o P o s i t i o n _ L b l < / I n v o i c e N o P o s i t i o n _ L b l > - 
-         < L e g a l E n t i t y T y p e   E l e m e n t T y p e = " C o l u m n "   E l e m e n t I d = " 2 0 5 1 8 7 3 5 6 3 "   D a t a T y p e = " T e x t " > L e g a l E n t i t y T y p e < / L e g a l E n t i t y T y p e > - 
-         < L e g a l E n t i t y T y p e _ L b l   E l e m e n t T y p e = " C o l u m n "   E l e m e n t I d = " 2 0 8 0 2 2 4 7 9 2 "   D a t a T y p e = " T e x t " > L e g a l E n t i t y T y p e _ L b l < / L e g a l E n t i t y T y p e _ L b l > - 
-         < L i n e A m o u n t A f t e r I n v o i c e D i s c o u n t _ L b l   E l e m e n t T y p e = " C o l u m n "   E l e m e n t I d = " 6 7 3 7 2 1 0 9 4 "   D a t a T y p e = " T e x t C o n s t " > L i n e A m o u n t A f t e r I n v o i c e D i s c o u n t _ L b l < / L i n e A m o u n t A f t e r I n v o i c e D i s c o u n t _ L b l > - 
-         < L o c a l C u r r e n c y _ L b l   E l e m e n t T y p e = " C o l u m n "   E l e m e n t I d = " 1 5 5 9 6 9 3 4 2 2 "   D a t a T y p e = " T e x t C o n s t " > L o c a l C u r r e n c y _ L b l < / L o c a l C u r r e n c y _ L b l > - 
-         < P a g e _ L b l   E l e m e n t T y p e = " C o l u m n "   E l e m e n t I d = " 6 8 0 6 4 8 0 9 1 "   D a t a T y p e = " T e x t C o n s t " > P a g e _ L b l < / P a g e _ L b l > - 
-         < P a y m e n t I n s t r u c t i o n s _ T x t   E l e m e n t T y p e = " C o l u m n "   E l e m e n t I d = " 1 8 7 2 0 8 8 3 "   D a t a T y p e = " T e x t " > P a y m e n t I n s t r u c t i o n s _ T x t < / P a y m e n t I n s t r u c t i o n s _ T x t > - 
-         < P a y m e n t M e t h o d D e s c r i p t i o n   E l e m e n t T y p e = " C o l u m n "   E l e m e n t I d = " 5 8 5 7 5 7 9 7 4 "   D a t a T y p e = " T e x t " > P a y m e n t M e t h o d D e s c r i p t i o n < / P a y m e n t M e t h o d D e s c r i p t i o n > - 
-         < P a y m e n t M e t h o d D e s c r i p t i o n _ L b l   E l e m e n t T y p e = " C o l u m n "   E l e m e n t I d = " 7 9 7 1 1 7 3 2 3 "   D a t a T y p e = " T e x t C o n s t " > P a y m e n t M e t h o d D e s c r i p t i o n _ L b l < / P a y m e n t M e t h o d D e s c r i p t i o n _ L b l > - 
-         < P a y m e n t T e r m s D e s c r i p t i o n   E l e m e n t T y p e = " C o l u m n "   E l e m e n t I d = " 2 0 3 8 7 4 2 7 0 0 "   D a t a T y p e = " T e x t " > P a y m e n t T e r m s D e s c r i p t i o n < / P a y m e n t T e r m s D e s c r i p t i o n > - 
-         < P a y m e n t T e r m s D e s c r i p t i o n _ L b l   E l e m e n t T y p e = " C o l u m n "   E l e m e n t I d = " 1 8 7 4 4 9 4 3 2 1 "   D a t a T y p e = " T e x t C o n s t " > P a y m e n t T e r m s D e s c r i p t i o n _ L b l < / P a y m e n t T e r m s D e s c r i p t i o n _ L b l > - 
-         < P r i c e s I n c l u d i n g V A T   E l e m e n t T y p e = " C o l u m n "   E l e m e n t I d = " 5 1 8 8 1 7 1 6 7 "   D a t a T y p e = " B o o l e a n " > P r i c e s I n c l u d i n g V A T < / P r i c e s I n c l u d i n g V A T > - 
-         < P r i c e s I n c l u d i n g V A T _ L b l   E l e m e n t T y p e = " C o l u m n "   E l e m e n t I d = " 1 3 7 7 9 7 9 4 4 4 "   D a t a T y p e = " S t r i n g " > P r i c e s I n c l u d i n g V A T _ L b l < / P r i c e s I n c l u d i n g V A T _ L b l > - 
-         < P r i c e s I n c l u d i n g V A T Y e s N o   E l e m e n t T y p e = " C o l u m n "   E l e m e n t I d = " 1 4 1 1 1 4 7 5 9 9 "   D a t a T y p e = " S t r i n g " > P r i c e s I n c l u d i n g V A T Y e s N o < / P r i c e s I n c l u d i n g V A T Y e s N o > - 
-         < Q u e s t i o n s _ L b l   E l e m e n t T y p e = " C o l u m n "   E l e m e n t I d = " 2 0 7 0 8 9 0 0 1 9 "   D a t a T y p e = " T e x t C o n s t " > Q u e s t i o n s _ L b l < / Q u e s t i o n s _ L b l > - 
-         < S a l e s I n v o i c e L i n e D i s c o u n t _ L b l   E l e m e n t T y p e = " C o l u m n "   E l e m e n t I d = " 6 6 4 6 0 1 5 8 2 "   D a t a T y p e = " T e x t C o n s t " > S a l e s I n v o i c e L i n e D i s c o u n t _ L b l < / S a l e s I n v o i c e L i n e D i s c o u n t _ L b l > - 
-         < S a l e s P e r s o n _ L b l   E l e m e n t T y p e = " C o l u m n "   E l e m e n t I d = " 1 5 6 4 1 9 6 3 6 5 "   D a t a T y p e = " T e x t C o n s t " > S a l e s P e r s o n _ L b l < / S a l e s P e r s o n _ L b l > - 
-         < S a l e s P e r s o n B l a n k _ L b l   E l e m e n t T y p e = " C o l u m n "   E l e m e n t I d = " 6 5 4 6 2 4 6 0 1 "   D a t a T y p e = " T e x t " > S a l e s P e r s o n B l a n k _ L b l < / S a l e s P e r s o n B l a n k _ L b l > - 
-         < S a l e s P e r s o n N a m e   E l e m e n t T y p e = " C o l u m n "   E l e m e n t I d = " 8 7 1 4 9 2 9 8 3 "   D a t a T y p e = " T e x t " > S a l e s P e r s o n N a m e < / S a l e s P e r s o n N a m e > - 
-         < S e l l T o C o n t a c t E m a i l   E l e m e n t T y p e = " C o l u m n "   E l e m e n t I d = " 2 6 2 8 2 4 5 6 4 "   D a t a T y p e = " T e x t " > S e l l T o C o n t a c t E m a i l < / S e l l T o C o n t a c t E m a i l > - 
-         < S e l l T o C o n t a c t E m a i l L b l   E l e m e n t T y p e = " C o l u m n "   E l e m e n t I d = " 3 7 0 9 2 0 3 7 4 "   D a t a T y p e = " T e x t C o n s t " > S e l l T o C o n t a c t E m a i l L b l < / S e l l T o C o n t a c t E m a i l L b l > - 
-         < S e l l T o C o n t a c t M o b i l e P h o n e N o   E l e m e n t T y p e = " C o l u m n "   E l e m e n t I d = " 1 8 4 3 5 8 7 4 7 "   D a t a T y p e = " T e x t " > S e l l T o C o n t a c t M o b i l e P h o n e N o < / S e l l T o C o n t a c t M o b i l e P h o n e N o > - 
-         < S e l l T o C o n t a c t M o b i l e P h o n e N o L b l   E l e m e n t T y p e = " C o l u m n "   E l e m e n t I d = " 1 4 5 7 5 2 8 4 1 7 "   D a t a T y p e = " T e x t C o n s t " > S e l l T o C o n t a c t M o b i l e P h o n e N o L b l < / S e l l T o C o n t a c t M o b i l e P h o n e N o L b l > - 
-         < S e l l T o C o n t a c t P h o n e N o   E l e m e n t T y p e = " C o l u m n "   E l e m e n t I d = " 1 6 1 3 8 2 2 4 8 3 "   D a t a T y p e = " T e x t " > S e l l T o C o n t a c t P h o n e N o < / S e l l T o C o n t a c t P h o n e N o > - 
-         < S e l l T o C o n t a c t P h o n e N o L b l   E l e m e n t T y p e = " C o l u m n "   E l e m e n t I d = " 1 0 5 0 6 8 6 8 0 9 "   D a t a T y p e = " T e x t C o n s t " > S e l l T o C o n t a c t P h o n e N o L b l < / S e l l T o C o n t a c t P h o n e N o L b l > - 
-         < S e l l t o C u s t o m e r N o   E l e m e n t T y p e = " C o l u m n "   E l e m e n t I d = " 2 0 5 0 6 4 7 3 4 9 "   D a t a T y p e = " C o d e " > S e l l t o C u s t o m e r N o < / S e l l t o C u s t o m e r N o > - 
-         < S e l l t o C u s t o m e r N o _ L b l   E l e m e n t T y p e = " C o l u m n "   E l e m e n t I d = " 2 9 8 3 8 1 5 1 2 "   D a t a T y p e = " S t r i n g " > S e l l t o C u s t o m e r N o _ L b l < / S e l l t o C u s t o m e r N o _ L b l > - 
-         < S h i p m e n t _ L b l   E l e m e n t T y p e = " C o l u m n "   E l e m e n t I d = " 2 0 8 5 7 6 7 1 2 0 "   D a t a T y p e = " T e x t C o n s t " > S h i p m e n t _ L b l < / S h i p m e n t _ L b l > - 
-         < S h i p m e n t M e t h o d D e s c r i p t i o n   E l e m e n t T y p e = " C o l u m n "   E l e m e n t I d = " 2 0 5 9 4 0 3 2 6 0 "   D a t a T y p e = " T e x t " > S h i p m e n t M e t h o d D e s c r i p t i o n < / S h i p m e n t M e t h o d D e s c r i p t i o n > - 
-         < S h i p m e n t M e t h o d D e s c r i p t i o n _ L b l   E l e m e n t T y p e = " C o l u m n "   E l e m e n t I d = " 1 1 7 9 9 7 8 4 6 5 "   D a t a T y p e = " T e x t C o n s t " > S h i p m e n t M e t h o d D e s c r i p t i o n _ L b l < / S h i p m e n t M e t h o d D e s c r i p t i o n _ L b l > - 
-         < S h i p T o A d d r e s s _ L b l   E l e m e n t T y p e = " C o l u m n "   E l e m e n t I d = " 1 6 5 0 5 0 5 0 1 7 "   D a t a T y p e = " T e x t C o n s t " > S h i p T o A d d r e s s _ L b l < / S h i p T o A d d r e s s _ L b l > - 
-         < S h i p T o A d d r e s s 1   E l e m e n t T y p e = " C o l u m n "   E l e m e n t I d = " 1 3 5 7 6 7 2 8 6 1 "   D a t a T y p e = " T e x t " > S h i p T o A d d r e s s 1 < / S h i p T o A d d r e s s 1 > - 
-         < S h i p T o A d d r e s s 2   E l e m e n t T y p e = " C o l u m n "   E l e m e n t I d = " 1 0 2 4 2 0 4 5 8 4 "   D a t a T y p e = " T e x t " > S h i p T o A d d r e s s 2 < / S h i p T o A d d r e s s 2 > - 
-         < S h i p T o A d d r e s s 3   E l e m e n t T y p e = " C o l u m n "   E l e m e n t I d = " 1 6 6 1 9 0 1 2 0 1 "   D a t a T y p e = " T e x t " > S h i p T o A d d r e s s 3 < / S h i p T o A d d r e s s 3 > - 
-         < S h i p T o A d d r e s s 4   E l e m e n t T y p e = " C o l u m n "   E l e m e n t I d = " 5 5 5 4 1 6 9 9 0 "   D a t a T y p e = " T e x t " > S h i p T o A d d r e s s 4 < / S h i p T o A d d r e s s 4 > - 
-         < S h i p T o A d d r e s s 5   E l e m e n t T y p e = " C o l u m n "   E l e m e n t I d = " 1 1 9 3 1 1 3 6 0 7 "   D a t a T y p e = " T e x t " > S h i p T o A d d r e s s 5 < / S h i p T o A d d r e s s 5 > - 
-         < S h i p T o A d d r e s s 6   E l e m e n t T y p e = " C o l u m n "   E l e m e n t I d = " 7 1 9 9 7 6 2 4 4 "   D a t a T y p e = " T e x t " > S h i p T o A d d r e s s 6 < / S h i p T o A d d r e s s 6 > - 
-         < S h i p T o A d d r e s s 7   E l e m e n t T y p e = " C o l u m n "   E l e m e n t I d = " 8 2 2 7 9 6 2 7 "   D a t a T y p e = " T e x t " > S h i p T o A d d r e s s 7 < / S h i p T o A d d r e s s 7 > - 
-         < S h i p T o A d d r e s s 8   E l e m e n t T y p e = " C o l u m n "   E l e m e n t I d = " 1 4 9 2 9 9 2 1 7 8 "   D a t a T y p e = " T e x t " > S h i p T o A d d r e s s 8 < / S h i p T o A d d r e s s 8 > - 
-         < S h i p T o P h o n e N o   E l e m e n t T y p e = " C o l u m n "   E l e m e n t I d = " 3 6 9 7 0 2 2 5 5 "   D a t a T y p e = " T e x t " > S h i p T o P h o n e N o < / S h i p T o P h o n e N o > - 
-         < S h o w S h i p p i n g A d d r e s s   E l e m e n t T y p e = " C o l u m n "   E l e m e n t I d = " 1 1 2 0 0 7 1 2 6 6 "   D a t a T y p e = " B o o l e a n " > S h o w S h i p p i n g A d d r e s s < / S h o w S h i p p i n g A d d r e s s > - 
-         < S h o w W o r k D e s c r i p t i o n   E l e m e n t T y p e = " C o l u m n "   E l e m e n t I d = " 7 8 5 4 6 8 8 6 5 "   D a t a T y p e = " B o o l e a n " > S h o w W o r k D e s c r i p t i o n < / S h o w W o r k D e s c r i p t i o n > - 
-         < S u b t o t a l _ L b l   E l e m e n t T y p e = " C o l u m n "   E l e m e n t I d = " 1 9 6 7 7 9 5 1 4 2 "   D a t a T y p e = " T e x t C o n s t " > S u b t o t a l _ L b l < / S u b t o t a l _ L b l > - 
-         < T h a n k s _ L b l   E l e m e n t T y p e = " C o l u m n "   E l e m e n t I d = " 2 1 0 3 3 0 5 5 2 5 "   D a t a T y p e = " T e x t C o n s t " > T h a n k s _ L b l < / T h a n k s _ L b l > - 
-         < T o t a l _ L b l   E l e m e n t T y p e = " C o l u m n "   E l e m e n t I d = " 1 2 1 0 1 0 0 8 7 8 "   D a t a T y p e = " T e x t C o n s t " > T o t a l _ L b l < / T o t a l _ L b l > - 
-         < V A T A m o u n t _ L b l   E l e m e n t T y p e = " C o l u m n "   E l e m e n t I d = " 1 0 9 4 6 5 7 2 9 "   D a t a T y p e = " T e x t C o n s t " > V A T A m o u n t _ L b l < / V A T A m o u n t _ L b l > - 
-         < V A T A m o u n t S p e c i f i c a t i o n _ L b l   E l e m e n t T y p e = " C o l u m n "   E l e m e n t I d = " 8 7 8 7 0 6 8 4 6 "   D a t a T y p e = " T e x t C o n s t " > V A T A m o u n t S p e c i f i c a t i o n _ L b l < / V A T A m o u n t S p e c i f i c a t i o n _ L b l > - 
-         < V A T B a s e _ L b l   E l e m e n t T y p e = " C o l u m n "   E l e m e n t I d = " 1 8 6 6 1 5 8 2 7 8 "   D a t a T y p e = " T e x t C o n s t " > V A T B a s e _ L b l < / V A T B a s e _ L b l > - 
-         < V A T C l a u s e _ L b l   E l e m e n t T y p e = " C o l u m n "   E l e m e n t I d = " 1 5 7 0 4 9 5 4 9 0 "   D a t a T y p e = " S t r i n g " > V A T C l a u s e _ L b l < / V A T C l a u s e _ L b l > - 
-         < V A T C l a u s e s _ L b l   E l e m e n t T y p e = " C o l u m n "   E l e m e n t I d = " 1 3 8 3 9 2 0 0 1 9 "   D a t a T y p e = " T e x t C o n s t " > V A T C l a u s e s _ L b l < / V A T C l a u s e s _ L b l > - 
-         < V A T I d e n t i f i e r _ L b l   E l e m e n t T y p e = " C o l u m n "   E l e m e n t I d = " 1 6 8 6 6 2 3 9 8 4 "   D a t a T y p e = " T e x t C o n s t " > V A T I d e n t i f i e r _ L b l < / V A T I d e n t i f i e r _ L b l > - 
-         < V A T P e r c e n t a g e _ L b l   E l e m e n t T y p e = " C o l u m n "   E l e m e n t I d = " 6 7 6 6 5 4 5 6 5 "   D a t a T y p e = " T e x t C o n s t " > V A T P e r c e n t a g e _ L b l < / V A T P e r c e n t a g e _ L b l > - 
-         < V A T R e g i s t r a t i o n N o   E l e m e n t T y p e = " C o l u m n "   E l e m e n t I d = " 1 8 8 9 1 9 5 4 0 2 "   D a t a T y p e = " T e x t " > V A T R e g i s t r a t i o n N o < / V A T R e g i s t r a t i o n N o > - 
-         < V A T R e g i s t r a t i o n N o _ L b l   E l e m e n t T y p e = " C o l u m n "   E l e m e n t I d = " 1 4 2 4 6 1 6 0 8 5 "   D a t a T y p e = " T e x t " > V A T R e g i s t r a t i o n N o _ L b l < / V A T R e g i s t r a t i o n N o _ L b l > - 
-         < Y o u r D o c u m e n t T i t l e _ L b l   E l e m e n t T y p e = " C o l u m n "   E l e m e n t I d = " 1 8 2 1 7 1 6 9 3 4 "   D a t a T y p e = " T e x t " > Y o u r D o c u m e n t T i t l e _ L b l < / Y o u r D o c u m e n t T i t l e _ L b l > - 
-         < Y o u r R e f e r e n c e   E l e m e n t T y p e = " C o l u m n "   E l e m e n t I d = " 1 1 0 3 9 9 5 1 "   D a t a T y p e = " T e x t " > Y o u r R e f e r e n c e < / Y o u r R e f e r e n c e > - 
-         < Y o u r R e f e r e n c e _ _ L b l   E l e m e n t T y p e = " C o l u m n "   E l e m e n t I d = " 1 1 2 6 2 8 0 3 7 1 "   D a t a T y p e = " S t r i n g " > Y o u r R e f e r e n c e _ _ L b l < / Y o u r R e f e r e n c e _ _ L b l > - 
-         < L i n e   E l e m e n t T y p e = " D a t a I t e m "   E l e m e n t I d = " 4 1 1 9 7 6 1 3 3 " > - 
-             < A m o u n t E x c l u d i n g V A T _ L i n e   E l e m e n t T y p e = " C o l u m n "   E l e m e n t I d = " 1 0 6 2 4 6 0 0 4 0 "   D a t a T y p e = " D e c i m a l " > A m o u n t E x c l u d i n g V A T _ L i n e < / A m o u n t E x c l u d i n g V A T _ L i n e > - 
-             < A m o u n t E x c l u d i n g V A T _ L i n e _ L b l   E l e m e n t T y p e = " C o l u m n "   E l e m e n t I d = " 2 0 0 2 8 7 4 4 7 5 "   D a t a T y p e = " S t r i n g " > A m o u n t E x c l u d i n g V A T _ L i n e _ L b l < / A m o u n t E x c l u d i n g V A T _ L i n e _ L b l > - 
-             < A m o u n t I n c l u d i n g V A T _ L i n e   E l e m e n t T y p e = " C o l u m n "   E l e m e n t I d = " 7 7 0 9 2 8 4 0 2 "   D a t a T y p e = " D e c i m a l " > A m o u n t I n c l u d i n g V A T _ L i n e < / A m o u n t I n c l u d i n g V A T _ L i n e > - 
-             < A m o u n t I n c l u d i n g V A T _ L i n e _ L b l   E l e m e n t T y p e = " C o l u m n "   E l e m e n t I d = " 9 3 0 7 4 7 3 1 3 "   D a t a T y p e = " S t r i n g " > A m o u n t I n c l u d i n g V A T _ L i n e _ L b l < / A m o u n t I n c l u d i n g V A T _ L i n e _ L b l > - 
-             < D e s c r i p t i o n _ L i n e   E l e m e n t T y p e = " C o l u m n "   E l e m e n t I d = " 1 4 0 6 8 2 2 3 1 0 "   D a t a T y p e = " T e x t " > D e s c r i p t i o n _ L i n e < / D e s c r i p t i o n _ L i n e > - 
-             < D e s c r i p t i o n _ L i n e _ L b l   E l e m e n t T y p e = " C o l u m n "   E l e m e n t I d = " 2 1 1 8 9 5 1 4 9 5 "   D a t a T y p e = " S t r i n g " > D e s c r i p t i o n _ L i n e _ L b l < / D e s c r i p t i o n _ L i n e _ L b l > - 
-             < I t e m N o _ L i n e   E l e m e n t T y p e = " C o l u m n "   E l e m e n t I d = " 1 9 1 0 2 9 6 2 8 8 "   D a t a T y p e = " C o d e " > I t e m N o _ L i n e < / I t e m N o _ L i n e > - 
-             < I t e m N o _ L i n e _ L b l   E l e m e n t T y p e = " C o l u m n "   E l e m e n t I d = " 1 3 4 0 0 7 9 6 1 3 "   D a t a T y p e = " S t r i n g " > I t e m N o _ L i n e _ L b l < / I t e m N o _ L i n e _ L b l > - 
-             < I t e m R e f e r e n c e N o _ L i n e   E l e m e n t T y p e = " C o l u m n "   E l e m e n t I d = " 9 2 7 2 3 5 7 "   D a t a T y p e = " C o d e " > I t e m R e f e r e n c e N o _ L i n e < / I t e m R e f e r e n c e N o _ L i n e > - 
-             < I t e m R e f e r e n c e N o _ L i n e _ L b l   E l e m e n t T y p e = " C o l u m n "   E l e m e n t I d = " 1 9 8 0 6 3 1 1 3 0 "   D a t a T y p e = " S t r i n g " > I t e m R e f e r e n c e N o _ L i n e _ L b l < / I t e m R e f e r e n c e N o _ L i n e _ L b l > - 
-             < L i n e A m o u n t _ L i n e   E l e m e n t T y p e = " C o l u m n "   E l e m e n t I d = " 2 6 8 9 3 7 1 6 2 "   D a t a T y p e = " T e x t " > L i n e A m o u n t _ L i n e < / L i n e A m o u n t _ L i n e > - 
-             < L i n e A m o u n t _ L i n e _ L b l   E l e m e n t T y p e = " C o l u m n "   E l e m e n t I d = " 9 9 2 9 0 1 8 4 5 "   D a t a T y p e = " S t r i n g " > L i n e A m o u n t _ L i n e _ L b l < / L i n e A m o u n t _ L i n e _ L b l > - 
-             < L i n e D i s c o u n t P e r c e n t _ L i n e   E l e m e n t T y p e = " C o l u m n "   E l e m e n t I d = " 9 0 7 8 2 7 4 3 6 "   D a t a T y p e = " D e c i m a l " > L i n e D i s c o u n t P e r c e n t _ L i n e < / L i n e D i s c o u n t P e r c e n t _ L i n e > - 
-             < L i n e D i s c o u n t P e r c e n t T e x t _ L i n e   E l e m e n t T y p e = " C o l u m n "   E l e m e n t I d = " 6 1 3 1 3 5 1 9 "   D a t a T y p e = " T e x t " > L i n e D i s c o u n t P e r c e n t T e x t _ L i n e < / L i n e D i s c o u n t P e r c e n t T e x t _ L i n e > - 
-             < L i n e N o _ L i n e   E l e m e n t T y p e = " C o l u m n "   E l e m e n t I d = " 6 9 8 9 8 5 9 7 9 "   D a t a T y p e = " I n t e g e r " > L i n e N o _ L i n e < / L i n e N o _ L i n e > - 
-             < P r i c e _ L b l   E l e m e n t T y p e = " C o l u m n "   E l e m e n t I d = " 2 1 2 6 7 6 4 9 2 5 "   D a t a T y p e = " T e x t C o n s t " > P r i c e _ L b l < / P r i c e _ L b l > - 
-             < P r i c e P e r _ L b l   E l e m e n t T y p e = " C o l u m n "   E l e m e n t I d = " 9 7 3 2 8 0 1 3 4 "   D a t a T y p e = " T e x t C o n s t " > P r i c e P e r _ L b l < / P r i c e P e r _ L b l > - 
-             < Q t y _ L b l   E l e m e n t T y p e = " C o l u m n "   E l e m e n t I d = " 2 6 3 6 7 3 7 6 4 "   D a t a T y p e = " T e x t C o n s t " > Q t y _ L b l < / Q t y _ L b l > - 
-             < Q u a n t i t y _ L i n e   E l e m e n t T y p e = " C o l u m n "   E l e m e n t I d = " 1 0 6 8 5 4 3 5 3 7 "   D a t a T y p e = " T e x t " > Q u a n t i t y _ L i n e < / Q u a n t i t y _ L i n e > - 
-             < Q u a n t i t y _ L i n e _ L b l   E l e m e n t T y p e = " C o l u m n "   E l e m e n t I d = " 2 0 3 4 5 0 6 8 0 2 "   D a t a T y p e = " S t r i n g " > Q u a n t i t y _ L i n e _ L b l < / Q u a n t i t y _ L i n e _ L b l > - 
-             < S h i p m e n t D a t e _ L b l   E l e m e n t T y p e = " C o l u m n "   E l e m e n t I d = " 6 1 4 4 0 0 3 6 4 "   D a t a T y p e = " T e x t C o n s t " > S h i p m e n t D a t e _ L b l < / S h i p m e n t D a t e _ L b l > - 
-             < S h i p m e n t D a t e _ L i n e   E l e m e n t T y p e = " C o l u m n "   E l e m e n t I d = " 1 6 7 3 3 7 5 4 1 6 "   D a t a T y p e = " S t r i n g " > S h i p m e n t D a t e _ L i n e < / S h i p m e n t D a t e _ L i n e > - 
-             < T r a n s H e a d e r A m o u n t   E l e m e n t T y p e = " C o l u m n "   E l e m e n t I d = " 2 0 2 8 3 0 6 2 7 6 "   D a t a T y p e = " D e c i m a l " > T r a n s H e a d e r A m o u n t < / T r a n s H e a d e r A m o u n t > - 
-             < T y p e _ L i n e   E l e m e n t T y p e = " C o l u m n "   E l e m e n t I d = " 2 7 2 8 0 4 9 2 4 "   D a t a T y p e = " S t r i n g " > T y p e _ L i n e < / T y p e _ L i n e > - 
-             < U n i t _ L b l   E l e m e n t T y p e = " C o l u m n "   E l e m e n t I d = " 8 1 4 3 6 4 3 1 8 "   D a t a T y p e = " T e x t C o n s t " > U n i t _ L b l < / U n i t _ L b l > - 
-             < U n i t O f M e a s u r e   E l e m e n t T y p e = " C o l u m n "   E l e m e n t I d = " 1 8 0 8 2 2 8 0 1 8 "   D a t a T y p e = " T e x t " > U n i t O f M e a s u r e < / U n i t O f M e a s u r e > - 
-             < U n i t O f M e a s u r e _ L b l   E l e m e n t T y p e = " C o l u m n "   E l e m e n t I d = " 9 8 1 9 5 1 2 4 9 "   D a t a T y p e = " S t r i n g " > U n i t O f M e a s u r e _ L b l < / U n i t O f M e a s u r e _ L b l > - 
-             < U n i t P r i c e   E l e m e n t T y p e = " C o l u m n "   E l e m e n t I d = " 1 4 7 8 2 2 1 5 2 6 "   D a t a T y p e = " T e x t " > U n i t P r i c e < / U n i t P r i c e > - 
-             < U n i t P r i c e _ L b l   E l e m e n t T y p e = " C o l u m n "   E l e m e n t I d = " 1 1 6 3 9 2 6 6 0 3 "   D a t a T y p e = " S t r i n g " > U n i t P r i c e _ L b l < / U n i t P r i c e _ L b l > - 
-             < V A T I d e n t i f i e r _ L i n e   E l e m e n t T y p e = " C o l u m n "   E l e m e n t I d = " 1 7 7 3 6 2 2 4 1 2 "   D a t a T y p e = " C o d e " > V A T I d e n t i f i e r _ L i n e < / V A T I d e n t i f i e r _ L i n e > - 
-             < V A T I d e n t i f i e r _ L i n e _ L b l   E l e m e n t T y p e = " C o l u m n "   E l e m e n t I d = " 5 3 3 7 8 2 7 0 3 "   D a t a T y p e = " S t r i n g " > V A T I d e n t i f i e r _ L i n e _ L b l < / V A T I d e n t i f i e r _ L i n e _ L b l > - 
-             < V A T P c t _ L i n e   E l e m e n t T y p e = " C o l u m n "   E l e m e n t I d = " 1 9 7 4 0 0 1 9 4 4 "   D a t a T y p e = " T e x t " > V A T P c t _ L i n e < / V A T P c t _ L i n e > - 
-             < V A T P c t _ L i n e _ L b l   E l e m e n t T y p e = " C o l u m n "   E l e m e n t I d = " 1 2 0 7 5 2 9 9 1 5 "   D a t a T y p e = " S t r i n g " > V A T P c t _ L i n e _ L b l < / V A T P c t _ L i n e _ L b l > +     < H e a d e r > + 
+         < B i l l e d T o _ L b l > B i l l e d T o _ L b l < / B i l l e d T o _ L b l > + 
+         < B i l l T o C o n t a c t E m a i l > B i l l T o C o n t a c t E m a i l < / B i l l T o C o n t a c t E m a i l > + 
+         < B i l l T o C o n t a c t E m a i l L b l > B i l l T o C o n t a c t E m a i l L b l < / B i l l T o C o n t a c t E m a i l L b l > + 
+         < B i l l T o C o n t a c t M o b i l e P h o n e N o > B i l l T o C o n t a c t M o b i l e P h o n e N o < / B i l l T o C o n t a c t M o b i l e P h o n e N o > + 
+         < B i l l T o C o n t a c t M o b i l e P h o n e N o L b l > B i l l T o C o n t a c t M o b i l e P h o n e N o L b l < / B i l l T o C o n t a c t M o b i l e P h o n e N o L b l > + 
+         < B i l l T o C o n t a c t P h o n e N o > B i l l T o C o n t a c t P h o n e N o < / B i l l T o C o n t a c t P h o n e N o > + 
+         < B i l l T o C o n t a c t P h o n e N o L b l > B i l l T o C o n t a c t P h o n e N o L b l < / B i l l T o C o n t a c t P h o n e N o L b l > + 
+         < B i l l t o C u s t o m e r N o _ L b l > B i l l t o C u s t o m e r N o _ L b l < / B i l l t o C u s t o m e r N o _ L b l > + 
+         < B i l l t o C u s t u m e r N o > B i l l t o C u s t u m e r N o < / B i l l t o C u s t u m e r N o > + 
+         < C h e c k s P a y a b l e _ L b l > C h e c k s P a y a b l e _ L b l < / C h e c k s P a y a b l e _ L b l > + 
+         < C o m p a n y A d d r e s s 1 > C o m p a n y A d d r e s s 1 < / C o m p a n y A d d r e s s 1 > + 
+         < C o m p a n y A d d r e s s 2 > C o m p a n y A d d r e s s 2 < / C o m p a n y A d d r e s s 2 > + 
+         < C o m p a n y A d d r e s s 3 > C o m p a n y A d d r e s s 3 < / C o m p a n y A d d r e s s 3 > + 
+         < C o m p a n y A d d r e s s 4 > C o m p a n y A d d r e s s 4 < / C o m p a n y A d d r e s s 4 > + 
+         < C o m p a n y A d d r e s s 5 > C o m p a n y A d d r e s s 5 < / C o m p a n y A d d r e s s 5 > + 
+         < C o m p a n y A d d r e s s 6 > C o m p a n y A d d r e s s 6 < / C o m p a n y A d d r e s s 6 > + 
+         < C o m p a n y A d d r e s s 7 > C o m p a n y A d d r e s s 7 < / C o m p a n y A d d r e s s 7 > + 
+         < C o m p a n y A d d r e s s 8 > C o m p a n y A d d r e s s 8 < / C o m p a n y A d d r e s s 8 > + 
+         < C o m p a n y B a n k A c c o u n t N o > C o m p a n y B a n k A c c o u n t N o < / C o m p a n y B a n k A c c o u n t N o > + 
+         < C o m p a n y B a n k A c c o u n t N o _ L b l > C o m p a n y B a n k A c c o u n t N o _ L b l < / C o m p a n y B a n k A c c o u n t N o _ L b l > + 
+         < C o m p a n y B a n k B r a n c h N o > C o m p a n y B a n k B r a n c h N o < / C o m p a n y B a n k B r a n c h N o > + 
+         < C o m p a n y B a n k B r a n c h N o _ L b l > C o m p a n y B a n k B r a n c h N o _ L b l < / C o m p a n y B a n k B r a n c h N o _ L b l > + 
+         < C o m p a n y B a n k N a m e > C o m p a n y B a n k N a m e < / C o m p a n y B a n k N a m e > + 
+         < C o m p a n y B a n k N a m e _ L b l > C o m p a n y B a n k N a m e _ L b l < / C o m p a n y B a n k N a m e _ L b l > + 
+         < C o m p a n y C u s t o m G i r o > C o m p a n y C u s t o m G i r o < / C o m p a n y C u s t o m G i r o > + 
+         < C o m p a n y C u s t o m G i r o _ L b l > C o m p a n y C u s t o m G i r o _ L b l < / C o m p a n y C u s t o m G i r o _ L b l > + 
+         < C o m p a n y E M a i l > C o m p a n y E M a i l < / C o m p a n y E M a i l > + 
+         < C o m p a n y G i r o N o > C o m p a n y G i r o N o < / C o m p a n y G i r o N o > + 
+         < C o m p a n y G i r o N o _ L b l > C o m p a n y G i r o N o _ L b l < / C o m p a n y G i r o N o _ L b l > + 
+         < C o m p a n y H o m e P a g e > C o m p a n y H o m e P a g e < / C o m p a n y H o m e P a g e > + 
+         < C o m p a n y I B A N > C o m p a n y I B A N < / C o m p a n y I B A N > + 
+         < C o m p a n y I B A N _ L b l > C o m p a n y I B A N _ L b l < / C o m p a n y I B A N _ L b l > + 
+         < C o m p a n y L e g a l O f f i c e > C o m p a n y L e g a l O f f i c e < / C o m p a n y L e g a l O f f i c e > + 
+         < C o m p a n y L e g a l O f f i c e _ L b l > C o m p a n y L e g a l O f f i c e _ L b l < / C o m p a n y L e g a l O f f i c e _ L b l > + 
+         < C o m p a n y L e g a l S t a t e m e n t > C o m p a n y L e g a l S t a t e m e n t < / C o m p a n y L e g a l S t a t e m e n t > + 
+         < C o m p a n y L o g o P o s i t i o n > C o m p a n y L o g o P o s i t i o n < / C o m p a n y L o g o P o s i t i o n > + 
+         < C o m p a n y P h o n e N o > C o m p a n y P h o n e N o < / C o m p a n y P h o n e N o > + 
+         < C o m p a n y P h o n e N o _ L b l > C o m p a n y P h o n e N o _ L b l < / C o m p a n y P h o n e N o _ L b l > + 
+         < C o m p a n y P i c t u r e / > + 
+         < C o m p a n y R e g i s t r a t i o n N u m b e r > C o m p a n y R e g i s t r a t i o n N u m b e r < / C o m p a n y R e g i s t r a t i o n N u m b e r > + 
+         < C o m p a n y R e g i s t r a t i o n N u m b e r _ L b l > C o m p a n y R e g i s t r a t i o n N u m b e r _ L b l < / C o m p a n y R e g i s t r a t i o n N u m b e r _ L b l > + 
+         < C o m p a n y S W I F T > C o m p a n y S W I F T < / C o m p a n y S W I F T > + 
+         < C o m p a n y S W I F T _ L b l > C o m p a n y S W I F T _ L b l < / C o m p a n y S W I F T _ L b l > + 
+         < C o m p a n y V A T R e g i s t r a t i o n N o > C o m p a n y V A T R e g i s t r a t i o n N o < / C o m p a n y V A T R e g i s t r a t i o n N o > + 
+         < C o m p a n y V A T R e g i s t r a t i o n N o _ L b l > C o m p a n y V A T R e g i s t r a t i o n N o _ L b l < / C o m p a n y V A T R e g i s t r a t i o n N o _ L b l > + 
+         < C o m p a n y V A T R e g N o > C o m p a n y V A T R e g N o < / C o m p a n y V A T R e g N o > + 
+         < C o m p a n y V A T R e g N o _ L b l > C o m p a n y V A T R e g N o _ L b l < / C o m p a n y V A T R e g N o _ L b l > + 
+         < C o n t a c t _ L b l > C o n t a c t _ L b l < / C o n t a c t _ L b l > + 
+         < C o p y _ L b l > C o p y _ L b l < / C o p y _ L b l > + 
+         < C u s t o m e r A d d r e s s 1 > C u s t o m e r A d d r e s s 1 < / C u s t o m e r A d d r e s s 1 > + 
+         < C u s t o m e r A d d r e s s 2 > C u s t o m e r A d d r e s s 2 < / C u s t o m e r A d d r e s s 2 > + 
+         < C u s t o m e r A d d r e s s 3 > C u s t o m e r A d d r e s s 3 < / C u s t o m e r A d d r e s s 3 > + 
+         < C u s t o m e r A d d r e s s 4 > C u s t o m e r A d d r e s s 4 < / C u s t o m e r A d d r e s s 4 > + 
+         < C u s t o m e r A d d r e s s 5 > C u s t o m e r A d d r e s s 5 < / C u s t o m e r A d d r e s s 5 > + 
+         < C u s t o m e r A d d r e s s 6 > C u s t o m e r A d d r e s s 6 < / C u s t o m e r A d d r e s s 6 > + 
+         < C u s t o m e r A d d r e s s 7 > C u s t o m e r A d d r e s s 7 < / C u s t o m e r A d d r e s s 7 > + 
+         < C u s t o m e r A d d r e s s 8 > C u s t o m e r A d d r e s s 8 < / C u s t o m e r A d d r e s s 8 > + 
+         < C u s t o m e r P o s t a l B a r C o d e > C u s t o m e r P o s t a l B a r C o d e < / C u s t o m e r P o s t a l B a r C o d e > + 
+         < D o c u m e n t D a t e > D o c u m e n t D a t e < / D o c u m e n t D a t e > + 
+         < D o c u m e n t D a t e _ L b l > D o c u m e n t D a t e _ L b l < / D o c u m e n t D a t e _ L b l > + 
+         < D o c u m e n t N o > D o c u m e n t N o < / D o c u m e n t N o > + 
+         < D o c u m e n t N o _ L b l > D o c u m e n t N o _ L b l < / D o c u m e n t N o _ L b l > + 
+         < D o c u m e n t T i t l e _ L b l > D o c u m e n t T i t l e _ L b l < / D o c u m e n t T i t l e _ L b l > + 
+         < D u e D a t e > D u e D a t e < / D u e D a t e > + 
+         < D u e D a t e _ L b l > D u e D a t e _ L b l < / D u e D a t e _ L b l > + 
+         < E M a i l _ L b l > E M a i l _ L b l < / E M a i l _ L b l > + 
+         < E x c h a n g e R a t e A s T e x t > E x c h a n g e R a t e A s T e x t < / E x c h a n g e R a t e A s T e x t > + 
+         < E x t e r n a l D o c u m e n t N o > E x t e r n a l D o c u m e n t N o < / E x t e r n a l D o c u m e n t N o > + 
+         < E x t e r n a l D o c u m e n t N o _ _ L b l > E x t e r n a l D o c u m e n t N o _ _ L b l < / E x t e r n a l D o c u m e n t N o _ _ L b l > + 
+         < F r o m _ L b l > F r o m _ L b l < / F r o m _ L b l > + 
+         < H o m e P a g e _ L b l > H o m e P a g e _ L b l < / H o m e P a g e _ L b l > + 
+         < I n v o i c e D i s c o u n t A m o u n t _ L b l > I n v o i c e D i s c o u n t A m o u n t _ L b l < / I n v o i c e D i s c o u n t A m o u n t _ L b l > + 
+         < I n v o i c e D i s c o u n t B a s e A m o u n t _ L b l > I n v o i c e D i s c o u n t B a s e A m o u n t _ L b l < / I n v o i c e D i s c o u n t B a s e A m o u n t _ L b l > + 
+         < I n v o i c e N o P o s i t i o n _ L b l > I n v o i c e N o P o s i t i o n _ L b l < / I n v o i c e N o P o s i t i o n _ L b l > + 
+         < L e g a l E n t i t y T y p e > L e g a l E n t i t y T y p e < / L e g a l E n t i t y T y p e > + 
+         < L e g a l E n t i t y T y p e _ L b l > L e g a l E n t i t y T y p e _ L b l < / L e g a l E n t i t y T y p e _ L b l > + 
+         < L i n e A m o u n t A f t e r I n v o i c e D i s c o u n t _ L b l > L i n e A m o u n t A f t e r I n v o i c e D i s c o u n t _ L b l < / L i n e A m o u n t A f t e r I n v o i c e D i s c o u n t _ L b l > + 
+         < L o c a l C u r r e n c y _ L b l > L o c a l C u r r e n c y _ L b l < / L o c a l C u r r e n c y _ L b l > + 
+         < P a g e _ L b l > P a g e _ L b l < / P a g e _ L b l > + 
+         < P a y m e n t I n s t r u c t i o n s _ T x t > P a y m e n t I n s t r u c t i o n s _ T x t < / P a y m e n t I n s t r u c t i o n s _ T x t > + 
+         < P a y m e n t M e t h o d D e s c r i p t i o n > P a y m e n t M e t h o d D e s c r i p t i o n < / P a y m e n t M e t h o d D e s c r i p t i o n > + 
+         < P a y m e n t M e t h o d D e s c r i p t i o n _ L b l > P a y m e n t M e t h o d D e s c r i p t i o n _ L b l < / P a y m e n t M e t h o d D e s c r i p t i o n _ L b l > + 
+         < P a y m e n t T e r m s D e s c r i p t i o n > P a y m e n t T e r m s D e s c r i p t i o n < / P a y m e n t T e r m s D e s c r i p t i o n > + 
+         < P a y m e n t T e r m s D e s c r i p t i o n _ L b l > P a y m e n t T e r m s D e s c r i p t i o n _ L b l < / P a y m e n t T e r m s D e s c r i p t i o n _ L b l > + 
+         < P r i c e s I n c l u d i n g V A T > P r i c e s I n c l u d i n g V A T < / P r i c e s I n c l u d i n g V A T > + 
+         < P r i c e s I n c l u d i n g V A T _ L b l > P r i c e s I n c l u d i n g V A T _ L b l < / P r i c e s I n c l u d i n g V A T _ L b l > + 
+         < P r i c e s I n c l u d i n g V A T Y e s N o > P r i c e s I n c l u d i n g V A T Y e s N o < / P r i c e s I n c l u d i n g V A T Y e s N o > + 
+         < Q u e s t i o n s _ L b l > Q u e s t i o n s _ L b l < / Q u e s t i o n s _ L b l > + 
+         < S a l e s I n v o i c e L i n e D i s c o u n t _ L b l > S a l e s I n v o i c e L i n e D i s c o u n t _ L b l < / S a l e s I n v o i c e L i n e D i s c o u n t _ L b l > + 
+         < S a l e s P e r s o n _ L b l > S a l e s P e r s o n _ L b l < / S a l e s P e r s o n _ L b l > + 
+         < S a l e s P e r s o n B l a n k _ L b l > S a l e s P e r s o n B l a n k _ L b l < / S a l e s P e r s o n B l a n k _ L b l > + 
+         < S a l e s P e r s o n N a m e > S a l e s P e r s o n N a m e < / S a l e s P e r s o n N a m e > + 
+         < S e l l T o C o n t a c t E m a i l > S e l l T o C o n t a c t E m a i l < / S e l l T o C o n t a c t E m a i l > + 
+         < S e l l T o C o n t a c t E m a i l L b l > S e l l T o C o n t a c t E m a i l L b l < / S e l l T o C o n t a c t E m a i l L b l > + 
+         < S e l l T o C o n t a c t M o b i l e P h o n e N o > S e l l T o C o n t a c t M o b i l e P h o n e N o < / S e l l T o C o n t a c t M o b i l e P h o n e N o > + 
+         < S e l l T o C o n t a c t M o b i l e P h o n e N o L b l > S e l l T o C o n t a c t M o b i l e P h o n e N o L b l < / S e l l T o C o n t a c t M o b i l e P h o n e N o L b l > + 
+         < S e l l T o C o n t a c t P h o n e N o > S e l l T o C o n t a c t P h o n e N o < / S e l l T o C o n t a c t P h o n e N o > + 
+         < S e l l T o C o n t a c t P h o n e N o L b l > S e l l T o C o n t a c t P h o n e N o L b l < / S e l l T o C o n t a c t P h o n e N o L b l > + 
+         < S e l l t o C u s t o m e r N o > S e l l t o C u s t o m e r N o < / S e l l t o C u s t o m e r N o > + 
+         < S e l l t o C u s t o m e r N o _ L b l > S e l l t o C u s t o m e r N o _ L b l < / S e l l t o C u s t o m e r N o _ L b l > + 
+         < S h i p m e n t _ L b l > S h i p m e n t _ L b l < / S h i p m e n t _ L b l > + 
+         < S h i p m e n t M e t h o d D e s c r i p t i o n > S h i p m e n t M e t h o d D e s c r i p t i o n < / S h i p m e n t M e t h o d D e s c r i p t i o n > + 
+         < S h i p m e n t M e t h o d D e s c r i p t i o n _ L b l > S h i p m e n t M e t h o d D e s c r i p t i o n _ L b l < / S h i p m e n t M e t h o d D e s c r i p t i o n _ L b l > + 
+         < S h i p T o A d d r e s s _ L b l > S h i p T o A d d r e s s _ L b l < / S h i p T o A d d r e s s _ L b l > + 
+         < S h i p T o A d d r e s s 1 > S h i p T o A d d r e s s 1 < / S h i p T o A d d r e s s 1 > + 
+         < S h i p T o A d d r e s s 2 > S h i p T o A d d r e s s 2 < / S h i p T o A d d r e s s 2 > + 
+         < S h i p T o A d d r e s s 3 > S h i p T o A d d r e s s 3 < / S h i p T o A d d r e s s 3 > + 
+         < S h i p T o A d d r e s s 4 > S h i p T o A d d r e s s 4 < / S h i p T o A d d r e s s 4 > + 
+         < S h i p T o A d d r e s s 5 > S h i p T o A d d r e s s 5 < / S h i p T o A d d r e s s 5 > + 
+         < S h i p T o A d d r e s s 6 > S h i p T o A d d r e s s 6 < / S h i p T o A d d r e s s 6 > + 
+         < S h i p T o A d d r e s s 7 > S h i p T o A d d r e s s 7 < / S h i p T o A d d r e s s 7 > + 
+         < S h i p T o A d d r e s s 8 > S h i p T o A d d r e s s 8 < / S h i p T o A d d r e s s 8 > + 
+         < S h i p T o P h o n e N o > S h i p T o P h o n e N o < / S h i p T o P h o n e N o > + 
+         < S h o w S h i p p i n g A d d r e s s > S h o w S h i p p i n g A d d r e s s < / S h o w S h i p p i n g A d d r e s s > + 
+         < S h o w W o r k D e s c r i p t i o n > S h o w W o r k D e s c r i p t i o n < / S h o w W o r k D e s c r i p t i o n > + 
+         < S u b t o t a l _ L b l > S u b t o t a l _ L b l < / S u b t o t a l _ L b l > + 
+         < T h a n k s _ L b l > T h a n k s _ L b l < / T h a n k s _ L b l > + 
+         < T o t a l _ L b l > T o t a l _ L b l < / T o t a l _ L b l > + 
+         < V A T A m o u n t _ L b l > V A T A m o u n t _ L b l < / V A T A m o u n t _ L b l > + 
+         < V A T A m o u n t S p e c i f i c a t i o n _ L b l > V A T A m o u n t S p e c i f i c a t i o n _ L b l < / V A T A m o u n t S p e c i f i c a t i o n _ L b l > + 
+         < V A T B a s e _ L b l > V A T B a s e _ L b l < / V A T B a s e _ L b l > + 
+         < V A T C l a u s e _ L b l > V A T C l a u s e _ L b l < / V A T C l a u s e _ L b l > + 
+         < V A T C l a u s e s _ L b l > V A T C l a u s e s _ L b l < / V A T C l a u s e s _ L b l > + 
+         < V A T I d e n t i f i e r _ L b l > V A T I d e n t i f i e r _ L b l < / V A T I d e n t i f i e r _ L b l > + 
+         < V A T P e r c e n t a g e _ L b l > V A T P e r c e n t a g e _ L b l < / V A T P e r c e n t a g e _ L b l > + 
+         < V A T R e g i s t r a t i o n N o > V A T R e g i s t r a t i o n N o < / V A T R e g i s t r a t i o n N o > + 
+         < V A T R e g i s t r a t i o n N o _ L b l > V A T R e g i s t r a t i o n N o _ L b l < / V A T R e g i s t r a t i o n N o _ L b l > + 
+         < Y o u r D o c u m e n t T i t l e _ L b l > Y o u r D o c u m e n t T i t l e _ L b l < / Y o u r D o c u m e n t T i t l e _ L b l > + 
+         < Y o u r R e f e r e n c e > Y o u r R e f e r e n c e < / Y o u r R e f e r e n c e > + 
+         < Y o u r R e f e r e n c e _ _ L b l > Y o u r R e f e r e n c e _ _ L b l < / Y o u r R e f e r e n c e _ _ L b l > + 
+         < L i n e > + 
+             < A m o u n t E x c l u d i n g V A T _ L i n e > A m o u n t E x c l u d i n g V A T _ L i n e < / A m o u n t E x c l u d i n g V A T _ L i n e > + 
+             < A m o u n t E x c l u d i n g V A T _ L i n e _ L b l > A m o u n t E x c l u d i n g V A T _ L i n e _ L b l < / A m o u n t E x c l u d i n g V A T _ L i n e _ L b l > + 
+             < A m o u n t I n c l u d i n g V A T _ L i n e > A m o u n t I n c l u d i n g V A T _ L i n e < / A m o u n t I n c l u d i n g V A T _ L i n e > + 
+             < A m o u n t I n c l u d i n g V A T _ L i n e _ L b l > A m o u n t I n c l u d i n g V A T _ L i n e _ L b l < / A m o u n t I n c l u d i n g V A T _ L i n e _ L b l > + 
+             < D e s c r i p t i o n _ L i n e > D e s c r i p t i o n _ L i n e < / D e s c r i p t i o n _ L i n e > + 
+             < D e s c r i p t i o n _ L i n e _ L b l > D e s c r i p t i o n _ L i n e _ L b l < / D e s c r i p t i o n _ L i n e _ L b l > + 
+             < I t e m N o _ L i n e > I t e m N o _ L i n e < / I t e m N o _ L i n e > + 
+             < I t e m N o _ L i n e _ L b l > I t e m N o _ L i n e _ L b l < / I t e m N o _ L i n e _ L b l > + 
+             < I t e m R e f e r e n c e N o _ L i n e > I t e m R e f e r e n c e N o _ L i n e < / I t e m R e f e r e n c e N o _ L i n e > + 
+             < I t e m R e f e r e n c e N o _ L i n e _ L b l > I t e m R e f e r e n c e N o _ L i n e _ L b l < / I t e m R e f e r e n c e N o _ L i n e _ L b l > + 
+             < L i n e A m o u n t _ L i n e > L i n e A m o u n t _ L i n e < / L i n e A m o u n t _ L i n e > + 
+             < L i n e A m o u n t _ L i n e _ L b l > L i n e A m o u n t _ L i n e _ L b l < / L i n e A m o u n t _ L i n e _ L b l > + 
+             < L i n e D i s c o u n t P e r c e n t _ L i n e > L i n e D i s c o u n t P e r c e n t _ L i n e < / L i n e D i s c o u n t P e r c e n t _ L i n e > + 
+             < L i n e D i s c o u n t P e r c e n t T e x t _ L i n e > L i n e D i s c o u n t P e r c e n t T e x t _ L i n e < / L i n e D i s c o u n t P e r c e n t T e x t _ L i n e > + 
+             < L i n e N o _ L i n e > L i n e N o _ L i n e < / L i n e N o _ L i n e > + 
+             < P r i c e _ L b l > P r i c e _ L b l < / P r i c e _ L b l > + 
+             < P r i c e P e r _ L b l > P r i c e P e r _ L b l < / P r i c e P e r _ L b l > + 
+             < Q t y _ L b l > Q t y _ L b l < / Q t y _ L b l > + 
+             < Q u a n t i t y _ L i n e > Q u a n t i t y _ L i n e < / Q u a n t i t y _ L i n e > + 
+             < Q u a n t i t y _ L i n e _ L b l > Q u a n t i t y _ L i n e _ L b l < / Q u a n t i t y _ L i n e _ L b l > + 
+             < S h i p m e n t D a t e _ L b l > S h i p m e n t D a t e _ L b l < / S h i p m e n t D a t e _ L b l > + 
+             < S h i p m e n t D a t e _ L i n e > S h i p m e n t D a t e _ L i n e < / S h i p m e n t D a t e _ L i n e > + 
+             < T r a n s H e a d e r A m o u n t > T r a n s H e a d e r A m o u n t < / T r a n s H e a d e r A m o u n t > + 
+             < T y p e _ L i n e > T y p e _ L i n e < / T y p e _ L i n e > + 
+             < U n i t _ L b l > U n i t _ L b l < / U n i t _ L b l > + 
+             < U n i t O f M e a s u r e > U n i t O f M e a s u r e < / U n i t O f M e a s u r e > + 
+             < U n i t O f M e a s u r e _ L b l > U n i t O f M e a s u r e _ L b l < / U n i t O f M e a s u r e _ L b l > + 
+             < U n i t P r i c e > U n i t P r i c e < / U n i t P r i c e > + 
+             < U n i t P r i c e _ L b l > U n i t P r i c e _ L b l < / U n i t P r i c e _ L b l > + 
+             < V A T I d e n t i f i e r _ L i n e > V A T I d e n t i f i e r _ L i n e < / V A T I d e n t i f i e r _ L i n e > + 
+             < V A T I d e n t i f i e r _ L i n e _ L b l > V A T I d e n t i f i e r _ L i n e _ L b l < / V A T I d e n t i f i e r _ L i n e _ L b l > + 
+             < V A T P c t _ L i n e > V A T P c t _ L i n e < / V A T P c t _ L i n e > + 
+             < V A T P c t _ L i n e _ L b l > V A T P c t _ L i n e _ L b l < / V A T P c t _ L i n e _ L b l >   
          < / L i n e >   
-         < W o r k D e s c r i p t i o n L i n e s   E l e m e n t T y p e = " D a t a I t e m "   E l e m e n t I d = " 2 7 6 8 1 9 4 4 7 " > - 
-             < W o r k D e s c r i p t i o n L i n e   E l e m e n t T y p e = " C o l u m n "   E l e m e n t I d = " 1 9 4 7 6 2 1 6 7 6 "   D a t a T y p e = " T e x t " > W o r k D e s c r i p t i o n L i n e < / W o r k D e s c r i p t i o n L i n e > - 
-             < W o r k D e s c r i p t i o n L i n e N u m b e r   E l e m e n t T y p e = " C o l u m n "   E l e m e n t I d = " 7 9 7 3 0 7 2 2 3 "   D a t a T y p e = " I n t e g e r " > W o r k D e s c r i p t i o n L i n e N u m b e r < / W o r k D e s c r i p t i o n L i n e N u m b e r > +         < W o r k D e s c r i p t i o n L i n e s > + 
+             < W o r k D e s c r i p t i o n L i n e > W o r k D e s c r i p t i o n L i n e < / W o r k D e s c r i p t i o n L i n e > + 
+             < W o r k D e s c r i p t i o n L i n e N u m b e r > W o r k D e s c r i p t i o n L i n e N u m b e r < / W o r k D e s c r i p t i o n L i n e N u m b e r >   
          < / W o r k D e s c r i p t i o n L i n e s >   
-         < V A T A m o u n t L i n e   E l e m e n t T y p e = " D a t a I t e m "   E l e m e n t I d = " 8 2 7 5 3 4 3 4 8 " > - 
-             < I n v o i c e D i s c o u n t A m o u n t _ V A T A m o u n t L i n e   E l e m e n t T y p e = " C o l u m n "   E l e m e n t I d = " 8 2 4 7 3 0 1 4 1 "   D a t a T y p e = " D e c i m a l " > I n v o i c e D i s c o u n t A m o u n t _ V A T A m o u n t L i n e < / I n v o i c e D i s c o u n t A m o u n t _ V A T A m o u n t L i n e > - 
-             < I n v o i c e D i s c o u n t A m o u n t _ V A T A m o u n t L i n e _ L b l   E l e m e n t T y p e = " C o l u m n "   E l e m e n t I d = " 1 5 6 2 2 0 0 0 3 4 "   D a t a T y p e = " S t r i n g " > I n v o i c e D i s c o u n t A m o u n t _ V A T A m o u n t L i n e _ L b l < / I n v o i c e D i s c o u n t A m o u n t _ V A T A m o u n t L i n e _ L b l > - 
-             < I n v o i c e D i s c o u n t B a s e A m o u n t _ V A T A m o u n t L i n e   E l e m e n t T y p e = " C o l u m n "   E l e m e n t I d = " 2 0 4 0 3 3 2 2 6 6 "   D a t a T y p e = " D e c i m a l " > I n v o i c e D i s c o u n t B a s e A m o u n t _ V A T A m o u n t L i n e < / I n v o i c e D i s c o u n t B a s e A m o u n t _ V A T A m o u n t L i n e > - 
-             < I n v o i c e D i s c o u n t B a s e A m o u n t _ V A T A m o u n t L i n e _ L b l   E l e m e n t T y p e = " C o l u m n "   E l e m e n t I d = " 4 0 5 9 6 0 3 3 1 "   D a t a T y p e = " S t r i n g " > I n v o i c e D i s c o u n t B a s e A m o u n t _ V A T A m o u n t L i n e _ L b l < / I n v o i c e D i s c o u n t B a s e A m o u n t _ V A T A m o u n t L i n e _ L b l > - 
-             < L i n e A m o u n t _ V a t A m o u n t L i n e   E l e m e n t T y p e = " C o l u m n "   E l e m e n t I d = " 2 1 4 6 5 4 0 1 "   D a t a T y p e = " D e c i m a l " > L i n e A m o u n t _ V a t A m o u n t L i n e < / L i n e A m o u n t _ V a t A m o u n t L i n e > - 
-             < L i n e A m o u n t _ V a t A m o u n t L i n e _ L b l   E l e m e n t T y p e = " C o l u m n "   E l e m e n t I d = " 1 1 1 0 9 1 2 1 2 4 "   D a t a T y p e = " S t r i n g " > L i n e A m o u n t _ V a t A m o u n t L i n e _ L b l < / L i n e A m o u n t _ V a t A m o u n t L i n e _ L b l > - 
-             < N o O f V A T I d e n t i f i e r s   E l e m e n t T y p e = " C o l u m n "   E l e m e n t I d = " 1 1 5 3 2 6 3 0 2 6 "   D a t a T y p e = " I n t e g e r " > N o O f V A T I d e n t i f i e r s < / N o O f V A T I d e n t i f i e r s > - 
-             < V A T A m o u n t _ V a t A m o u n t L i n e   E l e m e n t T y p e = " C o l u m n "   E l e m e n t I d = " 1 8 9 1 8 2 0 6 2 0 "   D a t a T y p e = " D e c i m a l " > V A T A m o u n t _ V a t A m o u n t L i n e < / V A T A m o u n t _ V a t A m o u n t L i n e > - 
-             < V A T A m o u n t _ V a t A m o u n t L i n e _ L b l   E l e m e n t T y p e = " C o l u m n "   E l e m e n t I d = " 1 5 1 3 5 5 5 4 7 3 "   D a t a T y p e = " S t r i n g " > V A T A m o u n t _ V a t A m o u n t L i n e _ L b l < / V A T A m o u n t _ V a t A m o u n t L i n e _ L b l > - 
-             < V A T A m o u n t L C Y _ V A T A m o u n t L i n e   E l e m e n t T y p e = " C o l u m n "   E l e m e n t I d = " 1 5 8 1 9 9 4 3 5 0 "   D a t a T y p e = " D e c i m a l " > V A T A m o u n t L C Y _ V A T A m o u n t L i n e < / V A T A m o u n t L C Y _ V A T A m o u n t L i n e > - 
-             < V A T A m o u n t L C Y _ V A T A m o u n t L i n e _ L b l   E l e m e n t T y p e = " C o l u m n "   E l e m e n t I d = " 9 2 3 0 0 3 3 7 "   D a t a T y p e = " T e x t C o n s t " > V A T A m o u n t L C Y _ V A T A m o u n t L i n e _ L b l < / V A T A m o u n t L C Y _ V A T A m o u n t L i n e _ L b l > - 
-             < V A T B a s e _ V a t A m o u n t L i n e   E l e m e n t T y p e = " C o l u m n "   E l e m e n t I d = " 1 4 5 8 9 3 7 8 1 9 "   D a t a T y p e = " D e c i m a l " > V A T B a s e _ V a t A m o u n t L i n e < / V A T B a s e _ V a t A m o u n t L i n e > - 
-             < V A T B a s e _ V a t A m o u n t L i n e _ L b l   E l e m e n t T y p e = " C o l u m n "   E l e m e n t I d = " 1 6 9 1 3 0 2 4 8 8 "   D a t a T y p e = " S t r i n g " > V A T B a s e _ V a t A m o u n t L i n e _ L b l < / V A T B a s e _ V a t A m o u n t L i n e _ L b l > - 
-             < V A T B a s e L C Y _ V A T A m o u n t L i n e   E l e m e n t T y p e = " C o l u m n "   E l e m e n t I d = " 1 8 6 0 9 4 5 6 3 5 "   D a t a T y p e = " D e c i m a l " > V A T B a s e L C Y _ V A T A m o u n t L i n e < / V A T B a s e L C Y _ V A T A m o u n t L i n e > - 
-             < V A T B a s e L C Y _ V A T A m o u n t L i n e _ L b l   E l e m e n t T y p e = " C o l u m n "   E l e m e n t I d = " 1 2 3 6 4 6 7 9 9 8 "   D a t a T y p e = " T e x t C o n s t " > V A T B a s e L C Y _ V A T A m o u n t L i n e _ L b l < / V A T B a s e L C Y _ V A T A m o u n t L i n e _ L b l > - 
-             < V A T I d e n t i f i e r _ V a t A m o u n t L i n e   E l e m e n t T y p e = " C o l u m n "   E l e m e n t I d = " 1 1 4 2 0 7 0 0 3 5 "   D a t a T y p e = " C o d e " > V A T I d e n t i f i e r _ V a t A m o u n t L i n e < / V A T I d e n t i f i e r _ V a t A m o u n t L i n e > - 
-             < V A T I d e n t i f i e r _ V a t A m o u n t L i n e _ L b l   E l e m e n t T y p e = " C o l u m n "   E l e m e n t I d = " 8 6 4 5 0 4 5 0 "   D a t a T y p e = " S t r i n g " > V A T I d e n t i f i e r _ V a t A m o u n t L i n e _ L b l < / V A T I d e n t i f i e r _ V a t A m o u n t L i n e _ L b l > - 
-             < V A T P c t _ V a t A m o u n t L i n e   E l e m e n t T y p e = " C o l u m n "   E l e m e n t I d = " 1 4 5 3 5 4 2 7 7 7 "   D a t a T y p e = " D e c i m a l " > V A T P c t _ V a t A m o u n t L i n e < / V A T P c t _ V a t A m o u n t L i n e > - 
-             < V A T P c t _ V a t A m o u n t L i n e _ L b l   E l e m e n t T y p e = " C o l u m n "   E l e m e n t I d = " 6 7 6 3 2 3 7 8 "   D a t a T y p e = " S t r i n g " > V A T P c t _ V a t A m o u n t L i n e _ L b l < / V A T P c t _ V a t A m o u n t L i n e _ L b l > +         < V A T A m o u n t L i n e > + 
+             < I n v o i c e D i s c o u n t A m o u n t _ V A T A m o u n t L i n e > I n v o i c e D i s c o u n t A m o u n t _ V A T A m o u n t L i n e < / I n v o i c e D i s c o u n t A m o u n t _ V A T A m o u n t L i n e > + 
+             < I n v o i c e D i s c o u n t A m o u n t _ V A T A m o u n t L i n e _ L b l > I n v o i c e D i s c o u n t A m o u n t _ V A T A m o u n t L i n e _ L b l < / I n v o i c e D i s c o u n t A m o u n t _ V A T A m o u n t L i n e _ L b l > + 
+             < I n v o i c e D i s c o u n t B a s e A m o u n t _ V A T A m o u n t L i n e > I n v o i c e D i s c o u n t B a s e A m o u n t _ V A T A m o u n t L i n e < / I n v o i c e D i s c o u n t B a s e A m o u n t _ V A T A m o u n t L i n e > + 
+             < I n v o i c e D i s c o u n t B a s e A m o u n t _ V A T A m o u n t L i n e _ L b l > I n v o i c e D i s c o u n t B a s e A m o u n t _ V A T A m o u n t L i n e _ L b l < / I n v o i c e D i s c o u n t B a s e A m o u n t _ V A T A m o u n t L i n e _ L b l > + 
+             < L i n e A m o u n t _ V a t A m o u n t L i n e > L i n e A m o u n t _ V a t A m o u n t L i n e < / L i n e A m o u n t _ V a t A m o u n t L i n e > + 
+             < L i n e A m o u n t _ V a t A m o u n t L i n e _ L b l > L i n e A m o u n t _ V a t A m o u n t L i n e _ L b l < / L i n e A m o u n t _ V a t A m o u n t L i n e _ L b l > + 
+             < N o O f V A T I d e n t i f i e r s > N o O f V A T I d e n t i f i e r s < / N o O f V A T I d e n t i f i e r s > + 
+             < V A T A m o u n t _ V a t A m o u n t L i n e > V A T A m o u n t _ V a t A m o u n t L i n e < / V A T A m o u n t _ V a t A m o u n t L i n e > + 
+             < V A T A m o u n t _ V a t A m o u n t L i n e _ L b l > V A T A m o u n t _ V a t A m o u n t L i n e _ L b l < / V A T A m o u n t _ V a t A m o u n t L i n e _ L b l > + 
+             < V A T A m o u n t L C Y _ V A T A m o u n t L i n e > V A T A m o u n t L C Y _ V A T A m o u n t L i n e < / V A T A m o u n t L C Y _ V A T A m o u n t L i n e > + 
+             < V A T A m o u n t L C Y _ V A T A m o u n t L i n e _ L b l > V A T A m o u n t L C Y _ V A T A m o u n t L i n e _ L b l < / V A T A m o u n t L C Y _ V A T A m o u n t L i n e _ L b l > + 
+             < V A T B a s e _ V a t A m o u n t L i n e > V A T B a s e _ V a t A m o u n t L i n e < / V A T B a s e _ V a t A m o u n t L i n e > + 
+             < V A T B a s e _ V a t A m o u n t L i n e _ L b l > V A T B a s e _ V a t A m o u n t L i n e _ L b l < / V A T B a s e _ V a t A m o u n t L i n e _ L b l > + 
+             < V A T B a s e L C Y _ V A T A m o u n t L i n e > V A T B a s e L C Y _ V A T A m o u n t L i n e < / V A T B a s e L C Y _ V A T A m o u n t L i n e > + 
+             < V A T B a s e L C Y _ V A T A m o u n t L i n e _ L b l > V A T B a s e L C Y _ V A T A m o u n t L i n e _ L b l < / V A T B a s e L C Y _ V A T A m o u n t L i n e _ L b l > + 
+             < V A T I d e n t i f i e r _ V a t A m o u n t L i n e > V A T I d e n t i f i e r _ V a t A m o u n t L i n e < / V A T I d e n t i f i e r _ V a t A m o u n t L i n e > + 
+             < V A T I d e n t i f i e r _ V a t A m o u n t L i n e _ L b l > V A T I d e n t i f i e r _ V a t A m o u n t L i n e _ L b l < / V A T I d e n t i f i e r _ V a t A m o u n t L i n e _ L b l > + 
+             < V A T P c t _ V a t A m o u n t L i n e > V A T P c t _ V a t A m o u n t L i n e < / V A T P c t _ V a t A m o u n t L i n e > + 
+             < V A T P c t _ V a t A m o u n t L i n e _ L b l > V A T P c t _ V a t A m o u n t L i n e _ L b l < / V A T P c t _ V a t A m o u n t L i n e _ L b l >   
          < / V A T A m o u n t L i n e >   
-         < V A T C l a u s e L i n e   E l e m e n t T y p e = " D a t a I t e m "   E l e m e n t I d = " 1 6 6 5 5 0 0 1 6 3 " > - 
-             < C o d e _ V A T C l a u s e L i n e   E l e m e n t T y p e = " C o l u m n "   E l e m e n t I d = " 1 8 2 4 5 8 9 8 4 7 "   D a t a T y p e = " C o d e " > C o d e _ V A T C l a u s e L i n e < / C o d e _ V A T C l a u s e L i n e > - 
-             < C o d e _ V A T C l a u s e L i n e _ L b l   E l e m e n t T y p e = " C o l u m n "   E l e m e n t I d = " 4 6 1 5 3 3 0 2 "   D a t a T y p e = " S t r i n g " > C o d e _ V A T C l a u s e L i n e _ L b l < / C o d e _ V A T C l a u s e L i n e _ L b l > - 
-             < D e s c r i p t i o n _ V A T C l a u s e L i n e   E l e m e n t T y p e = " C o l u m n "   E l e m e n t I d = " 1 3 0 5 5 4 5 9 2 4 "   D a t a T y p e = " T e x t " > D e s c r i p t i o n _ V A T C l a u s e L i n e < / D e s c r i p t i o n _ V A T C l a u s e L i n e > - 
-             < D e s c r i p t i o n 2 _ V A T C l a u s e L i n e   E l e m e n t T y p e = " C o l u m n "   E l e m e n t I d = " 1 3 7 9 6 6 7 4 7 0 "   D a t a T y p e = " T e x t " > D e s c r i p t i o n 2 _ V A T C l a u s e L i n e < / D e s c r i p t i o n 2 _ V A T C l a u s e L i n e > - 
-             < N o O f V A T C l a u s e s   E l e m e n t T y p e = " C o l u m n "   E l e m e n t I d = " 7 5 6 4 1 7 3 9 2 "   D a t a T y p e = " I n t e g e r " > N o O f V A T C l a u s e s < / N o O f V A T C l a u s e s > - 
-             < V A T A m o u n t _ V A T C l a u s e L i n e   E l e m e n t T y p e = " C o l u m n "   E l e m e n t I d = " 2 2 2 4 6 9 0 5 9 "   D a t a T y p e = " D e c i m a l " > V A T A m o u n t _ V A T C l a u s e L i n e < / V A T A m o u n t _ V A T C l a u s e L i n e > - 
-             < V A T C l a u s e s H e a d e r   E l e m e n t T y p e = " C o l u m n "   E l e m e n t I d = " 1 9 7 2 4 0 9 9 2 9 "   D a t a T y p e = " T e x t " > V A T C l a u s e s H e a d e r < / V A T C l a u s e s H e a d e r > - 
-             < V A T I d e n t i f i e r _ V A T C l a u s e L i n e   E l e m e n t T y p e = " C o l u m n "   E l e m e n t I d = " 1 4 6 4 4 7 2 4 7 8 "   D a t a T y p e = " C o d e " > V A T I d e n t i f i e r _ V A T C l a u s e L i n e < / V A T I d e n t i f i e r _ V A T C l a u s e L i n e > +         < V A T C l a u s e L i n e > + 
+             < C o d e _ V A T C l a u s e L i n e > C o d e _ V A T C l a u s e L i n e < / C o d e _ V A T C l a u s e L i n e > + 
+             < C o d e _ V A T C l a u s e L i n e _ L b l > C o d e _ V A T C l a u s e L i n e _ L b l < / C o d e _ V A T C l a u s e L i n e _ L b l > + 
+             < D e s c r i p t i o n _ V A T C l a u s e L i n e > D e s c r i p t i o n _ V A T C l a u s e L i n e < / D e s c r i p t i o n _ V A T C l a u s e L i n e > + 
+             < D e s c r i p t i o n 2 _ V A T C l a u s e L i n e > D e s c r i p t i o n 2 _ V A T C l a u s e L i n e < / D e s c r i p t i o n 2 _ V A T C l a u s e L i n e > + 
+             < N o O f V A T C l a u s e s > N o O f V A T C l a u s e s < / N o O f V A T C l a u s e s > + 
+             < V A T A m o u n t _ V A T C l a u s e L i n e > V A T A m o u n t _ V A T C l a u s e L i n e < / V A T A m o u n t _ V A T C l a u s e L i n e > + 
+             < V A T C l a u s e s H e a d e r > V A T C l a u s e s H e a d e r < / V A T C l a u s e s H e a d e r > + 
+             < V A T I d e n t i f i e r _ V A T C l a u s e L i n e > V A T I d e n t i f i e r _ V A T C l a u s e L i n e < / V A T I d e n t i f i e r _ V A T C l a u s e L i n e >   
          < / V A T C l a u s e L i n e >   
-         < R e p o r t T o t a l s L i n e   E l e m e n t T y p e = " D a t a I t e m "   E l e m e n t I d = " 2 1 2 2 5 4 9 8 3 6 " > - 
-             < A m o u n t _ R e p o r t T o t a l s L i n e   E l e m e n t T y p e = " C o l u m n "   E l e m e n t I d = " 4 1 9 9 1 8 3 6 9 "   D a t a T y p e = " D e c i m a l " > A m o u n t _ R e p o r t T o t a l s L i n e < / A m o u n t _ R e p o r t T o t a l s L i n e > - 
-             < A m o u n t F o r m a t t e d _ R e p o r t T o t a l s L i n e   E l e m e n t T y p e = " C o l u m n "   E l e m e n t I d = " 1 5 0 6 1 3 6 8 2 5 "   D a t a T y p e = " T e x t " > A m o u n t F o r m a t t e d _ R e p o r t T o t a l s L i n e < / A m o u n t F o r m a t t e d _ R e p o r t T o t a l s L i n e > - 
-             < D e s c r i p t i o n _ R e p o r t T o t a l s L i n e   E l e m e n t T y p e = " C o l u m n "   E l e m e n t I d = " 5 8 1 9 9 6 0 6 7 "   D a t a T y p e = " T e x t " > D e s c r i p t i o n _ R e p o r t T o t a l s L i n e < / D e s c r i p t i o n _ R e p o r t T o t a l s L i n e > - 
-             < F o n t B o l d _ R e p o r t T o t a l s L i n e   E l e m e n t T y p e = " C o l u m n "   E l e m e n t I d = " 9 4 6 5 4 0 5 4 9 "   D a t a T y p e = " B o o l e a n " > F o n t B o l d _ R e p o r t T o t a l s L i n e < / F o n t B o l d _ R e p o r t T o t a l s L i n e > - 
-             < F o n t U n d e r l i n e _ R e p o r t T o t a l s L i n e   E l e m e n t T y p e = " C o l u m n "   E l e m e n t I d = " 2 0 2 1 5 3 3 6 9 4 "   D a t a T y p e = " B o o l e a n " > F o n t U n d e r l i n e _ R e p o r t T o t a l s L i n e < / F o n t U n d e r l i n e _ R e p o r t T o t a l s L i n e > +         < R e p o r t T o t a l s L i n e > + 
+             < A m o u n t _ R e p o r t T o t a l s L i n e > A m o u n t _ R e p o r t T o t a l s L i n e < / A m o u n t _ R e p o r t T o t a l s L i n e > + 
+             < A m o u n t F o r m a t t e d _ R e p o r t T o t a l s L i n e > A m o u n t F o r m a t t e d _ R e p o r t T o t a l s L i n e < / A m o u n t F o r m a t t e d _ R e p o r t T o t a l s L i n e > + 
+             < D e s c r i p t i o n _ R e p o r t T o t a l s L i n e > D e s c r i p t i o n _ R e p o r t T o t a l s L i n e < / D e s c r i p t i o n _ R e p o r t T o t a l s L i n e > + 
+             < F o n t B o l d _ R e p o r t T o t a l s L i n e > F o n t B o l d _ R e p o r t T o t a l s L i n e < / F o n t B o l d _ R e p o r t T o t a l s L i n e > + 
+             < F o n t U n d e r l i n e _ R e p o r t T o t a l s L i n e > F o n t U n d e r l i n e _ R e p o r t T o t a l s L i n e < / F o n t U n d e r l i n e _ R e p o r t T o t a l s L i n e >   
          < / R e p o r t T o t a l s L i n e >   
-         < P a y m e n t R e p o r t i n g A r g u m e n t   E l e m e n t T y p e = " D a t a I t e m "   E l e m e n t I d = " 3 1 3 7 4 4 1 9 4 " > - 
-             < P a y m e n t S e r v i c e L o g o   E l e m e n t T y p e = " C o l u m n "   E l e m e n t I d = " 4 1 6 7 9 0 7 6 7 "   D a t a T y p e = " B L O B " / > - 
-             < P a y m e n t S e r v i c e L o g o _ U r l   E l e m e n t T y p e = " C o l u m n "   E l e m e n t I d = " 6 4 4 9 7 5 1 3 9 "   D a t a T y p e = " T e x t " > P a y m e n t S e r v i c e L o g o _ U r l < / P a y m e n t S e r v i c e L o g o _ U r l > - 
-             < P a y m e n t S e r v i c e L o g o _ U r l T e x t   E l e m e n t T y p e = " C o l u m n "   E l e m e n t I d = " 1 4 1 1 7 0 3 9 7 6 "   D a t a T y p e = " T e x t " > P a y m e n t S e r v i c e L o g o _ U r l T e x t < / P a y m e n t S e r v i c e L o g o _ U r l T e x t > - 
-             < P a y m e n t S e r v i c e T e x t _ U r l   E l e m e n t T y p e = " C o l u m n "   E l e m e n t I d = " 1 7 4 2 3 3 4 7 "   D a t a T y p e = " T e x t " > P a y m e n t S e r v i c e T e x t _ U r l < / P a y m e n t S e r v i c e T e x t _ U r l > - 
-             < P a y m e n t S e r v i c e T e x t _ U r l T e x t   E l e m e n t T y p e = " C o l u m n "   E l e m e n t I d = " 1 6 3 6 7 7 2 9 3 4 "   D a t a T y p e = " T e x t " > P a y m e n t S e r v i c e T e x t _ U r l T e x t < / P a y m e n t S e r v i c e T e x t _ U r l T e x t > +         < P a y m e n t R e p o r t i n g A r g u m e n t > + 
+             < P a y m e n t S e r v i c e L o g o / > + 
+             < P a y m e n t S e r v i c e L o g o _ U r l > P a y m e n t S e r v i c e L o g o _ U r l < / P a y m e n t S e r v i c e L o g o _ U r l > + 
+             < P a y m e n t S e r v i c e L o g o _ U r l T e x t > P a y m e n t S e r v i c e L o g o _ U r l T e x t < / P a y m e n t S e r v i c e L o g o _ U r l T e x t > + 
+             < P a y m e n t S e r v i c e T e x t _ U r l > P a y m e n t S e r v i c e T e x t _ U r l < / P a y m e n t S e r v i c e T e x t _ U r l > + 
+             < P a y m e n t S e r v i c e T e x t _ U r l T e x t > P a y m e n t S e r v i c e T e x t _ U r l T e x t < / P a y m e n t S e r v i c e T e x t _ U r l T e x t >   
          < / P a y m e n t R e p o r t i n g A r g u m e n t >   
-         < L e t t e r T e x t   E l e m e n t T y p e = " D a t a I t e m "   E l e m e n t I d = " 1 5 1 0 3 5 3 8 3 4 " > - 
-             < B o d y T e x t   E l e m e n t T y p e = " C o l u m n "   E l e m e n t I d = " 1 4 9 7 5 9 8 0 8 "   D a t a T y p e = " T e x t " > B o d y T e x t < / B o d y T e x t > - 
-             < C l o s i n g T e x t   E l e m e n t T y p e = " C o l u m n "   E l e m e n t I d = " 5 1 2 1 3 5 9 0 9 "   D a t a T y p e = " T e x t C o n s t " > C l o s i n g T e x t < / C l o s i n g T e x t > - 
-             < G r e e t i n g T e x t   E l e m e n t T y p e = " C o l u m n "   E l e m e n t I d = " 1 1 7 5 2 7 9 2 8 9 "   D a t a T y p e = " T e x t C o n s t " > G r e e t i n g T e x t < / G r e e t i n g T e x t > - 
-             < P m t D i s c T e x t   E l e m e n t T y p e = " C o l u m n "   E l e m e n t I d = " 2 0 1 3 8 4 9 9 4 8 "   D a t a T y p e = " T e x t " > P m t D i s c T e x t < / P m t D i s c T e x t > +         < L e t t e r T e x t > + 
+             < B o d y T e x t > B o d y T e x t < / B o d y T e x t > + 
+             < C l o s i n g T e x t > C l o s i n g T e x t < / C l o s i n g T e x t > + 
+             < G r e e t i n g T e x t > G r e e t i n g T e x t < / G r e e t i n g T e x t > + 
+             < P m t D i s c T e x t > P m t D i s c T e x t < / P m t D i s c T e x t >   
          < / L e t t e r T e x t >   
-         < T o t a l s   E l e m e n t T y p e = " D a t a I t e m "   E l e m e n t I d = " 1 8 2 3 9 5 0 0 4 4 " > - 
-             < T o t a l A m o u n t I n c l u d i n g V A T   E l e m e n t T y p e = " C o l u m n "   E l e m e n t I d = " 9 1 0 5 1 1 5 7 5 "   D a t a T y p e = " D e c i m a l " > T o t a l A m o u n t I n c l u d i n g V A T < / T o t a l A m o u n t I n c l u d i n g V A T > - 
-             < T o t a l E x c l u d i n g V A T T e x t   E l e m e n t T y p e = " C o l u m n "   E l e m e n t I d = " 1 9 2 2 9 4 6 3 1 0 "   D a t a T y p e = " T e x t " > T o t a l E x c l u d i n g V A T T e x t < / T o t a l E x c l u d i n g V A T T e x t > - 
-             < T o t a l I n c l u d i n g V A T T e x t   E l e m e n t T y p e = " C o l u m n "   E l e m e n t I d = " 1 2 0 4 0 1 6 3 5 2 "   D a t a T y p e = " T e x t " > T o t a l I n c l u d i n g V A T T e x t < / T o t a l I n c l u d i n g V A T T e x t > - 
-             < T o t a l I n v o i c e D i s c o u n t A m o u n t   E l e m e n t T y p e = " C o l u m n "   E l e m e n t I d = " 4 0 2 1 7 7 5 1 "   D a t a T y p e = " D e c i m a l " > T o t a l I n v o i c e D i s c o u n t A m o u n t < / T o t a l I n v o i c e D i s c o u n t A m o u n t > - 
-             < T o t a l N e t A m o u n t   E l e m e n t T y p e = " C o l u m n "   E l e m e n t I d = " 4 8 3 1 9 3 3 7 2 "   D a t a T y p e = " D e c i m a l " > T o t a l N e t A m o u n t < / T o t a l N e t A m o u n t > - 
-             < T o t a l P a y m e n t D i s c o u n t O n V A T   E l e m e n t T y p e = " C o l u m n "   E l e m e n t I d = " 7 3 6 0 4 1 8 8 6 "   D a t a T y p e = " D e c i m a l " > T o t a l P a y m e n t D i s c o u n t O n V A T < / T o t a l P a y m e n t D i s c o u n t O n V A T > - 
-             < T o t a l S u b T o t a l   E l e m e n t T y p e = " C o l u m n "   E l e m e n t I d = " 2 0 9 7 8 7 6 8 0 1 "   D a t a T y p e = " D e c i m a l " > T o t a l S u b T o t a l < / T o t a l S u b T o t a l > - 
-             < T o t a l S u b T o t a l M i n u s I n v o i c e D i s c o u n t   E l e m e n t T y p e = " C o l u m n "   E l e m e n t I d = " 7 6 9 4 3 1 8 8 7 "   D a t a T y p e = " D e c i m a l " > T o t a l S u b T o t a l M i n u s I n v o i c e D i s c o u n t < / T o t a l S u b T o t a l M i n u s I n v o i c e D i s c o u n t > - 
-             < T o t a l T e x t   E l e m e n t T y p e = " C o l u m n "   E l e m e n t I d = " 2 3 1 9 1 0 5 1 8 "   D a t a T y p e = " T e x t " > T o t a l T e x t < / T o t a l T e x t > - 
-             < T o t a l V A T A m o u n t   E l e m e n t T y p e = " C o l u m n "   E l e m e n t I d = " 1 6 2 7 1 0 2 3 2 8 "   D a t a T y p e = " D e c i m a l " > T o t a l V A T A m o u n t < / T o t a l V A T A m o u n t > - 
-             < T o t a l V A T A m o u n t L C Y   E l e m e n t T y p e = " C o l u m n "   E l e m e n t I d = " 1 5 0 6 5 7 0 2 1 8 "   D a t a T y p e = " D e c i m a l " > T o t a l V A T A m o u n t L C Y < / T o t a l V A T A m o u n t L C Y > - 
-             < T o t a l V A T A m o u n t T e x t   E l e m e n t T y p e = " C o l u m n "   E l e m e n t I d = " 9 7 3 6 6 6 3 3 9 "   D a t a T y p e = " T e x t " > T o t a l V A T A m o u n t T e x t < / T o t a l V A T A m o u n t T e x t > - 
-             < T o t a l V A T B a s e L C Y   E l e m e n t T y p e = " C o l u m n "   E l e m e n t I d = " 8 3 4 4 5 0 5 2 1 "   D a t a T y p e = " D e c i m a l " > T o t a l V A T B a s e L C Y < / T o t a l V A T B a s e L C Y > +         < T o t a l s > + 
+             < T o t a l A m o u n t I n c l u d i n g V A T > T o t a l A m o u n t I n c l u d i n g V A T < / T o t a l A m o u n t I n c l u d i n g V A T > + 
+             < T o t a l E x c l u d i n g V A T T e x t > T o t a l E x c l u d i n g V A T T e x t < / T o t a l E x c l u d i n g V A T T e x t > + 
+             < T o t a l I n c l u d i n g V A T T e x t > T o t a l I n c l u d i n g V A T T e x t < / T o t a l I n c l u d i n g V A T T e x t > + 
+             < T o t a l I n v o i c e D i s c o u n t A m o u n t > T o t a l I n v o i c e D i s c o u n t A m o u n t < / T o t a l I n v o i c e D i s c o u n t A m o u n t > + 
+             < T o t a l N e t A m o u n t > T o t a l N e t A m o u n t < / T o t a l N e t A m o u n t > + 
+             < T o t a l P a y m e n t D i s c o u n t O n V A T > T o t a l P a y m e n t D i s c o u n t O n V A T < / T o t a l P a y m e n t D i s c o u n t O n V A T > + 
+             < T o t a l S u b T o t a l > T o t a l S u b T o t a l < / T o t a l S u b T o t a l > + 
+             < T o t a l S u b T o t a l M i n u s I n v o i c e D i s c o u n t > T o t a l S u b T o t a l M i n u s I n v o i c e D i s c o u n t < / T o t a l S u b T o t a l M i n u s I n v o i c e D i s c o u n t > + 
+             < T o t a l T e x t > T o t a l T e x t < / T o t a l T e x t > + 
+             < T o t a l V A T A m o u n t > T o t a l V A T A m o u n t < / T o t a l V A T A m o u n t > + 
+             < T o t a l V A T A m o u n t L C Y > T o t a l V A T A m o u n t L C Y < / T o t a l V A T A m o u n t L C Y > + 
+             < T o t a l V A T A m o u n t T e x t > T o t a l V A T A m o u n t T e x t < / T o t a l V A T A m o u n t T e x t > + 
+             < T o t a l V A T B a s e L C Y > T o t a l V A T B a s e L C Y < / T o t a l V A T B a s e L C Y >   
          < / T o t a l s >   
@@ -6994,6 +6703,14 @@
 </file>
 
 <file path=customXml/itemProps1.xml><?xml version="1.0" encoding="utf-8"?>
+<ds:datastoreItem xmlns:ds="http://schemas.openxmlformats.org/officeDocument/2006/customXml" ds:itemID="{30EEFAF4-37EA-4F9B-AF4E-00537C596448}">
+  <ds:schemaRefs>
+    <ds:schemaRef ds:uri="urn:microsoft-dynamics-businesscentral/internal/extended/reports/Standard_Sales_Draft_Invoice/1303/"/>
+  </ds:schemaRefs>
+</ds:datastoreItem>
+</file>
+
+<file path=customXml/itemProps2.xml><?xml version="1.0" encoding="utf-8"?>
 <ds:datastoreItem xmlns:ds="http://schemas.openxmlformats.org/officeDocument/2006/customXml" ds:itemID="{0FB04FAF-6501-4B85-AB97-353B5C6508E7}">
   <ds:schemaRefs>
     <ds:schemaRef ds:uri="urn:microsoft-dynamics-nav/reports/Standard_Sales_Draft_Invoice/1303/"/>
@@ -7001,10 +6718,8 @@
 </ds:datastoreItem>
 </file>
 
-<file path=customXml/itemProps2.xml><?xml version="1.0" encoding="utf-8"?>
-<ds:datastoreItem xmlns:ds="http://schemas.openxmlformats.org/officeDocument/2006/customXml" ds:itemID="{30EEFAF4-37EA-4F9B-AF4E-00537C596448}">
-  <ds:schemaRefs>
-    <ds:schemaRef ds:uri="urn:microsoft-dynamics-businesscentral/internal/extended/reports/Standard_Sales_Draft_Invoice/1303/"/>
-  </ds:schemaRefs>
-</ds:datastoreItem>
+<file path=docMetadata/LabelInfo.xml><?xml version="1.0" encoding="utf-8"?>
+<clbl:labelList xmlns:clbl="http://schemas.microsoft.com/office/2020/mipLabelMetadata">
+  <clbl:label id="{f42aa342-8706-4288-bd11-ebb85995028c}" enabled="1" method="Standard" siteId="{72f988bf-86f1-41af-91ab-2d7cd011db47}" contentBits="0" removed="0"/>
+</clbl:labelList>
 </file>
</xml_diff>